<commit_message>
Deploying to gh-pages from @ Morrison-Lab/wai@52660c592b4ecc0192013cf9739534c20b40234e 🚀
</commit_message>
<xml_diff>
--- a/chapters/coding-agents.docx
+++ b/chapters/coding-agents.docx
@@ -15,7 +15,7 @@
         <w:pStyle w:val="Date"/>
       </w:pPr>
       <w:r>
-        <w:t xml:space="preserve">Last modified: 2026-09-24 22:03:48 (PDT)</w:t>
+        <w:t xml:space="preserve">Last modified: 2026-09-26 19:26:49 (PDT)</w:t>
       </w:r>
     </w:p>
     <w:p>
@@ -1923,7 +1923,7 @@
           <w:rPr>
             <w:rStyle w:val="Hyperlink"/>
           </w:rPr>
-          <w:t xml:space="preserve">Section 17</w:t>
+          <w:t xml:space="preserve">Section 18</w:t>
         </w:r>
       </w:hyperlink>
       <w:r>
@@ -7799,19 +7799,292 @@
     </w:p>
     <w:bookmarkEnd w:id="124"/>
     <w:bookmarkEnd w:id="125"/>
-    <w:bookmarkStart w:id="129" w:name="sec-ai-when-to-use"/>
+    <w:bookmarkStart w:id="130" w:name="sec-ai-andrew-ng-learning-to-code"/>
     <w:p>
       <w:pPr>
         <w:pStyle w:val="Heading1"/>
       </w:pPr>
       <w:r>
-        <w:t xml:space="preserve">9. When to use a coding agent</w:t>
+        <w:t xml:space="preserve">9. Andrew Ng on Learning to Code in the Age of AI</w:t>
       </w:r>
     </w:p>
     <w:p>
       <w:pPr>
         <w:pStyle w:val="FirstParagraph"/>
       </w:pPr>
+      <w:hyperlink r:id="rId126">
+        <w:r>
+          <w:rPr>
+            <w:rStyle w:val="Hyperlink"/>
+          </w:rPr>
+          <w:t xml:space="preserve">Issue #244</w:t>
+        </w:r>
+      </w:hyperlink>
+      <w:r>
+        <w:t xml:space="preserve"> </w:t>
+      </w:r>
+      <w:r>
+        <w:t xml:space="preserve">asked for a summary of a YouTube video,</w:t>
+      </w:r>
+      <w:r>
+        <w:t xml:space="preserve"> </w:t>
+      </w:r>
+      <w:r>
+        <w:t xml:space="preserve">“Andrew Ng: One Skill to Stay Relevant in the Age of AI”</w:t>
+      </w:r>
+      <w:r>
+        <w:t xml:space="preserve">,</w:t>
+      </w:r>
+      <w:r>
+        <w:t xml:space="preserve"> </w:t>
+      </w:r>
+      <w:r>
+        <w:t xml:space="preserve">from the channel Stanford Online</w:t>
+      </w:r>
+      <w:r>
+        <w:t xml:space="preserve"> </w:t>
+      </w:r>
+      <w:r>
+        <w:t xml:space="preserve">(Stanford Online and Ng 2026)</w:t>
+      </w:r>
+      <w:r>
+        <w:t xml:space="preserve">.</w:t>
+      </w:r>
+      <w:r>
+        <w:t xml:space="preserve"> </w:t>
+      </w:r>
+      <w:r>
+        <w:t xml:space="preserve">The video is an eighty-nine-second interview published on 2026-09-22,</w:t>
+      </w:r>
+      <w:r>
+        <w:t xml:space="preserve"> </w:t>
+      </w:r>
+      <w:r>
+        <w:t xml:space="preserve">in which Andrew Ng (Adjunct Professor at Stanford University and founder of DeepLearning.AI)</w:t>
+      </w:r>
+      <w:r>
+        <w:t xml:space="preserve"> </w:t>
+      </w:r>
+      <w:r>
+        <w:t xml:space="preserve">responds to the question:</w:t>
+      </w:r>
+      <w:r>
+        <w:t xml:space="preserve"> </w:t>
+      </w:r>
+      <w:r>
+        <w:t xml:space="preserve">“What’s one skill professionals should start learning now if they want to stay relevant in the age of AI?”</w:t>
+      </w:r>
+    </w:p>
+    <w:bookmarkStart w:id="127" w:name="X2585d35de08cc404764c5b3e676c5fcc497846e"/>
+    <w:p>
+      <w:pPr>
+        <w:pStyle w:val="Heading4"/>
+      </w:pPr>
+      <w:r>
+        <w:t xml:space="preserve">The core argument: everyone should learn to code</w:t>
+      </w:r>
+    </w:p>
+    <w:p>
+      <w:pPr>
+        <w:pStyle w:val="FirstParagraph"/>
+      </w:pPr>
+      <w:r>
+        <w:t xml:space="preserve">Ng opens with what he acknowledges is a controversial stance:</w:t>
+      </w:r>
+      <w:r>
+        <w:t xml:space="preserve"> </w:t>
+      </w:r>
+      <w:r>
+        <w:t xml:space="preserve">everyone should learn to code.</w:t>
+      </w:r>
+      <w:r>
+        <w:t xml:space="preserve"> </w:t>
+      </w:r>
+      <w:r>
+        <w:t xml:space="preserve">His thesis is that a noticeable productivity gap is already widening</w:t>
+      </w:r>
+      <w:r>
+        <w:t xml:space="preserve"> </w:t>
+      </w:r>
+      <w:r>
+        <w:t xml:space="preserve">between professionals who can build custom software and those who cannot,</w:t>
+      </w:r>
+      <w:r>
+        <w:t xml:space="preserve"> </w:t>
+      </w:r>
+      <w:r>
+        <w:t xml:space="preserve">across all organizational roles rather than only within software engineering.</w:t>
+      </w:r>
+    </w:p>
+    <w:bookmarkEnd w:id="127"/>
+    <w:bookmarkStart w:id="128" w:name="X9429e6d799a3fcf433b7cb54e1628b26ec04661"/>
+    <w:p>
+      <w:pPr>
+        <w:pStyle w:val="Heading4"/>
+      </w:pPr>
+      <w:r>
+        <w:t xml:space="preserve">Directing computers vs. writing syntax by hand</w:t>
+      </w:r>
+    </w:p>
+    <w:p>
+      <w:pPr>
+        <w:pStyle w:val="FirstParagraph"/>
+      </w:pPr>
+      <w:r>
+        <w:t xml:space="preserve">Crucially, Ng clarifies that learning to code does not mean typing out every line of syntax manually.</w:t>
+      </w:r>
+      <w:r>
+        <w:t xml:space="preserve"> </w:t>
+      </w:r>
+      <w:r>
+        <w:t xml:space="preserve">He notes that he rarely writes code entirely by hand himself anymore.</w:t>
+      </w:r>
+      <w:r>
+        <w:t xml:space="preserve"> </w:t>
+      </w:r>
+      <w:r>
+        <w:t xml:space="preserve">Instead, the enduring core skill is knowing how to instruct a computer with precision,</w:t>
+      </w:r>
+      <w:r>
+        <w:t xml:space="preserve"> </w:t>
+      </w:r>
+      <w:r>
+        <w:t xml:space="preserve">and code remains the native language through which computers are directed.</w:t>
+      </w:r>
+    </w:p>
+    <w:p>
+      <w:pPr>
+        <w:pStyle w:val="BodyText"/>
+      </w:pPr>
+      <w:r>
+        <w:t xml:space="preserve">In Ng’s view, AI-assisted coding transforms programming into a universal capability:</w:t>
+      </w:r>
+    </w:p>
+    <w:p>
+      <w:pPr>
+        <w:pStyle w:val="Compact"/>
+        <w:numPr>
+          <w:ilvl w:val="0"/>
+          <w:numId w:val="1016"/>
+        </w:numPr>
+      </w:pPr>
+      <w:r>
+        <w:rPr>
+          <w:b/>
+          <w:bCs/>
+        </w:rPr>
+        <w:t xml:space="preserve">Marketing without engineering bottlenecks:</w:t>
+      </w:r>
+      <w:r>
+        <w:t xml:space="preserve"> </w:t>
+      </w:r>
+      <w:r>
+        <w:t xml:space="preserve">Top marketers no longer wait in an engineering backlog for a dedicated developer to build or update a website;</w:t>
+      </w:r>
+      <w:r>
+        <w:t xml:space="preserve"> </w:t>
+      </w:r>
+      <w:r>
+        <w:t xml:space="preserve">they build and deploy what they need directly using AI assistance.</w:t>
+      </w:r>
+    </w:p>
+    <w:p>
+      <w:pPr>
+        <w:pStyle w:val="Compact"/>
+        <w:numPr>
+          <w:ilvl w:val="0"/>
+          <w:numId w:val="1016"/>
+        </w:numPr>
+      </w:pPr>
+      <w:r>
+        <w:rPr>
+          <w:b/>
+          <w:bCs/>
+        </w:rPr>
+        <w:t xml:space="preserve">Recruiting with custom automation:</w:t>
+      </w:r>
+      <w:r>
+        <w:t xml:space="preserve"> </w:t>
+      </w:r>
+      <w:r>
+        <w:t xml:space="preserve">Top recruiters write automated scripts to screen and parse resumes against specific role requirements</w:t>
+      </w:r>
+      <w:r>
+        <w:t xml:space="preserve"> </w:t>
+      </w:r>
+      <w:r>
+        <w:t xml:space="preserve">instead of manually reviewing hundreds of candidates by hand.</w:t>
+      </w:r>
+    </w:p>
+    <w:bookmarkEnd w:id="128"/>
+    <w:bookmarkStart w:id="129" w:name="countering-the-advice-to-abandon-coding"/>
+    <w:p>
+      <w:pPr>
+        <w:pStyle w:val="Heading4"/>
+      </w:pPr>
+      <w:r>
+        <w:t xml:space="preserve">Countering the advice to abandon coding</w:t>
+      </w:r>
+    </w:p>
+    <w:p>
+      <w:pPr>
+        <w:pStyle w:val="FirstParagraph"/>
+      </w:pPr>
+      <w:r>
+        <w:t xml:space="preserve">A prevalent piece of executive and business advice suggests that learning to code is a waste of time</w:t>
+      </w:r>
+      <w:r>
+        <w:t xml:space="preserve"> </w:t>
+      </w:r>
+      <w:r>
+        <w:t xml:space="preserve">because AI will automate software development away.</w:t>
+      </w:r>
+      <w:r>
+        <w:t xml:space="preserve"> </w:t>
+      </w:r>
+      <w:r>
+        <w:t xml:space="preserve">Ng argues that this perspective has the causality backwards.</w:t>
+      </w:r>
+      <w:r>
+        <w:t xml:space="preserve"> </w:t>
+      </w:r>
+      <w:r>
+        <w:t xml:space="preserve">Rather than making programming obsolete,</w:t>
+      </w:r>
+      <w:r>
+        <w:t xml:space="preserve"> </w:t>
+      </w:r>
+      <w:r>
+        <w:t xml:space="preserve">AI assistance has lowered the barrier to entry enough that coding is now practical for everyone to learn.</w:t>
+      </w:r>
+      <w:r>
+        <w:t xml:space="preserve"> </w:t>
+      </w:r>
+      <w:r>
+        <w:t xml:space="preserve">The ability to specify logic, structure data, and guide an AI coding agent to produce tailored tools</w:t>
+      </w:r>
+      <w:r>
+        <w:t xml:space="preserve"> </w:t>
+      </w:r>
+      <w:r>
+        <w:t xml:space="preserve">amplifies individual effectiveness in every profession.</w:t>
+      </w:r>
+    </w:p>
+    <w:bookmarkEnd w:id="129"/>
+    <w:bookmarkEnd w:id="130"/>
+    <w:bookmarkStart w:id="134" w:name="sec-ai-when-to-use"/>
+    <w:p>
+      <w:pPr>
+        <w:pStyle w:val="Heading1"/>
+      </w:pPr>
+      <w:r>
+        <w:t xml:space="preserve">10. When to use a coding agent</w:t>
+      </w:r>
+    </w:p>
+    <w:p>
+      <w:pPr>
+        <w:pStyle w:val="FirstParagraph"/>
+      </w:pPr>
       <w:r>
         <w:t xml:space="preserve">Coding agent sessions are currently</w:t>
       </w:r>
@@ -7819,7 +8092,7 @@
         <w:rPr>
           <w:rStyle w:val="FootnoteReference"/>
         </w:rPr>
-        <w:footnoteReference w:id="126"/>
+        <w:footnoteReference w:id="131"/>
       </w:r>
       <w:r>
         <w:t xml:space="preserve"> </w:t>
@@ -7851,7 +8124,7 @@
       <w:r>
         <w:t xml:space="preserve"> </w:t>
       </w:r>
-      <w:hyperlink r:id="rId127">
+      <w:hyperlink r:id="rId132">
         <w:r>
           <w:rPr>
             <w:rStyle w:val="Hyperlink"/>
@@ -7910,7 +8183,7 @@
       <w:r>
         <w:t xml:space="preserve"> </w:t>
       </w:r>
-      <w:hyperlink r:id="rId128">
+      <w:hyperlink r:id="rId133">
         <w:r>
           <w:rPr>
             <w:rStyle w:val="Hyperlink"/>
@@ -8029,14 +8302,14 @@
         <w:t xml:space="preserve">just like you would for any other skill you want to maintain.</w:t>
       </w:r>
     </w:p>
-    <w:bookmarkEnd w:id="129"/>
-    <w:bookmarkStart w:id="150" w:name="sec-ai-research-modes"/>
+    <w:bookmarkEnd w:id="134"/>
+    <w:bookmarkStart w:id="155" w:name="sec-ai-research-modes"/>
     <w:p>
       <w:pPr>
         <w:pStyle w:val="Heading1"/>
       </w:pPr>
       <w:r>
-        <w:t xml:space="preserve">10. Deep Research Modes</w:t>
+        <w:t xml:space="preserve">11. Deep Research Modes</w:t>
       </w:r>
     </w:p>
     <w:p>
@@ -8120,7 +8393,7 @@
         <w:pStyle w:val="Compact"/>
         <w:numPr>
           <w:ilvl w:val="0"/>
-          <w:numId w:val="1016"/>
+          <w:numId w:val="1017"/>
         </w:numPr>
       </w:pPr>
       <w:r>
@@ -8132,7 +8405,7 @@
         <w:pStyle w:val="Compact"/>
         <w:numPr>
           <w:ilvl w:val="0"/>
-          <w:numId w:val="1016"/>
+          <w:numId w:val="1017"/>
         </w:numPr>
       </w:pPr>
       <w:r>
@@ -8144,7 +8417,7 @@
         <w:pStyle w:val="Compact"/>
         <w:numPr>
           <w:ilvl w:val="0"/>
-          <w:numId w:val="1016"/>
+          <w:numId w:val="1017"/>
         </w:numPr>
       </w:pPr>
       <w:r>
@@ -8156,7 +8429,7 @@
         <w:pStyle w:val="Compact"/>
         <w:numPr>
           <w:ilvl w:val="0"/>
-          <w:numId w:val="1016"/>
+          <w:numId w:val="1017"/>
         </w:numPr>
       </w:pPr>
       <w:r>
@@ -8168,7 +8441,7 @@
         <w:pStyle w:val="Compact"/>
         <w:numPr>
           <w:ilvl w:val="0"/>
-          <w:numId w:val="1016"/>
+          <w:numId w:val="1017"/>
         </w:numPr>
       </w:pPr>
       <w:r>
@@ -8225,7 +8498,7 @@
         <w:t xml:space="preserve">vendors change plan limits often, so re-check before relying on one.</w:t>
       </w:r>
     </w:p>
-    <w:bookmarkStart w:id="132" w:name="claude-research"/>
+    <w:bookmarkStart w:id="137" w:name="claude-research"/>
     <w:p>
       <w:pPr>
         <w:pStyle w:val="Heading4"/>
@@ -8238,7 +8511,7 @@
       <w:pPr>
         <w:pStyle w:val="FirstParagraph"/>
       </w:pPr>
-      <w:hyperlink r:id="rId130">
+      <w:hyperlink r:id="rId135">
         <w:r>
           <w:rPr>
             <w:rStyle w:val="Hyperlink"/>
@@ -8397,7 +8670,7 @@
       <w:r>
         <w:t xml:space="preserve"> </w:t>
       </w:r>
-      <w:hyperlink r:id="rId131">
+      <w:hyperlink r:id="rId136">
         <w:r>
           <w:rPr>
             <w:rStyle w:val="Hyperlink"/>
@@ -8472,8 +8745,8 @@
         <w:t xml:space="preserve">not something you call.</w:t>
       </w:r>
     </w:p>
-    <w:bookmarkEnd w:id="132"/>
-    <w:bookmarkStart w:id="135" w:name="gemini-deep-research"/>
+    <w:bookmarkEnd w:id="137"/>
+    <w:bookmarkStart w:id="140" w:name="gemini-deep-research"/>
     <w:p>
       <w:pPr>
         <w:pStyle w:val="Heading4"/>
@@ -8486,7 +8759,7 @@
       <w:pPr>
         <w:pStyle w:val="FirstParagraph"/>
       </w:pPr>
-      <w:hyperlink r:id="rId133">
+      <w:hyperlink r:id="rId138">
         <w:r>
           <w:rPr>
             <w:rStyle w:val="Hyperlink"/>
@@ -8642,7 +8915,7 @@
       <w:r>
         <w:t xml:space="preserve"> </w:t>
       </w:r>
-      <w:hyperlink r:id="rId134">
+      <w:hyperlink r:id="rId139">
         <w:r>
           <w:rPr>
             <w:rStyle w:val="Hyperlink"/>
@@ -8759,8 +9032,8 @@
         <w:t xml:space="preserve">and the docs estimate $1-3 per standard task and $3-7 per Max task.</w:t>
       </w:r>
     </w:p>
-    <w:bookmarkEnd w:id="135"/>
-    <w:bookmarkStart w:id="138" w:name="chatgpt-deep-research"/>
+    <w:bookmarkEnd w:id="140"/>
+    <w:bookmarkStart w:id="143" w:name="chatgpt-deep-research"/>
     <w:p>
       <w:pPr>
         <w:pStyle w:val="Heading4"/>
@@ -8773,7 +9046,7 @@
       <w:pPr>
         <w:pStyle w:val="FirstParagraph"/>
       </w:pPr>
-      <w:hyperlink r:id="rId136">
+      <w:hyperlink r:id="rId141">
         <w:r>
           <w:rPr>
             <w:rStyle w:val="Hyperlink"/>
@@ -8914,7 +9187,7 @@
       <w:r>
         <w:t xml:space="preserve"> </w:t>
       </w:r>
-      <w:hyperlink r:id="rId137">
+      <w:hyperlink r:id="rId142">
         <w:r>
           <w:rPr>
             <w:rStyle w:val="Hyperlink"/>
@@ -9001,8 +9274,8 @@
         <w:t xml:space="preserve">Output carries inline citations as annotations with a URL, title, and character offsets.</w:t>
       </w:r>
     </w:p>
-    <w:bookmarkEnd w:id="138"/>
-    <w:bookmarkStart w:id="141" w:name="Xc017de845cc5a3087b50d6c735b9b56e74687ad"/>
+    <w:bookmarkEnd w:id="143"/>
+    <w:bookmarkStart w:id="146" w:name="Xc017de845cc5a3087b50d6c735b9b56e74687ad"/>
     <w:p>
       <w:pPr>
         <w:pStyle w:val="Heading4"/>
@@ -9045,7 +9318,7 @@
       <w:r>
         <w:t xml:space="preserve"> </w:t>
       </w:r>
-      <w:hyperlink r:id="rId139">
+      <w:hyperlink r:id="rId144">
         <w:r>
           <w:rPr>
             <w:rStyle w:val="Hyperlink"/>
@@ -9240,7 +9513,7 @@
       <w:r>
         <w:t xml:space="preserve"> </w:t>
       </w:r>
-      <w:hyperlink r:id="rId140">
+      <w:hyperlink r:id="rId145">
         <w:r>
           <w:rPr>
             <w:rStyle w:val="Hyperlink"/>
@@ -9297,8 +9570,8 @@
         <w:t xml:space="preserve">not of Researcher.</w:t>
       </w:r>
     </w:p>
-    <w:bookmarkEnd w:id="141"/>
-    <w:bookmarkStart w:id="145" w:name="perplexity-research"/>
+    <w:bookmarkEnd w:id="146"/>
+    <w:bookmarkStart w:id="150" w:name="perplexity-research"/>
     <w:p>
       <w:pPr>
         <w:pStyle w:val="Heading4"/>
@@ -9311,7 +9584,7 @@
       <w:pPr>
         <w:pStyle w:val="FirstParagraph"/>
       </w:pPr>
-      <w:hyperlink r:id="rId142">
+      <w:hyperlink r:id="rId147">
         <w:r>
           <w:rPr>
             <w:rStyle w:val="Hyperlink"/>
@@ -9385,7 +9658,7 @@
       <w:r>
         <w:t xml:space="preserve"> </w:t>
       </w:r>
-      <w:hyperlink r:id="rId143">
+      <w:hyperlink r:id="rId148">
         <w:r>
           <w:rPr>
             <w:rStyle w:val="Hyperlink"/>
@@ -9458,7 +9731,7 @@
       <w:r>
         <w:t xml:space="preserve"> </w:t>
       </w:r>
-      <w:hyperlink r:id="rId144">
+      <w:hyperlink r:id="rId149">
         <w:r>
           <w:rPr>
             <w:rStyle w:val="VerbatimChar"/>
@@ -9518,8 +9791,8 @@
         <w:t xml:space="preserve">with the old interface supported until 2026-09-27.</w:t>
       </w:r>
     </w:p>
-    <w:bookmarkEnd w:id="145"/>
-    <w:bookmarkStart w:id="146" w:name="comparison"/>
+    <w:bookmarkEnd w:id="150"/>
+    <w:bookmarkStart w:id="151" w:name="comparison"/>
     <w:p>
       <w:pPr>
         <w:pStyle w:val="Heading4"/>
@@ -10152,8 +10425,8 @@
         </w:tc>
       </w:tr>
     </w:tbl>
-    <w:bookmarkEnd w:id="146"/>
-    <w:bookmarkStart w:id="149" w:name="useful-to-us"/>
+    <w:bookmarkEnd w:id="151"/>
+    <w:bookmarkStart w:id="154" w:name="useful-to-us"/>
     <w:p>
       <w:pPr>
         <w:pStyle w:val="Heading4"/>
@@ -10242,7 +10515,7 @@
       <w:r>
         <w:t xml:space="preserve"> </w:t>
       </w:r>
-      <w:hyperlink r:id="rId147">
+      <w:hyperlink r:id="rId152">
         <w:r>
           <w:rPr>
             <w:rStyle w:val="Hyperlink"/>
@@ -10330,7 +10603,7 @@
           <w:rPr>
             <w:rStyle w:val="Hyperlink"/>
           </w:rPr>
-          <w:t xml:space="preserve">Section 9</w:t>
+          <w:t xml:space="preserve">Section 10</w:t>
         </w:r>
       </w:hyperlink>
       <w:r>
@@ -10365,7 +10638,7 @@
         <w:pStyle w:val="Compact"/>
         <w:numPr>
           <w:ilvl w:val="0"/>
-          <w:numId w:val="1017"/>
+          <w:numId w:val="1018"/>
         </w:numPr>
       </w:pPr>
       <w:r>
@@ -10399,7 +10672,7 @@
       <w:r>
         <w:t xml:space="preserve">and budget them like any other agent spend (</w:t>
       </w:r>
-      <w:hyperlink r:id="rId148">
+      <w:hyperlink r:id="rId153">
         <w:r>
           <w:rPr>
             <w:rStyle w:val="Hyperlink"/>
@@ -10416,7 +10689,7 @@
         <w:pStyle w:val="Compact"/>
         <w:numPr>
           <w:ilvl w:val="0"/>
-          <w:numId w:val="1017"/>
+          <w:numId w:val="1018"/>
         </w:numPr>
       </w:pPr>
       <w:r>
@@ -10445,15 +10718,15 @@
         <w:t xml:space="preserve">exactly as the fact-check rules in this manual require of any AI-drafted prose.</w:t>
       </w:r>
     </w:p>
-    <w:bookmarkEnd w:id="149"/>
-    <w:bookmarkEnd w:id="150"/>
-    <w:bookmarkStart w:id="161" w:name="how-to-work-with-coding-agents"/>
+    <w:bookmarkEnd w:id="154"/>
+    <w:bookmarkEnd w:id="155"/>
+    <w:bookmarkStart w:id="166" w:name="how-to-work-with-coding-agents"/>
     <w:p>
       <w:pPr>
         <w:pStyle w:val="Heading1"/>
       </w:pPr>
       <w:r>
-        <w:t xml:space="preserve">11. How to Work with Coding Agents</w:t>
+        <w:t xml:space="preserve">12. How to Work with Coding Agents</w:t>
       </w:r>
     </w:p>
     <w:p>
@@ -10482,7 +10755,7 @@
         <w:t xml:space="preserve">and collaboration style.</w:t>
       </w:r>
     </w:p>
-    <w:bookmarkStart w:id="151" w:name="ways-to-interact-with-coding-agents"/>
+    <w:bookmarkStart w:id="156" w:name="ways-to-interact-with-coding-agents"/>
     <w:p>
       <w:pPr>
         <w:pStyle w:val="Heading4"/>
@@ -10516,7 +10789,7 @@
         <w:pStyle w:val="Compact"/>
         <w:numPr>
           <w:ilvl w:val="0"/>
-          <w:numId w:val="1018"/>
+          <w:numId w:val="1019"/>
         </w:numPr>
       </w:pPr>
       <w:r>
@@ -10589,7 +10862,7 @@
         <w:pStyle w:val="Compact"/>
         <w:numPr>
           <w:ilvl w:val="0"/>
-          <w:numId w:val="1018"/>
+          <w:numId w:val="1019"/>
         </w:numPr>
       </w:pPr>
       <w:r>
@@ -10644,7 +10917,7 @@
         <w:pStyle w:val="Compact"/>
         <w:numPr>
           <w:ilvl w:val="0"/>
-          <w:numId w:val="1018"/>
+          <w:numId w:val="1019"/>
         </w:numPr>
       </w:pPr>
       <w:r>
@@ -10699,7 +10972,7 @@
         <w:pStyle w:val="Compact"/>
         <w:numPr>
           <w:ilvl w:val="0"/>
-          <w:numId w:val="1018"/>
+          <w:numId w:val="1019"/>
         </w:numPr>
       </w:pPr>
       <w:r>
@@ -10783,8 +11056,8 @@
         <w:t xml:space="preserve">for assigning and managing coding tasks.</w:t>
       </w:r>
     </w:p>
-    <w:bookmarkEnd w:id="151"/>
-    <w:bookmarkStart w:id="152" w:name="assigning-issues-to-copilot"/>
+    <w:bookmarkEnd w:id="156"/>
+    <w:bookmarkStart w:id="157" w:name="assigning-issues-to-copilot"/>
     <w:p>
       <w:pPr>
         <w:pStyle w:val="Heading4"/>
@@ -10820,7 +11093,7 @@
       <w:pPr>
         <w:numPr>
           <w:ilvl w:val="0"/>
-          <w:numId w:val="1019"/>
+          <w:numId w:val="1020"/>
         </w:numPr>
       </w:pPr>
       <w:r>
@@ -10844,7 +11117,7 @@
       <w:pPr>
         <w:numPr>
           <w:ilvl w:val="0"/>
-          <w:numId w:val="1019"/>
+          <w:numId w:val="1020"/>
         </w:numPr>
       </w:pPr>
       <w:r>
@@ -10880,7 +11153,7 @@
       <w:pPr>
         <w:numPr>
           <w:ilvl w:val="0"/>
-          <w:numId w:val="1019"/>
+          <w:numId w:val="1020"/>
         </w:numPr>
       </w:pPr>
       <w:r>
@@ -10900,8 +11173,8 @@
         <w:t xml:space="preserve">Delegate tasks to Copilot directly from the chat interface in supported editors</w:t>
       </w:r>
     </w:p>
-    <w:bookmarkEnd w:id="152"/>
-    <w:bookmarkStart w:id="153" w:name="the-agent-workflow"/>
+    <w:bookmarkEnd w:id="157"/>
+    <w:bookmarkStart w:id="158" w:name="the-agent-workflow"/>
     <w:p>
       <w:pPr>
         <w:pStyle w:val="Heading4"/>
@@ -10928,7 +11201,7 @@
       <w:pPr>
         <w:numPr>
           <w:ilvl w:val="0"/>
-          <w:numId w:val="1020"/>
+          <w:numId w:val="1021"/>
         </w:numPr>
       </w:pPr>
       <w:r>
@@ -10970,7 +11243,7 @@
       <w:pPr>
         <w:numPr>
           <w:ilvl w:val="0"/>
-          <w:numId w:val="1020"/>
+          <w:numId w:val="1021"/>
         </w:numPr>
       </w:pPr>
       <w:r>
@@ -10994,7 +11267,7 @@
       <w:pPr>
         <w:numPr>
           <w:ilvl w:val="0"/>
-          <w:numId w:val="1020"/>
+          <w:numId w:val="1021"/>
         </w:numPr>
       </w:pPr>
       <w:r>
@@ -11036,7 +11309,7 @@
       <w:pPr>
         <w:numPr>
           <w:ilvl w:val="0"/>
-          <w:numId w:val="1020"/>
+          <w:numId w:val="1021"/>
         </w:numPr>
       </w:pPr>
       <w:r>
@@ -11072,7 +11345,7 @@
       <w:pPr>
         <w:numPr>
           <w:ilvl w:val="0"/>
-          <w:numId w:val="1020"/>
+          <w:numId w:val="1021"/>
         </w:numPr>
       </w:pPr>
       <w:r>
@@ -11098,8 +11371,8 @@
         <w:t xml:space="preserve">the agent will iterate based on your feedback</w:t>
       </w:r>
     </w:p>
-    <w:bookmarkEnd w:id="153"/>
-    <w:bookmarkStart w:id="154" w:name="collaborating-with-coding-agents"/>
+    <w:bookmarkEnd w:id="158"/>
+    <w:bookmarkStart w:id="159" w:name="collaborating-with-coding-agents"/>
     <w:p>
       <w:pPr>
         <w:pStyle w:val="Heading4"/>
@@ -11132,7 +11405,7 @@
       <w:pPr>
         <w:numPr>
           <w:ilvl w:val="0"/>
-          <w:numId w:val="1021"/>
+          <w:numId w:val="1022"/>
         </w:numPr>
       </w:pPr>
       <w:r>
@@ -11162,7 +11435,7 @@
       <w:pPr>
         <w:numPr>
           <w:ilvl w:val="0"/>
-          <w:numId w:val="1021"/>
+          <w:numId w:val="1022"/>
         </w:numPr>
       </w:pPr>
       <w:r>
@@ -11208,7 +11481,7 @@
         <w:pStyle w:val="Compact"/>
         <w:numPr>
           <w:ilvl w:val="0"/>
-          <w:numId w:val="1022"/>
+          <w:numId w:val="1023"/>
         </w:numPr>
       </w:pPr>
       <w:r>
@@ -11220,7 +11493,7 @@
         <w:pStyle w:val="Compact"/>
         <w:numPr>
           <w:ilvl w:val="0"/>
-          <w:numId w:val="1022"/>
+          <w:numId w:val="1023"/>
         </w:numPr>
       </w:pPr>
       <w:r>
@@ -11232,7 +11505,7 @@
         <w:pStyle w:val="Compact"/>
         <w:numPr>
           <w:ilvl w:val="0"/>
-          <w:numId w:val="1022"/>
+          <w:numId w:val="1023"/>
         </w:numPr>
       </w:pPr>
       <w:r>
@@ -11272,8 +11545,8 @@
         <w:t xml:space="preserve">Then assign new work to the agent for the next iteration.</w:t>
       </w:r>
     </w:p>
-    <w:bookmarkEnd w:id="154"/>
-    <w:bookmarkStart w:id="155" w:name="directly-prompting-for-pull-requests"/>
+    <w:bookmarkEnd w:id="159"/>
+    <w:bookmarkStart w:id="160" w:name="directly-prompting-for-pull-requests"/>
     <w:p>
       <w:pPr>
         <w:pStyle w:val="Heading4"/>
@@ -11295,7 +11568,7 @@
         <w:pStyle w:val="Compact"/>
         <w:numPr>
           <w:ilvl w:val="0"/>
-          <w:numId w:val="1023"/>
+          <w:numId w:val="1024"/>
         </w:numPr>
       </w:pPr>
       <w:r>
@@ -11307,7 +11580,7 @@
         <w:pStyle w:val="Compact"/>
         <w:numPr>
           <w:ilvl w:val="0"/>
-          <w:numId w:val="1023"/>
+          <w:numId w:val="1024"/>
         </w:numPr>
       </w:pPr>
       <w:r>
@@ -11319,15 +11592,15 @@
         <w:pStyle w:val="Compact"/>
         <w:numPr>
           <w:ilvl w:val="0"/>
-          <w:numId w:val="1023"/>
+          <w:numId w:val="1024"/>
         </w:numPr>
       </w:pPr>
       <w:r>
         <w:t xml:space="preserve">This is useful for quick fixes or well-defined tasks</w:t>
       </w:r>
     </w:p>
-    <w:bookmarkEnd w:id="155"/>
-    <w:bookmarkStart w:id="156" w:name="important-safeguards"/>
+    <w:bookmarkEnd w:id="160"/>
+    <w:bookmarkStart w:id="161" w:name="important-safeguards"/>
     <w:p>
       <w:pPr>
         <w:pStyle w:val="Heading4"/>
@@ -11341,7 +11614,7 @@
         <w:pStyle w:val="Compact"/>
         <w:numPr>
           <w:ilvl w:val="0"/>
-          <w:numId w:val="1024"/>
+          <w:numId w:val="1025"/>
         </w:numPr>
       </w:pPr>
       <w:r>
@@ -11366,7 +11639,7 @@
         <w:pStyle w:val="Compact"/>
         <w:numPr>
           <w:ilvl w:val="0"/>
-          <w:numId w:val="1024"/>
+          <w:numId w:val="1025"/>
         </w:numPr>
       </w:pPr>
       <w:r>
@@ -11403,7 +11676,7 @@
         <w:pStyle w:val="Compact"/>
         <w:numPr>
           <w:ilvl w:val="0"/>
-          <w:numId w:val="1024"/>
+          <w:numId w:val="1025"/>
         </w:numPr>
       </w:pPr>
       <w:r>
@@ -11423,8 +11696,8 @@
         <w:t xml:space="preserve">All agent actions are logged and visible in the PR</w:t>
       </w:r>
     </w:p>
-    <w:bookmarkEnd w:id="156"/>
-    <w:bookmarkStart w:id="160" w:name="workflow-approval-requirements"/>
+    <w:bookmarkEnd w:id="161"/>
+    <w:bookmarkStart w:id="165" w:name="workflow-approval-requirements"/>
     <w:p>
       <w:pPr>
         <w:pStyle w:val="Heading4"/>
@@ -11512,7 +11785,7 @@
         <w:pStyle w:val="Compact"/>
         <w:numPr>
           <w:ilvl w:val="0"/>
-          <w:numId w:val="1025"/>
+          <w:numId w:val="1026"/>
         </w:numPr>
       </w:pPr>
       <w:r>
@@ -11543,7 +11816,7 @@
         <w:pStyle w:val="Compact"/>
         <w:numPr>
           <w:ilvl w:val="0"/>
-          <w:numId w:val="1025"/>
+          <w:numId w:val="1026"/>
         </w:numPr>
       </w:pPr>
       <w:r>
@@ -11589,7 +11862,7 @@
         <w:pStyle w:val="Compact"/>
         <w:numPr>
           <w:ilvl w:val="0"/>
-          <w:numId w:val="1025"/>
+          <w:numId w:val="1026"/>
         </w:numPr>
       </w:pPr>
       <w:r>
@@ -11678,10 +11951,10 @@
         <w:pStyle w:val="Compact"/>
         <w:numPr>
           <w:ilvl w:val="0"/>
-          <w:numId w:val="1026"/>
-        </w:numPr>
-      </w:pPr>
-      <w:hyperlink r:id="rId157">
+          <w:numId w:val="1027"/>
+        </w:numPr>
+      </w:pPr>
+      <w:hyperlink r:id="rId162">
         <w:r>
           <w:rPr>
             <w:rStyle w:val="Hyperlink"/>
@@ -11704,10 +11977,10 @@
         <w:pStyle w:val="Compact"/>
         <w:numPr>
           <w:ilvl w:val="0"/>
-          <w:numId w:val="1026"/>
-        </w:numPr>
-      </w:pPr>
-      <w:hyperlink r:id="rId158">
+          <w:numId w:val="1027"/>
+        </w:numPr>
+      </w:pPr>
+      <w:hyperlink r:id="rId163">
         <w:r>
           <w:rPr>
             <w:rStyle w:val="Hyperlink"/>
@@ -11741,7 +12014,7 @@
       <w:r>
         <w:t xml:space="preserve"> </w:t>
       </w:r>
-      <w:hyperlink r:id="rId159">
+      <w:hyperlink r:id="rId164">
         <w:r>
           <w:rPr>
             <w:rStyle w:val="Hyperlink"/>
@@ -11753,15 +12026,15 @@
         <w:t xml:space="preserve">.</w:t>
       </w:r>
     </w:p>
-    <w:bookmarkEnd w:id="160"/>
-    <w:bookmarkEnd w:id="161"/>
-    <w:bookmarkStart w:id="164" w:name="useful-prompt-formats"/>
+    <w:bookmarkEnd w:id="165"/>
+    <w:bookmarkEnd w:id="166"/>
+    <w:bookmarkStart w:id="169" w:name="useful-prompt-formats"/>
     <w:p>
       <w:pPr>
         <w:pStyle w:val="Heading1"/>
       </w:pPr>
       <w:r>
-        <w:t xml:space="preserve">12. Useful Prompt Formats</w:t>
+        <w:t xml:space="preserve">13. Useful Prompt Formats</w:t>
       </w:r>
     </w:p>
     <w:p>
@@ -11784,7 +12057,7 @@
         <w:t xml:space="preserve">Here are some useful prompt formats that you can use when requesting assistance from coding agents:</w:t>
       </w:r>
     </w:p>
-    <w:bookmarkStart w:id="162" w:name="common-task-patterns"/>
+    <w:bookmarkStart w:id="167" w:name="common-task-patterns"/>
     <w:p>
       <w:pPr>
         <w:pStyle w:val="Heading4"/>
@@ -11810,7 +12083,7 @@
         <w:pStyle w:val="Compact"/>
         <w:numPr>
           <w:ilvl w:val="0"/>
-          <w:numId w:val="1027"/>
+          <w:numId w:val="1028"/>
         </w:numPr>
       </w:pPr>
       <w:r>
@@ -11822,7 +12095,7 @@
         <w:pStyle w:val="Compact"/>
         <w:numPr>
           <w:ilvl w:val="0"/>
-          <w:numId w:val="1027"/>
+          <w:numId w:val="1028"/>
         </w:numPr>
       </w:pPr>
       <w:r>
@@ -11834,7 +12107,7 @@
         <w:pStyle w:val="Compact"/>
         <w:numPr>
           <w:ilvl w:val="0"/>
-          <w:numId w:val="1027"/>
+          <w:numId w:val="1028"/>
         </w:numPr>
       </w:pPr>
       <w:r>
@@ -11864,7 +12137,7 @@
         <w:pStyle w:val="Compact"/>
         <w:numPr>
           <w:ilvl w:val="0"/>
-          <w:numId w:val="1028"/>
+          <w:numId w:val="1029"/>
         </w:numPr>
       </w:pPr>
       <w:r>
@@ -11876,7 +12149,7 @@
         <w:pStyle w:val="Compact"/>
         <w:numPr>
           <w:ilvl w:val="0"/>
-          <w:numId w:val="1028"/>
+          <w:numId w:val="1029"/>
         </w:numPr>
       </w:pPr>
       <w:r>
@@ -11888,7 +12161,7 @@
         <w:pStyle w:val="Compact"/>
         <w:numPr>
           <w:ilvl w:val="0"/>
-          <w:numId w:val="1028"/>
+          <w:numId w:val="1029"/>
         </w:numPr>
       </w:pPr>
       <w:r>
@@ -11918,7 +12191,7 @@
         <w:pStyle w:val="Compact"/>
         <w:numPr>
           <w:ilvl w:val="0"/>
-          <w:numId w:val="1029"/>
+          <w:numId w:val="1030"/>
         </w:numPr>
       </w:pPr>
       <w:r>
@@ -11930,7 +12203,7 @@
         <w:pStyle w:val="Compact"/>
         <w:numPr>
           <w:ilvl w:val="0"/>
-          <w:numId w:val="1029"/>
+          <w:numId w:val="1030"/>
         </w:numPr>
       </w:pPr>
       <w:r>
@@ -11942,7 +12215,7 @@
         <w:pStyle w:val="Compact"/>
         <w:numPr>
           <w:ilvl w:val="0"/>
-          <w:numId w:val="1029"/>
+          <w:numId w:val="1030"/>
         </w:numPr>
       </w:pPr>
       <w:r>
@@ -11972,7 +12245,7 @@
         <w:pStyle w:val="Compact"/>
         <w:numPr>
           <w:ilvl w:val="0"/>
-          <w:numId w:val="1030"/>
+          <w:numId w:val="1031"/>
         </w:numPr>
       </w:pPr>
       <w:r>
@@ -11984,7 +12257,7 @@
         <w:pStyle w:val="Compact"/>
         <w:numPr>
           <w:ilvl w:val="0"/>
-          <w:numId w:val="1030"/>
+          <w:numId w:val="1031"/>
         </w:numPr>
       </w:pPr>
       <w:r>
@@ -11996,7 +12269,7 @@
         <w:pStyle w:val="Compact"/>
         <w:numPr>
           <w:ilvl w:val="0"/>
-          <w:numId w:val="1030"/>
+          <w:numId w:val="1031"/>
         </w:numPr>
       </w:pPr>
       <w:r>
@@ -12026,7 +12299,7 @@
         <w:pStyle w:val="Compact"/>
         <w:numPr>
           <w:ilvl w:val="0"/>
-          <w:numId w:val="1031"/>
+          <w:numId w:val="1032"/>
         </w:numPr>
       </w:pPr>
       <w:r>
@@ -12038,7 +12311,7 @@
         <w:pStyle w:val="Compact"/>
         <w:numPr>
           <w:ilvl w:val="0"/>
-          <w:numId w:val="1031"/>
+          <w:numId w:val="1032"/>
         </w:numPr>
       </w:pPr>
       <w:r>
@@ -12050,7 +12323,7 @@
         <w:pStyle w:val="Compact"/>
         <w:numPr>
           <w:ilvl w:val="0"/>
-          <w:numId w:val="1031"/>
+          <w:numId w:val="1032"/>
         </w:numPr>
       </w:pPr>
       <w:r>
@@ -12080,7 +12353,7 @@
         <w:pStyle w:val="Compact"/>
         <w:numPr>
           <w:ilvl w:val="0"/>
-          <w:numId w:val="1032"/>
+          <w:numId w:val="1033"/>
         </w:numPr>
       </w:pPr>
       <w:r>
@@ -12092,7 +12365,7 @@
         <w:pStyle w:val="Compact"/>
         <w:numPr>
           <w:ilvl w:val="0"/>
-          <w:numId w:val="1032"/>
+          <w:numId w:val="1033"/>
         </w:numPr>
       </w:pPr>
       <w:r>
@@ -12104,7 +12377,7 @@
         <w:pStyle w:val="Compact"/>
         <w:numPr>
           <w:ilvl w:val="0"/>
-          <w:numId w:val="1032"/>
+          <w:numId w:val="1033"/>
         </w:numPr>
       </w:pPr>
       <w:r>
@@ -12134,7 +12407,7 @@
         <w:pStyle w:val="Compact"/>
         <w:numPr>
           <w:ilvl w:val="0"/>
-          <w:numId w:val="1033"/>
+          <w:numId w:val="1034"/>
         </w:numPr>
       </w:pPr>
       <w:r>
@@ -12146,7 +12419,7 @@
         <w:pStyle w:val="Compact"/>
         <w:numPr>
           <w:ilvl w:val="0"/>
-          <w:numId w:val="1033"/>
+          <w:numId w:val="1034"/>
         </w:numPr>
       </w:pPr>
       <w:r>
@@ -12158,7 +12431,7 @@
         <w:pStyle w:val="Compact"/>
         <w:numPr>
           <w:ilvl w:val="0"/>
-          <w:numId w:val="1033"/>
+          <w:numId w:val="1034"/>
         </w:numPr>
       </w:pPr>
       <w:r>
@@ -12171,8 +12444,8 @@
         <w:t xml:space="preserve">“clarify the explanation of the analysis workflow”</w:t>
       </w:r>
     </w:p>
-    <w:bookmarkEnd w:id="162"/>
-    <w:bookmarkStart w:id="163" w:name="tips-for-effective-prompts"/>
+    <w:bookmarkEnd w:id="167"/>
+    <w:bookmarkStart w:id="168" w:name="tips-for-effective-prompts"/>
     <w:p>
       <w:pPr>
         <w:pStyle w:val="Heading4"/>
@@ -12186,7 +12459,7 @@
         <w:pStyle w:val="Compact"/>
         <w:numPr>
           <w:ilvl w:val="0"/>
-          <w:numId w:val="1034"/>
+          <w:numId w:val="1035"/>
         </w:numPr>
       </w:pPr>
       <w:r>
@@ -12205,7 +12478,7 @@
         <w:pStyle w:val="Compact"/>
         <w:numPr>
           <w:ilvl w:val="0"/>
-          <w:numId w:val="1034"/>
+          <w:numId w:val="1035"/>
         </w:numPr>
       </w:pPr>
       <w:r>
@@ -12224,7 +12497,7 @@
         <w:pStyle w:val="Compact"/>
         <w:numPr>
           <w:ilvl w:val="0"/>
-          <w:numId w:val="1034"/>
+          <w:numId w:val="1035"/>
         </w:numPr>
       </w:pPr>
       <w:r>
@@ -12243,7 +12516,7 @@
         <w:pStyle w:val="Compact"/>
         <w:numPr>
           <w:ilvl w:val="0"/>
-          <w:numId w:val="1034"/>
+          <w:numId w:val="1035"/>
         </w:numPr>
       </w:pPr>
       <w:r>
@@ -12257,15 +12530,15 @@
         <w:t xml:space="preserve">: Ask the agent to test or verify its changes when appropriate</w:t>
       </w:r>
     </w:p>
-    <w:bookmarkEnd w:id="163"/>
-    <w:bookmarkEnd w:id="164"/>
-    <w:bookmarkStart w:id="169" w:name="editing-with-.docx-files"/>
+    <w:bookmarkEnd w:id="168"/>
+    <w:bookmarkEnd w:id="169"/>
+    <w:bookmarkStart w:id="174" w:name="editing-with-.docx-files"/>
     <w:p>
       <w:pPr>
         <w:pStyle w:val="Heading1"/>
       </w:pPr>
       <w:r>
-        <w:t xml:space="preserve">13. Editing with</w:t>
+        <w:t xml:space="preserve">14. Editing with</w:t>
       </w:r>
       <w:r>
         <w:t xml:space="preserve"> </w:t>
@@ -12311,7 +12584,7 @@
         <w:pStyle w:val="Compact"/>
         <w:numPr>
           <w:ilvl w:val="0"/>
-          <w:numId w:val="1035"/>
+          <w:numId w:val="1036"/>
         </w:numPr>
       </w:pPr>
       <w:r>
@@ -12323,7 +12596,7 @@
         <w:pStyle w:val="Compact"/>
         <w:numPr>
           <w:ilvl w:val="0"/>
-          <w:numId w:val="1035"/>
+          <w:numId w:val="1036"/>
         </w:numPr>
       </w:pPr>
       <w:r>
@@ -12335,7 +12608,7 @@
         <w:pStyle w:val="Compact"/>
         <w:numPr>
           <w:ilvl w:val="0"/>
-          <w:numId w:val="1035"/>
+          <w:numId w:val="1036"/>
         </w:numPr>
       </w:pPr>
       <w:r>
@@ -12370,7 +12643,7 @@
         <w:pStyle w:val="Compact"/>
         <w:numPr>
           <w:ilvl w:val="0"/>
-          <w:numId w:val="1036"/>
+          <w:numId w:val="1037"/>
         </w:numPr>
       </w:pPr>
       <w:r>
@@ -12397,7 +12670,7 @@
         <w:pStyle w:val="Compact"/>
         <w:numPr>
           <w:ilvl w:val="0"/>
-          <w:numId w:val="1036"/>
+          <w:numId w:val="1037"/>
         </w:numPr>
       </w:pPr>
       <w:r>
@@ -12424,7 +12697,7 @@
         <w:pStyle w:val="Compact"/>
         <w:numPr>
           <w:ilvl w:val="0"/>
-          <w:numId w:val="1036"/>
+          <w:numId w:val="1037"/>
         </w:numPr>
       </w:pPr>
       <w:r>
@@ -12439,7 +12712,7 @@
         <w:t xml:space="preserve">This approach makes it easier for collaborators who are more comfortable with Word to contribute while maintaining the source files in Quarto format.</w:t>
       </w:r>
     </w:p>
-    <w:bookmarkStart w:id="168" w:name="known-issue-document-1-warning-in-word"/>
+    <w:bookmarkStart w:id="173" w:name="known-issue-document-1-warning-in-word"/>
     <w:p>
       <w:pPr>
         <w:pStyle w:val="Heading4"/>
@@ -12521,10 +12794,10 @@
         <w:pStyle w:val="Compact"/>
         <w:numPr>
           <w:ilvl w:val="0"/>
-          <w:numId w:val="1037"/>
-        </w:numPr>
-      </w:pPr>
-      <w:hyperlink r:id="rId165">
+          <w:numId w:val="1038"/>
+        </w:numPr>
+      </w:pPr>
+      <w:hyperlink r:id="rId170">
         <w:r>
           <w:rPr>
             <w:rStyle w:val="Hyperlink"/>
@@ -12538,10 +12811,10 @@
         <w:pStyle w:val="Compact"/>
         <w:numPr>
           <w:ilvl w:val="0"/>
-          <w:numId w:val="1037"/>
-        </w:numPr>
-      </w:pPr>
-      <w:hyperlink r:id="rId166">
+          <w:numId w:val="1038"/>
+        </w:numPr>
+      </w:pPr>
+      <w:hyperlink r:id="rId171">
         <w:r>
           <w:rPr>
             <w:rStyle w:val="Hyperlink"/>
@@ -12555,10 +12828,10 @@
         <w:pStyle w:val="Compact"/>
         <w:numPr>
           <w:ilvl w:val="0"/>
-          <w:numId w:val="1037"/>
-        </w:numPr>
-      </w:pPr>
-      <w:hyperlink r:id="rId167">
+          <w:numId w:val="1038"/>
+        </w:numPr>
+      </w:pPr>
+      <w:hyperlink r:id="rId172">
         <w:r>
           <w:rPr>
             <w:rStyle w:val="Hyperlink"/>
@@ -12596,7 +12869,7 @@
         <w:pStyle w:val="Compact"/>
         <w:numPr>
           <w:ilvl w:val="0"/>
-          <w:numId w:val="1038"/>
+          <w:numId w:val="1039"/>
         </w:numPr>
       </w:pPr>
       <w:r>
@@ -12608,7 +12881,7 @@
         <w:pStyle w:val="Compact"/>
         <w:numPr>
           <w:ilvl w:val="0"/>
-          <w:numId w:val="1038"/>
+          <w:numId w:val="1039"/>
         </w:numPr>
       </w:pPr>
       <w:r>
@@ -12620,7 +12893,7 @@
         <w:pStyle w:val="Compact"/>
         <w:numPr>
           <w:ilvl w:val="0"/>
-          <w:numId w:val="1038"/>
+          <w:numId w:val="1039"/>
         </w:numPr>
       </w:pPr>
       <w:r>
@@ -12638,7 +12911,7 @@
         <w:pStyle w:val="Compact"/>
         <w:numPr>
           <w:ilvl w:val="0"/>
-          <w:numId w:val="1038"/>
+          <w:numId w:val="1039"/>
         </w:numPr>
       </w:pPr>
       <w:r>
@@ -12671,15 +12944,15 @@
         <w:t xml:space="preserve">warning and can immediately add comments and track changes without issues.</w:t>
       </w:r>
     </w:p>
-    <w:bookmarkEnd w:id="168"/>
-    <w:bookmarkEnd w:id="169"/>
-    <w:bookmarkStart w:id="171" w:name="copilot-instructions-for-this-repository"/>
+    <w:bookmarkEnd w:id="173"/>
+    <w:bookmarkEnd w:id="174"/>
+    <w:bookmarkStart w:id="176" w:name="copilot-instructions-for-this-repository"/>
     <w:p>
       <w:pPr>
         <w:pStyle w:val="Heading1"/>
       </w:pPr>
       <w:r>
-        <w:t xml:space="preserve">14. Copilot Instructions for this Repository</w:t>
+        <w:t xml:space="preserve">15. Copilot Instructions for this Repository</w:t>
       </w:r>
     </w:p>
     <w:p>
@@ -12760,7 +13033,7 @@
         <w:pStyle w:val="Compact"/>
         <w:numPr>
           <w:ilvl w:val="0"/>
-          <w:numId w:val="1039"/>
+          <w:numId w:val="1040"/>
         </w:numPr>
       </w:pPr>
       <w:r>
@@ -12772,7 +13045,7 @@
         <w:pStyle w:val="Compact"/>
         <w:numPr>
           <w:ilvl w:val="0"/>
-          <w:numId w:val="1039"/>
+          <w:numId w:val="1040"/>
         </w:numPr>
       </w:pPr>
       <w:r>
@@ -12796,7 +13069,7 @@
         <w:pStyle w:val="Compact"/>
         <w:numPr>
           <w:ilvl w:val="0"/>
-          <w:numId w:val="1039"/>
+          <w:numId w:val="1040"/>
         </w:numPr>
       </w:pPr>
       <w:r>
@@ -12808,7 +13081,7 @@
         <w:pStyle w:val="Compact"/>
         <w:numPr>
           <w:ilvl w:val="0"/>
-          <w:numId w:val="1039"/>
+          <w:numId w:val="1040"/>
         </w:numPr>
       </w:pPr>
       <w:r>
@@ -12820,7 +13093,7 @@
         <w:pStyle w:val="Compact"/>
         <w:numPr>
           <w:ilvl w:val="0"/>
-          <w:numId w:val="1039"/>
+          <w:numId w:val="1040"/>
         </w:numPr>
       </w:pPr>
       <w:r>
@@ -12838,7 +13111,7 @@
         <w:pStyle w:val="Compact"/>
         <w:numPr>
           <w:ilvl w:val="0"/>
-          <w:numId w:val="1039"/>
+          <w:numId w:val="1040"/>
         </w:numPr>
       </w:pPr>
       <w:r>
@@ -12905,7 +13178,7 @@
       <w:r>
         <w:t xml:space="preserve"> </w:t>
       </w:r>
-      <w:hyperlink r:id="rId170">
+      <w:hyperlink r:id="rId175">
         <w:r>
           <w:rPr>
             <w:rStyle w:val="VerbatimChar"/>
@@ -12920,14 +13193,14 @@
         <w:t xml:space="preserve">for a working example.</w:t>
       </w:r>
     </w:p>
-    <w:bookmarkEnd w:id="171"/>
-    <w:bookmarkStart w:id="180" w:name="sec-ai-addressing-failing-workflows"/>
+    <w:bookmarkEnd w:id="176"/>
+    <w:bookmarkStart w:id="185" w:name="sec-ai-addressing-failing-workflows"/>
     <w:p>
       <w:pPr>
         <w:pStyle w:val="Heading1"/>
       </w:pPr>
       <w:r>
-        <w:t xml:space="preserve">15. Addressing Failing GitHub Actions Workflows</w:t>
+        <w:t xml:space="preserve">16. Addressing Failing GitHub Actions Workflows</w:t>
       </w:r>
     </w:p>
     <w:p>
@@ -12968,7 +13241,7 @@
         <w:t xml:space="preserve">or in the workflow configuration itself.</w:t>
       </w:r>
     </w:p>
-    <w:bookmarkStart w:id="172" w:name="X16724e8c4d0535f38e98d560729d113d43f9447"/>
+    <w:bookmarkStart w:id="177" w:name="X16724e8c4d0535f38e98d560729d113d43f9447"/>
     <w:p>
       <w:pPr>
         <w:pStyle w:val="Heading4"/>
@@ -13042,7 +13315,7 @@
         <w:pStyle w:val="Compact"/>
         <w:numPr>
           <w:ilvl w:val="0"/>
-          <w:numId w:val="1040"/>
+          <w:numId w:val="1041"/>
         </w:numPr>
       </w:pPr>
       <w:r>
@@ -13054,7 +13327,7 @@
         <w:pStyle w:val="Compact"/>
         <w:numPr>
           <w:ilvl w:val="0"/>
-          <w:numId w:val="1040"/>
+          <w:numId w:val="1041"/>
         </w:numPr>
       </w:pPr>
       <w:r>
@@ -13066,7 +13339,7 @@
         <w:pStyle w:val="Compact"/>
         <w:numPr>
           <w:ilvl w:val="0"/>
-          <w:numId w:val="1040"/>
+          <w:numId w:val="1041"/>
         </w:numPr>
       </w:pPr>
       <w:r>
@@ -13078,7 +13351,7 @@
         <w:pStyle w:val="Compact"/>
         <w:numPr>
           <w:ilvl w:val="0"/>
-          <w:numId w:val="1040"/>
+          <w:numId w:val="1041"/>
         </w:numPr>
       </w:pPr>
       <w:r>
@@ -13163,8 +13436,8 @@
         <w:t xml:space="preserve">your carefully-configured CI/CD pipeline.</w:t>
       </w:r>
     </w:p>
-    <w:bookmarkEnd w:id="172"/>
-    <w:bookmarkStart w:id="175" w:name="X609a80533191ba40baf6d2372d9b8d862b0620d"/>
+    <w:bookmarkEnd w:id="177"/>
+    <w:bookmarkStart w:id="180" w:name="X609a80533191ba40baf6d2372d9b8d862b0620d"/>
     <w:p>
       <w:pPr>
         <w:pStyle w:val="Heading4"/>
@@ -13238,7 +13511,7 @@
         <w:pStyle w:val="Compact"/>
         <w:numPr>
           <w:ilvl w:val="0"/>
-          <w:numId w:val="1041"/>
+          <w:numId w:val="1042"/>
         </w:numPr>
       </w:pPr>
       <w:r>
@@ -13250,7 +13523,7 @@
         <w:pStyle w:val="Compact"/>
         <w:numPr>
           <w:ilvl w:val="0"/>
-          <w:numId w:val="1041"/>
+          <w:numId w:val="1042"/>
         </w:numPr>
       </w:pPr>
       <w:r>
@@ -13262,7 +13535,7 @@
         <w:pStyle w:val="Compact"/>
         <w:numPr>
           <w:ilvl w:val="0"/>
-          <w:numId w:val="1041"/>
+          <w:numId w:val="1042"/>
         </w:numPr>
       </w:pPr>
       <w:r>
@@ -13334,12 +13607,12 @@
                 <wp:inline>
                   <wp:extent cx="152400" cy="152400"/>
                   <wp:effectExtent b="0" l="0" r="0" t="0"/>
-                  <wp:docPr descr="" title="" id="173" name="Picture"/>
+                  <wp:docPr descr="" title="" id="178" name="Picture"/>
                   <a:graphic>
                     <a:graphicData uri="http://schemas.openxmlformats.org/drawingml/2006/picture">
                       <pic:pic>
                         <pic:nvPicPr>
-                          <pic:cNvPr descr="/opt/quarto/share/formats/docx/warning.png" id="174" name="Picture"/>
+                          <pic:cNvPr descr="/opt/quarto/share/formats/docx/warning.png" id="179" name="Picture"/>
                           <pic:cNvPicPr>
                             <a:picLocks noChangeArrowheads="1" noChangeAspect="1"/>
                           </pic:cNvPicPr>
@@ -13428,7 +13701,7 @@
               <w:pStyle w:val="Compact"/>
               <w:numPr>
                 <w:ilvl w:val="0"/>
-                <w:numId w:val="1042"/>
+                <w:numId w:val="1043"/>
               </w:numPr>
             </w:pPr>
             <w:r>
@@ -13450,7 +13723,7 @@
               <w:pStyle w:val="Compact"/>
               <w:numPr>
                 <w:ilvl w:val="0"/>
-                <w:numId w:val="1042"/>
+                <w:numId w:val="1043"/>
               </w:numPr>
             </w:pPr>
             <w:r>
@@ -13472,7 +13745,7 @@
               <w:pStyle w:val="Compact"/>
               <w:numPr>
                 <w:ilvl w:val="0"/>
-                <w:numId w:val="1042"/>
+                <w:numId w:val="1043"/>
               </w:numPr>
             </w:pPr>
             <w:r>
@@ -13494,7 +13767,7 @@
               <w:pStyle w:val="Compact"/>
               <w:numPr>
                 <w:ilvl w:val="0"/>
-                <w:numId w:val="1042"/>
+                <w:numId w:val="1043"/>
               </w:numPr>
             </w:pPr>
             <w:r>
@@ -13529,7 +13802,7 @@
                 <w:rPr>
                   <w:rStyle w:val="Hyperlink"/>
                 </w:rPr>
-                <w:t xml:space="preserve">Section 17</w:t>
+                <w:t xml:space="preserve">Section 18</w:t>
               </w:r>
             </w:hyperlink>
             <w:r>
@@ -13586,7 +13859,7 @@
           <w:rPr>
             <w:rStyle w:val="Hyperlink"/>
           </w:rPr>
-          <w:t xml:space="preserve">Section 9</w:t>
+          <w:t xml:space="preserve">Section 10</w:t>
         </w:r>
       </w:hyperlink>
       <w:r>
@@ -13596,8 +13869,8 @@
         <w:t xml:space="preserve">for more guidance.</w:t>
       </w:r>
     </w:p>
-    <w:bookmarkEnd w:id="175"/>
-    <w:bookmarkStart w:id="176" w:name="X73d86ac2fd20fdb79b2a5c7f2662f883788810e"/>
+    <w:bookmarkEnd w:id="180"/>
+    <w:bookmarkStart w:id="181" w:name="X73d86ac2fd20fdb79b2a5c7f2662f883788810e"/>
     <w:p>
       <w:pPr>
         <w:pStyle w:val="Heading4"/>
@@ -13647,7 +13920,7 @@
         <w:pStyle w:val="Compact"/>
         <w:numPr>
           <w:ilvl w:val="0"/>
-          <w:numId w:val="1043"/>
+          <w:numId w:val="1044"/>
         </w:numPr>
       </w:pPr>
       <w:r>
@@ -13666,55 +13939,55 @@
         <w:pStyle w:val="Compact"/>
         <w:numPr>
           <w:ilvl w:val="1"/>
+          <w:numId w:val="1045"/>
+        </w:numPr>
+      </w:pPr>
+      <w:r>
+        <w:t xml:space="preserve">Look at the error messages in the GitHub Actions tab</w:t>
+      </w:r>
+    </w:p>
+    <w:p>
+      <w:pPr>
+        <w:pStyle w:val="Compact"/>
+        <w:numPr>
+          <w:ilvl w:val="1"/>
+          <w:numId w:val="1045"/>
+        </w:numPr>
+      </w:pPr>
+      <w:r>
+        <w:t xml:space="preserve">Identify whether the error is in your code or the workflow itself</w:t>
+      </w:r>
+    </w:p>
+    <w:p>
+      <w:pPr>
+        <w:pStyle w:val="Compact"/>
+        <w:numPr>
+          <w:ilvl w:val="1"/>
+          <w:numId w:val="1045"/>
+        </w:numPr>
+      </w:pPr>
+      <w:r>
+        <w:t xml:space="preserve">Common code issues: test failures, linting errors, compilation errors</w:t>
+      </w:r>
+    </w:p>
+    <w:p>
+      <w:pPr>
+        <w:pStyle w:val="Compact"/>
+        <w:numPr>
+          <w:ilvl w:val="1"/>
+          <w:numId w:val="1045"/>
+        </w:numPr>
+      </w:pPr>
+      <w:r>
+        <w:t xml:space="preserve">Common workflow issues: YAML syntax errors, missing actions, permission errors</w:t>
+      </w:r>
+    </w:p>
+    <w:p>
+      <w:pPr>
+        <w:pStyle w:val="Compact"/>
+        <w:numPr>
+          <w:ilvl w:val="0"/>
           <w:numId w:val="1044"/>
-        </w:numPr>
-      </w:pPr>
-      <w:r>
-        <w:t xml:space="preserve">Look at the error messages in the GitHub Actions tab</w:t>
-      </w:r>
-    </w:p>
-    <w:p>
-      <w:pPr>
-        <w:pStyle w:val="Compact"/>
-        <w:numPr>
-          <w:ilvl w:val="1"/>
-          <w:numId w:val="1044"/>
-        </w:numPr>
-      </w:pPr>
-      <w:r>
-        <w:t xml:space="preserve">Identify whether the error is in your code or the workflow itself</w:t>
-      </w:r>
-    </w:p>
-    <w:p>
-      <w:pPr>
-        <w:pStyle w:val="Compact"/>
-        <w:numPr>
-          <w:ilvl w:val="1"/>
-          <w:numId w:val="1044"/>
-        </w:numPr>
-      </w:pPr>
-      <w:r>
-        <w:t xml:space="preserve">Common code issues: test failures, linting errors, compilation errors</w:t>
-      </w:r>
-    </w:p>
-    <w:p>
-      <w:pPr>
-        <w:pStyle w:val="Compact"/>
-        <w:numPr>
-          <w:ilvl w:val="1"/>
-          <w:numId w:val="1044"/>
-        </w:numPr>
-      </w:pPr>
-      <w:r>
-        <w:t xml:space="preserve">Common workflow issues: YAML syntax errors, missing actions, permission errors</w:t>
-      </w:r>
-    </w:p>
-    <w:p>
-      <w:pPr>
-        <w:pStyle w:val="Compact"/>
-        <w:numPr>
-          <w:ilvl w:val="0"/>
-          <w:numId w:val="1043"/>
         </w:numPr>
       </w:pPr>
       <w:r>
@@ -13733,7 +14006,7 @@
         <w:pStyle w:val="Compact"/>
         <w:numPr>
           <w:ilvl w:val="1"/>
-          <w:numId w:val="1045"/>
+          <w:numId w:val="1046"/>
         </w:numPr>
       </w:pPr>
       <w:r>
@@ -13745,7 +14018,7 @@
         <w:pStyle w:val="Compact"/>
         <w:numPr>
           <w:ilvl w:val="1"/>
-          <w:numId w:val="1045"/>
+          <w:numId w:val="1046"/>
         </w:numPr>
       </w:pPr>
       <w:r>
@@ -13757,7 +14030,7 @@
         <w:pStyle w:val="Compact"/>
         <w:numPr>
           <w:ilvl w:val="0"/>
-          <w:numId w:val="1043"/>
+          <w:numId w:val="1044"/>
         </w:numPr>
       </w:pPr>
       <w:r>
@@ -13833,8 +14106,8 @@
         <w:t xml:space="preserve">3. Prompt: "fix the linting errors in src/analysis.R"</w:t>
       </w:r>
     </w:p>
-    <w:bookmarkEnd w:id="176"/>
-    <w:bookmarkStart w:id="179" w:name="additional-resources"/>
+    <w:bookmarkEnd w:id="181"/>
+    <w:bookmarkStart w:id="184" w:name="additional-resources"/>
     <w:p>
       <w:pPr>
         <w:pStyle w:val="Heading4"/>
@@ -13848,7 +14121,7 @@
         <w:pStyle w:val="Compact"/>
         <w:numPr>
           <w:ilvl w:val="0"/>
-          <w:numId w:val="1046"/>
+          <w:numId w:val="1047"/>
         </w:numPr>
       </w:pPr>
       <w:r>
@@ -13857,7 +14130,7 @@
       <w:r>
         <w:t xml:space="preserve"> </w:t>
       </w:r>
-      <w:hyperlink r:id="rId177">
+      <w:hyperlink r:id="rId182">
         <w:r>
           <w:rPr>
             <w:rStyle w:val="Hyperlink"/>
@@ -13877,7 +14150,7 @@
         <w:pStyle w:val="Compact"/>
         <w:numPr>
           <w:ilvl w:val="0"/>
-          <w:numId w:val="1046"/>
+          <w:numId w:val="1047"/>
         </w:numPr>
       </w:pPr>
       <w:r>
@@ -13887,6 +14160,23 @@
         <w:t xml:space="preserve"> </w:t>
       </w:r>
       <w:hyperlink w:anchor="sec-ai-best-practices">
+        <w:r>
+          <w:rPr>
+            <w:rStyle w:val="Hyperlink"/>
+          </w:rPr>
+          <w:t xml:space="preserve">Section 18</w:t>
+        </w:r>
+      </w:hyperlink>
+      <w:r>
+        <w:t xml:space="preserve"> </w:t>
+      </w:r>
+      <w:r>
+        <w:t xml:space="preserve">and</w:t>
+      </w:r>
+      <w:r>
+        <w:t xml:space="preserve"> </w:t>
+      </w:r>
+      <w:hyperlink w:anchor="sec-ai-benefits-hazards">
         <w:r>
           <w:rPr>
             <w:rStyle w:val="Hyperlink"/>
@@ -13898,23 +14188,6 @@
         <w:t xml:space="preserve"> </w:t>
       </w:r>
       <w:r>
-        <w:t xml:space="preserve">and</w:t>
-      </w:r>
-      <w:r>
-        <w:t xml:space="preserve"> </w:t>
-      </w:r>
-      <w:hyperlink w:anchor="sec-ai-benefits-hazards">
-        <w:r>
-          <w:rPr>
-            <w:rStyle w:val="Hyperlink"/>
-          </w:rPr>
-          <w:t xml:space="preserve">Section 16</w:t>
-        </w:r>
-      </w:hyperlink>
-      <w:r>
-        <w:t xml:space="preserve"> </w:t>
-      </w:r>
-      <w:r>
         <w:t xml:space="preserve">for security considerations with workflow files</w:t>
       </w:r>
     </w:p>
@@ -13923,7 +14196,7 @@
         <w:pStyle w:val="Compact"/>
         <w:numPr>
           <w:ilvl w:val="0"/>
-          <w:numId w:val="1046"/>
+          <w:numId w:val="1047"/>
         </w:numPr>
       </w:pPr>
       <w:r>
@@ -13937,7 +14210,7 @@
           <w:rPr>
             <w:rStyle w:val="Hyperlink"/>
           </w:rPr>
-          <w:t xml:space="preserve">Section 9</w:t>
+          <w:t xml:space="preserve">Section 10</w:t>
         </w:r>
       </w:hyperlink>
       <w:r>
@@ -13952,7 +14225,7 @@
         <w:pStyle w:val="Compact"/>
         <w:numPr>
           <w:ilvl w:val="0"/>
-          <w:numId w:val="1046"/>
+          <w:numId w:val="1047"/>
         </w:numPr>
       </w:pPr>
       <w:r>
@@ -13961,7 +14234,7 @@
       <w:r>
         <w:t xml:space="preserve"> </w:t>
       </w:r>
-      <w:hyperlink r:id="rId178">
+      <w:hyperlink r:id="rId183">
         <w:r>
           <w:rPr>
             <w:rStyle w:val="Hyperlink"/>
@@ -13976,15 +14249,15 @@
         <w:t xml:space="preserve">for workflow syntax and troubleshooting</w:t>
       </w:r>
     </w:p>
-    <w:bookmarkEnd w:id="179"/>
-    <w:bookmarkEnd w:id="180"/>
-    <w:bookmarkStart w:id="186" w:name="sec-ai-benefits-hazards"/>
+    <w:bookmarkEnd w:id="184"/>
+    <w:bookmarkEnd w:id="185"/>
+    <w:bookmarkStart w:id="191" w:name="sec-ai-benefits-hazards"/>
     <w:p>
       <w:pPr>
         <w:pStyle w:val="Heading1"/>
       </w:pPr>
       <w:r>
-        <w:t xml:space="preserve">16. Benefits and Hazards</w:t>
+        <w:t xml:space="preserve">17. Benefits and Hazards</w:t>
       </w:r>
     </w:p>
     <w:p>
@@ -14037,7 +14310,7 @@
       <w:pPr>
         <w:numPr>
           <w:ilvl w:val="0"/>
-          <w:numId w:val="1047"/>
+          <w:numId w:val="1048"/>
         </w:numPr>
       </w:pPr>
       <w:r>
@@ -14061,7 +14334,7 @@
       <w:pPr>
         <w:numPr>
           <w:ilvl w:val="0"/>
-          <w:numId w:val="1047"/>
+          <w:numId w:val="1048"/>
         </w:numPr>
       </w:pPr>
       <w:r>
@@ -14085,7 +14358,7 @@
       <w:pPr>
         <w:numPr>
           <w:ilvl w:val="0"/>
-          <w:numId w:val="1047"/>
+          <w:numId w:val="1048"/>
         </w:numPr>
       </w:pPr>
       <w:r>
@@ -14109,7 +14382,7 @@
       <w:pPr>
         <w:numPr>
           <w:ilvl w:val="0"/>
-          <w:numId w:val="1047"/>
+          <w:numId w:val="1048"/>
         </w:numPr>
       </w:pPr>
       <w:r>
@@ -14133,7 +14406,7 @@
       <w:pPr>
         <w:numPr>
           <w:ilvl w:val="0"/>
-          <w:numId w:val="1047"/>
+          <w:numId w:val="1048"/>
         </w:numPr>
       </w:pPr>
       <w:r>
@@ -14157,7 +14430,7 @@
       <w:pPr>
         <w:numPr>
           <w:ilvl w:val="0"/>
-          <w:numId w:val="1047"/>
+          <w:numId w:val="1048"/>
         </w:numPr>
       </w:pPr>
       <w:r>
@@ -14189,7 +14462,7 @@
       <w:pPr>
         <w:numPr>
           <w:ilvl w:val="0"/>
-          <w:numId w:val="1048"/>
+          <w:numId w:val="1049"/>
         </w:numPr>
       </w:pPr>
       <w:r>
@@ -14213,7 +14486,7 @@
       <w:pPr>
         <w:numPr>
           <w:ilvl w:val="0"/>
-          <w:numId w:val="1048"/>
+          <w:numId w:val="1049"/>
         </w:numPr>
       </w:pPr>
       <w:r>
@@ -14237,7 +14510,7 @@
       <w:pPr>
         <w:numPr>
           <w:ilvl w:val="0"/>
-          <w:numId w:val="1048"/>
+          <w:numId w:val="1049"/>
         </w:numPr>
       </w:pPr>
       <w:r>
@@ -14261,7 +14534,7 @@
       <w:pPr>
         <w:numPr>
           <w:ilvl w:val="0"/>
-          <w:numId w:val="1048"/>
+          <w:numId w:val="1049"/>
         </w:numPr>
       </w:pPr>
       <w:r>
@@ -14285,7 +14558,7 @@
       <w:pPr>
         <w:numPr>
           <w:ilvl w:val="0"/>
-          <w:numId w:val="1048"/>
+          <w:numId w:val="1049"/>
         </w:numPr>
       </w:pPr>
       <w:r>
@@ -14309,7 +14582,7 @@
       <w:pPr>
         <w:numPr>
           <w:ilvl w:val="0"/>
-          <w:numId w:val="1048"/>
+          <w:numId w:val="1049"/>
         </w:numPr>
       </w:pPr>
       <w:r>
@@ -14333,7 +14606,7 @@
       <w:pPr>
         <w:numPr>
           <w:ilvl w:val="0"/>
-          <w:numId w:val="1048"/>
+          <w:numId w:val="1049"/>
         </w:numPr>
       </w:pPr>
       <w:r>
@@ -14362,7 +14635,7 @@
         <w:t xml:space="preserve">) or setup configurations can inadvertently or maliciously compromise repository security, expose secrets, or execute harmful commands</w:t>
       </w:r>
     </w:p>
-    <w:bookmarkStart w:id="185" w:name="further-readingviewing"/>
+    <w:bookmarkStart w:id="190" w:name="further-readingviewing"/>
     <w:p>
       <w:pPr>
         <w:pStyle w:val="Heading4"/>
@@ -14376,7 +14649,7 @@
         <w:pStyle w:val="Compact"/>
         <w:numPr>
           <w:ilvl w:val="0"/>
-          <w:numId w:val="1049"/>
+          <w:numId w:val="1050"/>
         </w:numPr>
       </w:pPr>
       <w:r>
@@ -14398,7 +14671,7 @@
         <w:pStyle w:val="Compact"/>
         <w:numPr>
           <w:ilvl w:val="0"/>
-          <w:numId w:val="1049"/>
+          <w:numId w:val="1050"/>
         </w:numPr>
       </w:pPr>
       <w:r>
@@ -14420,7 +14693,7 @@
         <w:pStyle w:val="Compact"/>
         <w:numPr>
           <w:ilvl w:val="0"/>
-          <w:numId w:val="1049"/>
+          <w:numId w:val="1050"/>
         </w:numPr>
       </w:pPr>
       <w:r>
@@ -14442,7 +14715,7 @@
         <w:pStyle w:val="Compact"/>
         <w:numPr>
           <w:ilvl w:val="0"/>
-          <w:numId w:val="1049"/>
+          <w:numId w:val="1050"/>
         </w:numPr>
       </w:pPr>
       <w:r>
@@ -14464,7 +14737,7 @@
         <w:pStyle w:val="Compact"/>
         <w:numPr>
           <w:ilvl w:val="0"/>
-          <w:numId w:val="1049"/>
+          <w:numId w:val="1050"/>
         </w:numPr>
       </w:pPr>
       <w:r>
@@ -14486,7 +14759,7 @@
         <w:pStyle w:val="Compact"/>
         <w:numPr>
           <w:ilvl w:val="0"/>
-          <w:numId w:val="1049"/>
+          <w:numId w:val="1050"/>
         </w:numPr>
       </w:pPr>
       <w:r>
@@ -14508,7 +14781,7 @@
         <w:pStyle w:val="Compact"/>
         <w:numPr>
           <w:ilvl w:val="0"/>
-          <w:numId w:val="1049"/>
+          <w:numId w:val="1050"/>
         </w:numPr>
       </w:pPr>
       <w:r>
@@ -14530,7 +14803,7 @@
         <w:pStyle w:val="Compact"/>
         <w:numPr>
           <w:ilvl w:val="0"/>
-          <w:numId w:val="1049"/>
+          <w:numId w:val="1050"/>
         </w:numPr>
       </w:pPr>
       <w:r>
@@ -14571,7 +14844,7 @@
         <w:pStyle w:val="Compact"/>
         <w:numPr>
           <w:ilvl w:val="0"/>
-          <w:numId w:val="1049"/>
+          <w:numId w:val="1050"/>
         </w:numPr>
       </w:pPr>
       <w:r>
@@ -14593,7 +14866,7 @@
         <w:pStyle w:val="Compact"/>
         <w:numPr>
           <w:ilvl w:val="0"/>
-          <w:numId w:val="1049"/>
+          <w:numId w:val="1050"/>
         </w:numPr>
       </w:pPr>
       <w:r>
@@ -14615,18 +14888,18 @@
           <wp:inline>
             <wp:extent cx="5334000" cy="2224278"/>
             <wp:effectExtent b="0" l="0" r="0" t="0"/>
-            <wp:docPr descr="Agents" title="" id="182" name="Picture"/>
+            <wp:docPr descr="Agents" title="" id="187" name="Picture"/>
             <a:graphic>
               <a:graphicData uri="http://schemas.openxmlformats.org/drawingml/2006/picture">
                 <pic:pic>
                   <pic:nvPicPr>
-                    <pic:cNvPr descr="assets/images/matrix-agents.png" id="183" name="Picture"/>
+                    <pic:cNvPr descr="assets/images/matrix-agents.png" id="188" name="Picture"/>
                     <pic:cNvPicPr>
                       <a:picLocks noChangeArrowheads="1" noChangeAspect="1"/>
                     </pic:cNvPicPr>
                   </pic:nvPicPr>
                   <pic:blipFill>
-                    <a:blip r:embed="rId181"/>
+                    <a:blip r:embed="rId186"/>
                     <a:stretch>
                       <a:fillRect/>
                     </a:stretch>
@@ -14657,7 +14930,7 @@
       <w:pPr>
         <w:pStyle w:val="ImageCaption"/>
       </w:pPr>
-      <w:hyperlink r:id="rId184">
+      <w:hyperlink r:id="rId189">
         <w:r>
           <w:rPr>
             <w:rStyle w:val="Hyperlink"/>
@@ -14666,15 +14939,15 @@
         </w:r>
       </w:hyperlink>
     </w:p>
-    <w:bookmarkEnd w:id="185"/>
-    <w:bookmarkEnd w:id="186"/>
-    <w:bookmarkStart w:id="193" w:name="sec-ai-best-practices"/>
+    <w:bookmarkEnd w:id="190"/>
+    <w:bookmarkEnd w:id="191"/>
+    <w:bookmarkStart w:id="198" w:name="sec-ai-best-practices"/>
     <w:p>
       <w:pPr>
         <w:pStyle w:val="Heading1"/>
       </w:pPr>
       <w:r>
-        <w:t xml:space="preserve">17. Best Practices for Safe and Successful Use</w:t>
+        <w:t xml:space="preserve">18. Best Practices for Safe and Successful Use</w:t>
       </w:r>
     </w:p>
     <w:p>
@@ -14689,7 +14962,7 @@
       <w:pPr>
         <w:numPr>
           <w:ilvl w:val="0"/>
-          <w:numId w:val="1050"/>
+          <w:numId w:val="1051"/>
         </w:numPr>
       </w:pPr>
       <w:r>
@@ -14719,7 +14992,7 @@
       <w:pPr>
         <w:numPr>
           <w:ilvl w:val="0"/>
-          <w:numId w:val="1050"/>
+          <w:numId w:val="1051"/>
         </w:numPr>
       </w:pPr>
       <w:r>
@@ -14755,7 +15028,7 @@
       <w:pPr>
         <w:numPr>
           <w:ilvl w:val="0"/>
-          <w:numId w:val="1050"/>
+          <w:numId w:val="1051"/>
         </w:numPr>
       </w:pPr>
       <w:r>
@@ -14864,7 +15137,7 @@
       <w:pPr>
         <w:numPr>
           <w:ilvl w:val="0"/>
-          <w:numId w:val="1050"/>
+          <w:numId w:val="1051"/>
         </w:numPr>
       </w:pPr>
       <w:r>
@@ -14900,7 +15173,7 @@
       <w:pPr>
         <w:numPr>
           <w:ilvl w:val="0"/>
-          <w:numId w:val="1050"/>
+          <w:numId w:val="1051"/>
         </w:numPr>
       </w:pPr>
       <w:r>
@@ -14942,7 +15215,7 @@
       <w:pPr>
         <w:numPr>
           <w:ilvl w:val="0"/>
-          <w:numId w:val="1050"/>
+          <w:numId w:val="1051"/>
         </w:numPr>
       </w:pPr>
       <w:r>
@@ -14972,7 +15245,7 @@
       <w:pPr>
         <w:numPr>
           <w:ilvl w:val="0"/>
-          <w:numId w:val="1050"/>
+          <w:numId w:val="1051"/>
         </w:numPr>
       </w:pPr>
       <w:r>
@@ -15008,7 +15281,7 @@
       <w:pPr>
         <w:numPr>
           <w:ilvl w:val="0"/>
-          <w:numId w:val="1050"/>
+          <w:numId w:val="1051"/>
         </w:numPr>
       </w:pPr>
       <w:r>
@@ -15075,18 +15348,18 @@
                 <wp:inline>
                   <wp:extent cx="152400" cy="152400"/>
                   <wp:effectExtent b="0" l="0" r="0" t="0"/>
-                  <wp:docPr descr="" title="" id="188" name="Picture"/>
+                  <wp:docPr descr="" title="" id="193" name="Picture"/>
                   <a:graphic>
                     <a:graphicData uri="http://schemas.openxmlformats.org/drawingml/2006/picture">
                       <pic:pic>
                         <pic:nvPicPr>
-                          <pic:cNvPr descr="/opt/quarto/share/formats/docx/note.png" id="189" name="Picture"/>
+                          <pic:cNvPr descr="/opt/quarto/share/formats/docx/note.png" id="194" name="Picture"/>
                           <pic:cNvPicPr>
                             <a:picLocks noChangeArrowheads="1" noChangeAspect="1"/>
                           </pic:cNvPicPr>
                         </pic:nvPicPr>
                         <pic:blipFill>
-                          <a:blip r:embed="rId187"/>
+                          <a:blip r:embed="rId192"/>
                           <a:stretch>
                             <a:fillRect/>
                           </a:stretch>
@@ -15148,7 +15421,7 @@
             <w:r>
               <w:t xml:space="preserve"> </w:t>
             </w:r>
-            <w:hyperlink r:id="rId190">
+            <w:hyperlink r:id="rId195">
               <w:r>
                 <w:rPr>
                   <w:rStyle w:val="Hyperlink"/>
@@ -15255,12 +15528,12 @@
                 <wp:inline>
                   <wp:extent cx="152400" cy="152400"/>
                   <wp:effectExtent b="0" l="0" r="0" t="0"/>
-                  <wp:docPr descr="" title="" id="191" name="Picture"/>
+                  <wp:docPr descr="" title="" id="196" name="Picture"/>
                   <a:graphic>
                     <a:graphicData uri="http://schemas.openxmlformats.org/drawingml/2006/picture">
                       <pic:pic>
                         <pic:nvPicPr>
-                          <pic:cNvPr descr="/opt/quarto/share/formats/docx/warning.png" id="192" name="Picture"/>
+                          <pic:cNvPr descr="/opt/quarto/share/formats/docx/warning.png" id="197" name="Picture"/>
                           <pic:cNvPicPr>
                             <a:picLocks noChangeArrowheads="1" noChangeAspect="1"/>
                           </pic:cNvPicPr>
@@ -15343,7 +15616,7 @@
               <w:pStyle w:val="Compact"/>
               <w:numPr>
                 <w:ilvl w:val="0"/>
-                <w:numId w:val="1051"/>
+                <w:numId w:val="1052"/>
               </w:numPr>
             </w:pPr>
             <w:r>
@@ -15355,7 +15628,7 @@
               <w:pStyle w:val="Compact"/>
               <w:numPr>
                 <w:ilvl w:val="0"/>
-                <w:numId w:val="1051"/>
+                <w:numId w:val="1052"/>
               </w:numPr>
             </w:pPr>
             <w:r>
@@ -15367,7 +15640,7 @@
               <w:pStyle w:val="Compact"/>
               <w:numPr>
                 <w:ilvl w:val="0"/>
-                <w:numId w:val="1051"/>
+                <w:numId w:val="1052"/>
               </w:numPr>
             </w:pPr>
             <w:r>
@@ -15532,14 +15805,14 @@
         <w:t xml:space="preserve">The quality and correctness of your work remains your responsibility.</w:t>
       </w:r>
     </w:p>
-    <w:bookmarkEnd w:id="193"/>
-    <w:bookmarkStart w:id="207" w:name="sec-ai-citadel-and-maturity-levels"/>
+    <w:bookmarkEnd w:id="198"/>
+    <w:bookmarkStart w:id="212" w:name="sec-ai-citadel-and-maturity-levels"/>
     <w:p>
       <w:pPr>
         <w:pStyle w:val="Heading1"/>
       </w:pPr>
       <w:r>
-        <w:t xml:space="preserve">18. Citadel and Levels of Claude Code Use</w:t>
+        <w:t xml:space="preserve">19. Citadel and Levels of Claude Code Use</w:t>
       </w:r>
     </w:p>
     <w:p>
@@ -15564,7 +15837,7 @@
       <w:r>
         <w:t xml:space="preserve"> </w:t>
       </w:r>
-      <w:hyperlink r:id="rId194">
+      <w:hyperlink r:id="rId199">
         <w:r>
           <w:rPr>
             <w:rStyle w:val="Hyperlink"/>
@@ -15623,7 +15896,7 @@
       <w:r>
         <w:t xml:space="preserve"> </w:t>
       </w:r>
-      <w:hyperlink r:id="rId195">
+      <w:hyperlink r:id="rId200">
         <w:r>
           <w:rPr>
             <w:rStyle w:val="Hyperlink"/>
@@ -15667,7 +15940,7 @@
       <w:r>
         <w:t xml:space="preserve"> </w:t>
       </w:r>
-      <w:hyperlink r:id="rId196">
+      <w:hyperlink r:id="rId201">
         <w:r>
           <w:rPr>
             <w:rStyle w:val="Hyperlink"/>
@@ -15723,7 +15996,7 @@
       <w:r>
         <w:t xml:space="preserve"> </w:t>
       </w:r>
-      <w:hyperlink r:id="rId197">
+      <w:hyperlink r:id="rId202">
         <w:r>
           <w:rPr>
             <w:rStyle w:val="Hyperlink"/>
@@ -15741,7 +16014,7 @@
         <w:t xml:space="preserve">and the ladder discussed here is Citadel’s own.</w:t>
       </w:r>
     </w:p>
-    <w:bookmarkStart w:id="199" w:name="what-citadel-is"/>
+    <w:bookmarkStart w:id="204" w:name="what-citadel-is"/>
     <w:p>
       <w:pPr>
         <w:pStyle w:val="Heading4"/>
@@ -15757,7 +16030,7 @@
       <w:r>
         <w:t xml:space="preserve">Citadel is a plugin, not a harness (</w:t>
       </w:r>
-      <w:hyperlink r:id="rId198">
+      <w:hyperlink r:id="rId203">
         <w:r>
           <w:rPr>
             <w:rStyle w:val="Hyperlink"/>
@@ -15801,7 +16074,7 @@
         <w:pStyle w:val="Compact"/>
         <w:numPr>
           <w:ilvl w:val="0"/>
-          <w:numId w:val="1052"/>
+          <w:numId w:val="1053"/>
         </w:numPr>
       </w:pPr>
       <w:r>
@@ -15825,7 +16098,7 @@
         <w:pStyle w:val="Compact"/>
         <w:numPr>
           <w:ilvl w:val="0"/>
-          <w:numId w:val="1052"/>
+          <w:numId w:val="1053"/>
         </w:numPr>
       </w:pPr>
       <w:r>
@@ -15852,7 +16125,7 @@
         <w:pStyle w:val="Compact"/>
         <w:numPr>
           <w:ilvl w:val="0"/>
-          <w:numId w:val="1052"/>
+          <w:numId w:val="1053"/>
         </w:numPr>
       </w:pPr>
       <w:r>
@@ -15864,7 +16137,7 @@
         <w:pStyle w:val="Compact"/>
         <w:numPr>
           <w:ilvl w:val="0"/>
-          <w:numId w:val="1052"/>
+          <w:numId w:val="1053"/>
         </w:numPr>
       </w:pPr>
       <w:r>
@@ -16060,8 +16333,8 @@
         <w:t xml:space="preserve">so that a session ending is not the same as the work being lost.</w:t>
       </w:r>
     </w:p>
-    <w:bookmarkEnd w:id="199"/>
-    <w:bookmarkStart w:id="202" w:name="the-orchestration-ladder"/>
+    <w:bookmarkEnd w:id="204"/>
+    <w:bookmarkStart w:id="207" w:name="the-orchestration-ladder"/>
     <w:p>
       <w:pPr>
         <w:pStyle w:val="Heading4"/>
@@ -16109,7 +16382,7 @@
       <w:tr>
         <w:tc>
           <w:tcPr/>
-          <w:bookmarkStart w:id="200" w:name="tbl-citadel-ladder"/>
+          <w:bookmarkStart w:id="205" w:name="tbl-citadel-ladder"/>
           <w:p>
             <w:pPr>
               <w:jc w:val="center"/>
@@ -16451,7 +16724,7 @@
               </w:tc>
             </w:tr>
           </w:tbl>
-          <w:bookmarkEnd w:id="200"/>
+          <w:bookmarkEnd w:id="205"/>
           <w:p/>
         </w:tc>
       </w:tr>
@@ -16481,7 +16754,7 @@
       <w:r>
         <w:t xml:space="preserve"> </w:t>
       </w:r>
-      <w:hyperlink r:id="rId201">
+      <w:hyperlink r:id="rId206">
         <w:r>
           <w:rPr>
             <w:rStyle w:val="Hyperlink"/>
@@ -16609,8 +16882,8 @@
         <w:t xml:space="preserve">without bypassing the approval or verification boundaries.</w:t>
       </w:r>
     </w:p>
-    <w:bookmarkEnd w:id="202"/>
-    <w:bookmarkStart w:id="203" w:name="enforcement-and-evidence"/>
+    <w:bookmarkEnd w:id="207"/>
+    <w:bookmarkStart w:id="208" w:name="enforcement-and-evidence"/>
     <w:p>
       <w:pPr>
         <w:pStyle w:val="Heading4"/>
@@ -16635,7 +16908,7 @@
       <w:r>
         <w:t xml:space="preserve"> </w:t>
       </w:r>
-      <w:hyperlink r:id="rId194">
+      <w:hyperlink r:id="rId199">
         <w:r>
           <w:rPr>
             <w:rStyle w:val="Hyperlink"/>
@@ -16676,7 +16949,7 @@
         <w:pStyle w:val="Compact"/>
         <w:numPr>
           <w:ilvl w:val="0"/>
-          <w:numId w:val="1053"/>
+          <w:numId w:val="1054"/>
         </w:numPr>
       </w:pPr>
       <w:r>
@@ -16740,7 +17013,7 @@
         <w:pStyle w:val="Compact"/>
         <w:numPr>
           <w:ilvl w:val="0"/>
-          <w:numId w:val="1053"/>
+          <w:numId w:val="1054"/>
         </w:numPr>
       </w:pPr>
       <w:r>
@@ -16786,7 +17059,7 @@
         <w:pStyle w:val="Compact"/>
         <w:numPr>
           <w:ilvl w:val="0"/>
-          <w:numId w:val="1053"/>
+          <w:numId w:val="1054"/>
         </w:numPr>
       </w:pPr>
       <w:r>
@@ -16854,7 +17127,7 @@
           <w:rPr>
             <w:rStyle w:val="Hyperlink"/>
           </w:rPr>
-          <w:t xml:space="preserve">Section 17</w:t>
+          <w:t xml:space="preserve">Section 18</w:t>
         </w:r>
       </w:hyperlink>
       <w:r>
@@ -16956,8 +17229,8 @@
         <w:t xml:space="preserve">.</w:t>
       </w:r>
     </w:p>
-    <w:bookmarkEnd w:id="203"/>
-    <w:bookmarkStart w:id="204" w:name="what-the-evidence-does-and-does-not-show"/>
+    <w:bookmarkEnd w:id="208"/>
+    <w:bookmarkStart w:id="209" w:name="what-the-evidence-does-and-does-not-show"/>
     <w:p>
       <w:pPr>
         <w:pStyle w:val="Heading4"/>
@@ -17126,8 +17399,8 @@
         <w:t xml:space="preserve">the case for Citadel is governance and recoverability, not throughput.</w:t>
       </w:r>
     </w:p>
-    <w:bookmarkEnd w:id="204"/>
-    <w:bookmarkStart w:id="206" w:name="X7982003934b1c259fb22776aa5f25094a8f76dc"/>
+    <w:bookmarkEnd w:id="209"/>
+    <w:bookmarkStart w:id="211" w:name="X7982003934b1c259fb22776aa5f25094a8f76dc"/>
     <w:p>
       <w:pPr>
         <w:pStyle w:val="Heading4"/>
@@ -17146,7 +17419,7 @@
       <w:r>
         <w:t xml:space="preserve"> </w:t>
       </w:r>
-      <w:hyperlink r:id="rId205">
+      <w:hyperlink r:id="rId210">
         <w:r>
           <w:rPr>
             <w:rStyle w:val="VerbatimChar"/>
@@ -17166,7 +17439,7 @@
       <w:r>
         <w:t xml:space="preserve"> </w:t>
       </w:r>
-      <w:hyperlink r:id="rId194">
+      <w:hyperlink r:id="rId199">
         <w:r>
           <w:rPr>
             <w:rStyle w:val="Hyperlink"/>
@@ -17204,7 +17477,7 @@
         <w:pStyle w:val="Compact"/>
         <w:numPr>
           <w:ilvl w:val="0"/>
-          <w:numId w:val="1054"/>
+          <w:numId w:val="1055"/>
         </w:numPr>
       </w:pPr>
       <w:r>
@@ -17216,7 +17489,7 @@
         <w:pStyle w:val="Compact"/>
         <w:numPr>
           <w:ilvl w:val="0"/>
-          <w:numId w:val="1054"/>
+          <w:numId w:val="1055"/>
         </w:numPr>
       </w:pPr>
       <w:r>
@@ -17267,7 +17540,7 @@
         <w:pStyle w:val="Compact"/>
         <w:numPr>
           <w:ilvl w:val="0"/>
-          <w:numId w:val="1054"/>
+          <w:numId w:val="1055"/>
         </w:numPr>
       </w:pPr>
       <w:r>
@@ -17279,7 +17552,7 @@
         <w:pStyle w:val="Compact"/>
         <w:numPr>
           <w:ilvl w:val="0"/>
-          <w:numId w:val="1054"/>
+          <w:numId w:val="1055"/>
         </w:numPr>
       </w:pPr>
       <w:r>
@@ -17300,7 +17573,7 @@
         <w:pStyle w:val="Compact"/>
         <w:numPr>
           <w:ilvl w:val="0"/>
-          <w:numId w:val="1054"/>
+          <w:numId w:val="1055"/>
         </w:numPr>
       </w:pPr>
       <w:r>
@@ -17340,7 +17613,7 @@
         <w:pStyle w:val="Compact"/>
         <w:numPr>
           <w:ilvl w:val="0"/>
-          <w:numId w:val="1055"/>
+          <w:numId w:val="1056"/>
         </w:numPr>
       </w:pPr>
       <w:r>
@@ -17374,7 +17647,7 @@
         <w:pStyle w:val="Compact"/>
         <w:numPr>
           <w:ilvl w:val="0"/>
-          <w:numId w:val="1055"/>
+          <w:numId w:val="1056"/>
         </w:numPr>
       </w:pPr>
       <w:r>
@@ -17414,7 +17687,7 @@
         <w:pStyle w:val="Compact"/>
         <w:numPr>
           <w:ilvl w:val="0"/>
-          <w:numId w:val="1055"/>
+          <w:numId w:val="1056"/>
         </w:numPr>
       </w:pPr>
       <w:r>
@@ -17466,7 +17739,7 @@
         <w:pStyle w:val="Compact"/>
         <w:numPr>
           <w:ilvl w:val="0"/>
-          <w:numId w:val="1055"/>
+          <w:numId w:val="1056"/>
         </w:numPr>
       </w:pPr>
       <w:r>
@@ -17596,7 +17869,7 @@
         <w:pStyle w:val="Compact"/>
         <w:numPr>
           <w:ilvl w:val="0"/>
-          <w:numId w:val="1056"/>
+          <w:numId w:val="1057"/>
         </w:numPr>
       </w:pPr>
       <w:r>
@@ -17648,7 +17921,7 @@
         <w:pStyle w:val="Compact"/>
         <w:numPr>
           <w:ilvl w:val="0"/>
-          <w:numId w:val="1056"/>
+          <w:numId w:val="1057"/>
         </w:numPr>
       </w:pPr>
       <w:r>
@@ -17697,7 +17970,7 @@
         <w:pStyle w:val="Compact"/>
         <w:numPr>
           <w:ilvl w:val="0"/>
-          <w:numId w:val="1056"/>
+          <w:numId w:val="1057"/>
         </w:numPr>
       </w:pPr>
       <w:r>
@@ -17722,7 +17995,7 @@
         <w:pStyle w:val="Compact"/>
         <w:numPr>
           <w:ilvl w:val="0"/>
-          <w:numId w:val="1056"/>
+          <w:numId w:val="1057"/>
         </w:numPr>
       </w:pPr>
       <w:r>
@@ -17812,15 +18085,15 @@
         <w:t xml:space="preserve">and published the answer either way.</w:t>
       </w:r>
     </w:p>
-    <w:bookmarkEnd w:id="206"/>
-    <w:bookmarkEnd w:id="207"/>
-    <w:bookmarkStart w:id="218" w:name="sec-ai-firewall"/>
+    <w:bookmarkEnd w:id="211"/>
+    <w:bookmarkEnd w:id="212"/>
+    <w:bookmarkStart w:id="223" w:name="sec-ai-firewall"/>
     <w:p>
       <w:pPr>
         <w:pStyle w:val="Heading1"/>
       </w:pPr>
       <w:r>
-        <w:t xml:space="preserve">19. Firewall and Network Configuration</w:t>
+        <w:t xml:space="preserve">20. Firewall and Network Configuration</w:t>
       </w:r>
     </w:p>
     <w:p>
@@ -17843,7 +18116,7 @@
         <w:t xml:space="preserve">you may need to configure allowlists to enable coding agent functionality.</w:t>
       </w:r>
     </w:p>
-    <w:bookmarkStart w:id="209" w:name="built-in-agent-firewall"/>
+    <w:bookmarkStart w:id="214" w:name="built-in-agent-firewall"/>
     <w:p>
       <w:pPr>
         <w:pStyle w:val="Heading4"/>
@@ -17877,7 +18150,7 @@
         <w:pStyle w:val="Compact"/>
         <w:numPr>
           <w:ilvl w:val="0"/>
-          <w:numId w:val="1057"/>
+          <w:numId w:val="1058"/>
         </w:numPr>
       </w:pPr>
       <w:r>
@@ -17889,7 +18162,7 @@
         <w:pStyle w:val="Compact"/>
         <w:numPr>
           <w:ilvl w:val="0"/>
-          <w:numId w:val="1057"/>
+          <w:numId w:val="1058"/>
         </w:numPr>
       </w:pPr>
       <w:r>
@@ -17901,7 +18174,7 @@
         <w:pStyle w:val="Compact"/>
         <w:numPr>
           <w:ilvl w:val="0"/>
-          <w:numId w:val="1057"/>
+          <w:numId w:val="1058"/>
         </w:numPr>
       </w:pPr>
       <w:r>
@@ -17921,7 +18194,7 @@
         <w:pStyle w:val="Compact"/>
         <w:numPr>
           <w:ilvl w:val="0"/>
-          <w:numId w:val="1058"/>
+          <w:numId w:val="1059"/>
         </w:numPr>
       </w:pPr>
       <w:r>
@@ -17933,7 +18206,7 @@
         <w:pStyle w:val="Compact"/>
         <w:numPr>
           <w:ilvl w:val="0"/>
-          <w:numId w:val="1058"/>
+          <w:numId w:val="1059"/>
         </w:numPr>
       </w:pPr>
       <w:r>
@@ -17945,7 +18218,7 @@
         <w:pStyle w:val="Compact"/>
         <w:numPr>
           <w:ilvl w:val="0"/>
-          <w:numId w:val="1058"/>
+          <w:numId w:val="1059"/>
         </w:numPr>
       </w:pPr>
       <w:r>
@@ -17957,7 +18230,7 @@
         <w:pStyle w:val="Compact"/>
         <w:numPr>
           <w:ilvl w:val="0"/>
-          <w:numId w:val="1058"/>
+          <w:numId w:val="1059"/>
         </w:numPr>
       </w:pPr>
       <w:r>
@@ -17980,7 +18253,7 @@
       <w:r>
         <w:t xml:space="preserve"> </w:t>
       </w:r>
-      <w:hyperlink r:id="rId208">
+      <w:hyperlink r:id="rId213">
         <w:r>
           <w:rPr>
             <w:rStyle w:val="Hyperlink"/>
@@ -17992,8 +18265,8 @@
         <w:t xml:space="preserve">.</w:t>
       </w:r>
     </w:p>
-    <w:bookmarkEnd w:id="209"/>
-    <w:bookmarkStart w:id="211" w:name="customizing-agent-firewall-settings"/>
+    <w:bookmarkEnd w:id="214"/>
+    <w:bookmarkStart w:id="216" w:name="customizing-agent-firewall-settings"/>
     <w:p>
       <w:pPr>
         <w:pStyle w:val="Heading4"/>
@@ -18033,7 +18306,7 @@
         <w:pStyle w:val="Compact"/>
         <w:numPr>
           <w:ilvl w:val="0"/>
-          <w:numId w:val="1059"/>
+          <w:numId w:val="1060"/>
         </w:numPr>
       </w:pPr>
       <w:r>
@@ -18045,7 +18318,7 @@
         <w:pStyle w:val="Compact"/>
         <w:numPr>
           <w:ilvl w:val="0"/>
-          <w:numId w:val="1059"/>
+          <w:numId w:val="1060"/>
         </w:numPr>
       </w:pPr>
       <w:r>
@@ -18057,7 +18330,7 @@
         <w:pStyle w:val="Compact"/>
         <w:numPr>
           <w:ilvl w:val="0"/>
-          <w:numId w:val="1059"/>
+          <w:numId w:val="1060"/>
         </w:numPr>
       </w:pPr>
       <w:r>
@@ -18100,7 +18373,7 @@
       <w:r>
         <w:t xml:space="preserve"> </w:t>
       </w:r>
-      <w:hyperlink r:id="rId210">
+      <w:hyperlink r:id="rId215">
         <w:r>
           <w:rPr>
             <w:rStyle w:val="Hyperlink"/>
@@ -18112,8 +18385,8 @@
         <w:t xml:space="preserve">.</w:t>
       </w:r>
     </w:p>
-    <w:bookmarkEnd w:id="211"/>
-    <w:bookmarkStart w:id="217" w:name="Xbbad9df60dbc05443efb3cae36c1e0daa9b491b"/>
+    <w:bookmarkEnd w:id="216"/>
+    <w:bookmarkStart w:id="222" w:name="Xbbad9df60dbc05443efb3cae36c1e0daa9b491b"/>
     <w:p>
       <w:pPr>
         <w:pStyle w:val="Heading4"/>
@@ -18171,7 +18444,7 @@
         <w:pStyle w:val="Compact"/>
         <w:numPr>
           <w:ilvl w:val="0"/>
-          <w:numId w:val="1060"/>
+          <w:numId w:val="1061"/>
         </w:numPr>
       </w:pPr>
       <w:r>
@@ -18207,7 +18480,7 @@
         <w:pStyle w:val="Compact"/>
         <w:numPr>
           <w:ilvl w:val="0"/>
-          <w:numId w:val="1060"/>
+          <w:numId w:val="1061"/>
         </w:numPr>
       </w:pPr>
       <w:r>
@@ -18261,7 +18534,7 @@
         <w:pStyle w:val="Compact"/>
         <w:numPr>
           <w:ilvl w:val="0"/>
-          <w:numId w:val="1060"/>
+          <w:numId w:val="1061"/>
         </w:numPr>
       </w:pPr>
       <w:r>
@@ -18297,7 +18570,7 @@
         <w:pStyle w:val="Compact"/>
         <w:numPr>
           <w:ilvl w:val="0"/>
-          <w:numId w:val="1060"/>
+          <w:numId w:val="1061"/>
         </w:numPr>
       </w:pPr>
       <w:r>
@@ -18333,7 +18606,7 @@
         <w:pStyle w:val="Compact"/>
         <w:numPr>
           <w:ilvl w:val="0"/>
-          <w:numId w:val="1060"/>
+          <w:numId w:val="1061"/>
         </w:numPr>
       </w:pPr>
       <w:r>
@@ -18369,7 +18642,7 @@
         <w:pStyle w:val="Compact"/>
         <w:numPr>
           <w:ilvl w:val="0"/>
-          <w:numId w:val="1060"/>
+          <w:numId w:val="1061"/>
         </w:numPr>
       </w:pPr>
       <w:r>
@@ -18405,7 +18678,7 @@
         <w:pStyle w:val="Compact"/>
         <w:numPr>
           <w:ilvl w:val="0"/>
-          <w:numId w:val="1060"/>
+          <w:numId w:val="1061"/>
         </w:numPr>
       </w:pPr>
       <w:r>
@@ -18441,7 +18714,7 @@
         <w:pStyle w:val="Compact"/>
         <w:numPr>
           <w:ilvl w:val="0"/>
-          <w:numId w:val="1060"/>
+          <w:numId w:val="1061"/>
         </w:numPr>
       </w:pPr>
       <w:r>
@@ -18477,7 +18750,7 @@
         <w:pStyle w:val="Compact"/>
         <w:numPr>
           <w:ilvl w:val="0"/>
-          <w:numId w:val="1060"/>
+          <w:numId w:val="1061"/>
         </w:numPr>
       </w:pPr>
       <w:r>
@@ -18525,7 +18798,7 @@
         <w:pStyle w:val="Compact"/>
         <w:numPr>
           <w:ilvl w:val="0"/>
-          <w:numId w:val="1061"/>
+          <w:numId w:val="1062"/>
         </w:numPr>
       </w:pPr>
       <w:r>
@@ -18546,7 +18819,7 @@
         <w:pStyle w:val="Compact"/>
         <w:numPr>
           <w:ilvl w:val="0"/>
-          <w:numId w:val="1061"/>
+          <w:numId w:val="1062"/>
         </w:numPr>
       </w:pPr>
       <w:r>
@@ -18567,7 +18840,7 @@
         <w:pStyle w:val="Compact"/>
         <w:numPr>
           <w:ilvl w:val="0"/>
-          <w:numId w:val="1061"/>
+          <w:numId w:val="1062"/>
         </w:numPr>
       </w:pPr>
       <w:r>
@@ -18600,7 +18873,7 @@
         <w:pStyle w:val="Compact"/>
         <w:numPr>
           <w:ilvl w:val="0"/>
-          <w:numId w:val="1061"/>
+          <w:numId w:val="1062"/>
         </w:numPr>
       </w:pPr>
       <w:r>
@@ -18636,7 +18909,7 @@
         <w:pStyle w:val="Compact"/>
         <w:numPr>
           <w:ilvl w:val="0"/>
-          <w:numId w:val="1061"/>
+          <w:numId w:val="1062"/>
         </w:numPr>
       </w:pPr>
       <w:r>
@@ -18681,7 +18954,7 @@
         <w:pStyle w:val="Compact"/>
         <w:numPr>
           <w:ilvl w:val="0"/>
-          <w:numId w:val="1062"/>
+          <w:numId w:val="1063"/>
         </w:numPr>
       </w:pPr>
       <w:r>
@@ -18717,7 +18990,7 @@
         <w:pStyle w:val="Compact"/>
         <w:numPr>
           <w:ilvl w:val="0"/>
-          <w:numId w:val="1062"/>
+          <w:numId w:val="1063"/>
         </w:numPr>
       </w:pPr>
       <w:r>
@@ -18753,7 +19026,7 @@
         <w:pStyle w:val="Compact"/>
         <w:numPr>
           <w:ilvl w:val="0"/>
-          <w:numId w:val="1062"/>
+          <w:numId w:val="1063"/>
         </w:numPr>
       </w:pPr>
       <w:r>
@@ -18789,7 +19062,7 @@
         <w:pStyle w:val="Compact"/>
         <w:numPr>
           <w:ilvl w:val="0"/>
-          <w:numId w:val="1062"/>
+          <w:numId w:val="1063"/>
         </w:numPr>
       </w:pPr>
       <w:r>
@@ -18822,7 +19095,7 @@
         <w:pStyle w:val="Compact"/>
         <w:numPr>
           <w:ilvl w:val="0"/>
-          <w:numId w:val="1063"/>
+          <w:numId w:val="1064"/>
         </w:numPr>
       </w:pPr>
       <w:r>
@@ -18843,7 +19116,7 @@
         <w:pStyle w:val="Compact"/>
         <w:numPr>
           <w:ilvl w:val="0"/>
-          <w:numId w:val="1063"/>
+          <w:numId w:val="1064"/>
         </w:numPr>
       </w:pPr>
       <w:r>
@@ -18864,7 +19137,7 @@
         <w:pStyle w:val="Compact"/>
         <w:numPr>
           <w:ilvl w:val="0"/>
-          <w:numId w:val="1063"/>
+          <w:numId w:val="1064"/>
         </w:numPr>
       </w:pPr>
       <w:r>
@@ -18885,7 +19158,7 @@
         <w:pStyle w:val="Compact"/>
         <w:numPr>
           <w:ilvl w:val="0"/>
-          <w:numId w:val="1063"/>
+          <w:numId w:val="1064"/>
         </w:numPr>
       </w:pPr>
       <w:r>
@@ -18918,7 +19191,7 @@
         <w:pStyle w:val="Compact"/>
         <w:numPr>
           <w:ilvl w:val="0"/>
-          <w:numId w:val="1064"/>
+          <w:numId w:val="1065"/>
         </w:numPr>
       </w:pPr>
       <w:r>
@@ -18939,7 +19212,7 @@
         <w:pStyle w:val="Compact"/>
         <w:numPr>
           <w:ilvl w:val="0"/>
-          <w:numId w:val="1064"/>
+          <w:numId w:val="1065"/>
         </w:numPr>
       </w:pPr>
       <w:r>
@@ -18960,7 +19233,7 @@
         <w:pStyle w:val="Compact"/>
         <w:numPr>
           <w:ilvl w:val="0"/>
-          <w:numId w:val="1064"/>
+          <w:numId w:val="1065"/>
         </w:numPr>
       </w:pPr>
       <w:r>
@@ -18981,7 +19254,7 @@
         <w:pStyle w:val="Compact"/>
         <w:numPr>
           <w:ilvl w:val="0"/>
-          <w:numId w:val="1064"/>
+          <w:numId w:val="1065"/>
         </w:numPr>
       </w:pPr>
       <w:r>
@@ -19038,18 +19311,18 @@
                 <wp:inline>
                   <wp:extent cx="152400" cy="152400"/>
                   <wp:effectExtent b="0" l="0" r="0" t="0"/>
-                  <wp:docPr descr="" title="" id="213" name="Picture"/>
+                  <wp:docPr descr="" title="" id="218" name="Picture"/>
                   <a:graphic>
                     <a:graphicData uri="http://schemas.openxmlformats.org/drawingml/2006/picture">
                       <pic:pic>
                         <pic:nvPicPr>
-                          <pic:cNvPr descr="/opt/quarto/share/formats/docx/tip.png" id="214" name="Picture"/>
+                          <pic:cNvPr descr="/opt/quarto/share/formats/docx/tip.png" id="219" name="Picture"/>
                           <pic:cNvPicPr>
                             <a:picLocks noChangeArrowheads="1" noChangeAspect="1"/>
                           </pic:cNvPicPr>
                         </pic:nvPicPr>
                         <pic:blipFill>
-                          <a:blip r:embed="rId212"/>
+                          <a:blip r:embed="rId217"/>
                           <a:stretch>
                             <a:fillRect/>
                           </a:stretch>
@@ -19114,7 +19387,7 @@
               <w:pStyle w:val="Compact"/>
               <w:numPr>
                 <w:ilvl w:val="0"/>
-                <w:numId w:val="1065"/>
+                <w:numId w:val="1066"/>
               </w:numPr>
             </w:pPr>
             <w:r>
@@ -19126,7 +19399,7 @@
               <w:pStyle w:val="Compact"/>
               <w:numPr>
                 <w:ilvl w:val="0"/>
-                <w:numId w:val="1065"/>
+                <w:numId w:val="1066"/>
               </w:numPr>
             </w:pPr>
             <w:r>
@@ -19138,7 +19411,7 @@
               <w:pStyle w:val="Compact"/>
               <w:numPr>
                 <w:ilvl w:val="0"/>
-                <w:numId w:val="1065"/>
+                <w:numId w:val="1066"/>
               </w:numPr>
             </w:pPr>
             <w:r>
@@ -19215,18 +19488,18 @@
                 <wp:inline>
                   <wp:extent cx="152400" cy="152400"/>
                   <wp:effectExtent b="0" l="0" r="0" t="0"/>
-                  <wp:docPr descr="" title="" id="215" name="Picture"/>
+                  <wp:docPr descr="" title="" id="220" name="Picture"/>
                   <a:graphic>
                     <a:graphicData uri="http://schemas.openxmlformats.org/drawingml/2006/picture">
                       <pic:pic>
                         <pic:nvPicPr>
-                          <pic:cNvPr descr="/opt/quarto/share/formats/docx/note.png" id="216" name="Picture"/>
+                          <pic:cNvPr descr="/opt/quarto/share/formats/docx/note.png" id="221" name="Picture"/>
                           <pic:cNvPicPr>
                             <a:picLocks noChangeArrowheads="1" noChangeAspect="1"/>
                           </pic:cNvPicPr>
                         </pic:nvPicPr>
                         <pic:blipFill>
-                          <a:blip r:embed="rId187"/>
+                          <a:blip r:embed="rId192"/>
                           <a:stretch>
                             <a:fillRect/>
                           </a:stretch>
@@ -19291,7 +19564,7 @@
               <w:pStyle w:val="Compact"/>
               <w:numPr>
                 <w:ilvl w:val="0"/>
-                <w:numId w:val="1066"/>
+                <w:numId w:val="1067"/>
               </w:numPr>
             </w:pPr>
             <w:r>
@@ -19303,7 +19576,7 @@
               <w:pStyle w:val="Compact"/>
               <w:numPr>
                 <w:ilvl w:val="0"/>
-                <w:numId w:val="1066"/>
+                <w:numId w:val="1067"/>
               </w:numPr>
             </w:pPr>
             <w:r>
@@ -19315,7 +19588,7 @@
               <w:pStyle w:val="Compact"/>
               <w:numPr>
                 <w:ilvl w:val="0"/>
-                <w:numId w:val="1066"/>
+                <w:numId w:val="1067"/>
               </w:numPr>
             </w:pPr>
             <w:r>
@@ -19327,7 +19600,7 @@
               <w:pStyle w:val="Compact"/>
               <w:numPr>
                 <w:ilvl w:val="0"/>
-                <w:numId w:val="1066"/>
+                <w:numId w:val="1067"/>
               </w:numPr>
             </w:pPr>
             <w:r>
@@ -19361,9 +19634,9 @@
         </w:tc>
       </w:tr>
     </w:tbl>
-    <w:bookmarkEnd w:id="217"/>
-    <w:bookmarkEnd w:id="218"/>
-    <w:bookmarkStart w:id="288" w:name="references"/>
+    <w:bookmarkEnd w:id="222"/>
+    <w:bookmarkEnd w:id="223"/>
+    <w:bookmarkStart w:id="295" w:name="references"/>
     <w:p>
       <w:pPr>
         <w:pStyle w:val="Heading1"/>
@@ -19372,8 +19645,8 @@
         <w:t xml:space="preserve">References</w:t>
       </w:r>
     </w:p>
-    <w:bookmarkStart w:id="287" w:name="refs"/>
-    <w:bookmarkStart w:id="220" w:name="ref-space_odyssey"/>
+    <w:bookmarkStart w:id="294" w:name="refs"/>
+    <w:bookmarkStart w:id="225" w:name="ref-space_odyssey"/>
     <w:p>
       <w:pPr>
         <w:pStyle w:val="Bibliography"/>
@@ -19391,7 +19664,7 @@
       <w:r>
         <w:t xml:space="preserve"> </w:t>
       </w:r>
-      <w:hyperlink r:id="rId219">
+      <w:hyperlink r:id="rId224">
         <w:r>
           <w:rPr>
             <w:rStyle w:val="Hyperlink"/>
@@ -19403,8 +19676,8 @@
         <w:t xml:space="preserve">.</w:t>
       </w:r>
     </w:p>
-    <w:bookmarkEnd w:id="220"/>
-    <w:bookmarkStart w:id="222" w:name="ref-kiro_docs"/>
+    <w:bookmarkEnd w:id="225"/>
+    <w:bookmarkStart w:id="227" w:name="ref-kiro_docs"/>
     <w:p>
       <w:pPr>
         <w:pStyle w:val="Bibliography"/>
@@ -19428,7 +19701,7 @@
       <w:r>
         <w:t xml:space="preserve"> </w:t>
       </w:r>
-      <w:hyperlink r:id="rId221">
+      <w:hyperlink r:id="rId226">
         <w:r>
           <w:rPr>
             <w:rStyle w:val="Hyperlink"/>
@@ -19440,8 +19713,8 @@
         <w:t xml:space="preserve">.</w:t>
       </w:r>
     </w:p>
-    <w:bookmarkEnd w:id="222"/>
-    <w:bookmarkStart w:id="223" w:name="ref-claude_research_help"/>
+    <w:bookmarkEnd w:id="227"/>
+    <w:bookmarkStart w:id="228" w:name="ref-claude_research_help"/>
     <w:p>
       <w:pPr>
         <w:pStyle w:val="Bibliography"/>
@@ -19465,7 +19738,7 @@
       <w:r>
         <w:t xml:space="preserve"> </w:t>
       </w:r>
-      <w:hyperlink r:id="rId130">
+      <w:hyperlink r:id="rId135">
         <w:r>
           <w:rPr>
             <w:rStyle w:val="Hyperlink"/>
@@ -19477,8 +19750,8 @@
         <w:t xml:space="preserve">.</w:t>
       </w:r>
     </w:p>
-    <w:bookmarkEnd w:id="223"/>
-    <w:bookmarkStart w:id="224" w:name="ref-claude_web_search_tool"/>
+    <w:bookmarkEnd w:id="228"/>
+    <w:bookmarkStart w:id="229" w:name="ref-claude_web_search_tool"/>
     <w:p>
       <w:pPr>
         <w:pStyle w:val="Bibliography"/>
@@ -19502,7 +19775,7 @@
       <w:r>
         <w:t xml:space="preserve"> </w:t>
       </w:r>
-      <w:hyperlink r:id="rId131">
+      <w:hyperlink r:id="rId136">
         <w:r>
           <w:rPr>
             <w:rStyle w:val="Hyperlink"/>
@@ -19514,8 +19787,8 @@
         <w:t xml:space="preserve">.</w:t>
       </w:r>
     </w:p>
-    <w:bookmarkEnd w:id="224"/>
-    <w:bookmarkStart w:id="226" w:name="ref-claude_research_when"/>
+    <w:bookmarkEnd w:id="229"/>
+    <w:bookmarkStart w:id="231" w:name="ref-claude_research_when"/>
     <w:p>
       <w:pPr>
         <w:pStyle w:val="Bibliography"/>
@@ -19539,7 +19812,7 @@
       <w:r>
         <w:t xml:space="preserve"> </w:t>
       </w:r>
-      <w:hyperlink r:id="rId225">
+      <w:hyperlink r:id="rId230">
         <w:r>
           <w:rPr>
             <w:rStyle w:val="Hyperlink"/>
@@ -19551,8 +19824,8 @@
         <w:t xml:space="preserve">.</w:t>
       </w:r>
     </w:p>
-    <w:bookmarkEnd w:id="226"/>
-    <w:bookmarkStart w:id="228" w:name="ref-i_robot"/>
+    <w:bookmarkEnd w:id="231"/>
+    <w:bookmarkStart w:id="233" w:name="ref-i_robot"/>
     <w:p>
       <w:pPr>
         <w:pStyle w:val="Bibliography"/>
@@ -19576,7 +19849,7 @@
       <w:r>
         <w:t xml:space="preserve"> </w:t>
       </w:r>
-      <w:hyperlink r:id="rId227">
+      <w:hyperlink r:id="rId232">
         <w:r>
           <w:rPr>
             <w:rStyle w:val="Hyperlink"/>
@@ -19588,8 +19861,8 @@
         <w:t xml:space="preserve">.</w:t>
       </w:r>
     </w:p>
-    <w:bookmarkEnd w:id="228"/>
-    <w:bookmarkStart w:id="230" w:name="ref-battlestar_galactica_2004"/>
+    <w:bookmarkEnd w:id="233"/>
+    <w:bookmarkStart w:id="235" w:name="ref-battlestar_galactica_2004"/>
     <w:p>
       <w:pPr>
         <w:pStyle w:val="Bibliography"/>
@@ -19607,7 +19880,7 @@
       <w:r>
         <w:t xml:space="preserve"> </w:t>
       </w:r>
-      <w:hyperlink r:id="rId229">
+      <w:hyperlink r:id="rId234">
         <w:r>
           <w:rPr>
             <w:rStyle w:val="Hyperlink"/>
@@ -19619,8 +19892,8 @@
         <w:t xml:space="preserve">.</w:t>
       </w:r>
     </w:p>
-    <w:bookmarkEnd w:id="230"/>
-    <w:bookmarkStart w:id="232" w:name="ref-blade_runner"/>
+    <w:bookmarkEnd w:id="235"/>
+    <w:bookmarkStart w:id="237" w:name="ref-blade_runner"/>
     <w:p>
       <w:pPr>
         <w:pStyle w:val="Bibliography"/>
@@ -19638,7 +19911,7 @@
       <w:r>
         <w:t xml:space="preserve"> </w:t>
       </w:r>
-      <w:hyperlink r:id="rId231">
+      <w:hyperlink r:id="rId236">
         <w:r>
           <w:rPr>
             <w:rStyle w:val="Hyperlink"/>
@@ -19650,8 +19923,8 @@
         <w:t xml:space="preserve">.</w:t>
       </w:r>
     </w:p>
-    <w:bookmarkEnd w:id="232"/>
-    <w:bookmarkStart w:id="234" w:name="ref-enders_game"/>
+    <w:bookmarkEnd w:id="237"/>
+    <w:bookmarkStart w:id="239" w:name="ref-enders_game"/>
     <w:p>
       <w:pPr>
         <w:pStyle w:val="Bibliography"/>
@@ -19675,7 +19948,7 @@
       <w:r>
         <w:t xml:space="preserve"> </w:t>
       </w:r>
-      <w:hyperlink r:id="rId233">
+      <w:hyperlink r:id="rId238">
         <w:r>
           <w:rPr>
             <w:rStyle w:val="Hyperlink"/>
@@ -19687,8 +19960,8 @@
         <w:t xml:space="preserve">.</w:t>
       </w:r>
     </w:p>
-    <w:bookmarkEnd w:id="234"/>
-    <w:bookmarkStart w:id="235" w:name="ref-cline_site"/>
+    <w:bookmarkEnd w:id="239"/>
+    <w:bookmarkStart w:id="240" w:name="ref-cline_site"/>
     <w:p>
       <w:pPr>
         <w:pStyle w:val="Bibliography"/>
@@ -19724,8 +19997,8 @@
         <w:t xml:space="preserve">.</w:t>
       </w:r>
     </w:p>
-    <w:bookmarkEnd w:id="235"/>
-    <w:bookmarkStart w:id="237" w:name="ref-devin_docs"/>
+    <w:bookmarkEnd w:id="240"/>
+    <w:bookmarkStart w:id="242" w:name="ref-devin_docs"/>
     <w:p>
       <w:pPr>
         <w:pStyle w:val="Bibliography"/>
@@ -19749,7 +20022,7 @@
       <w:r>
         <w:t xml:space="preserve"> </w:t>
       </w:r>
-      <w:hyperlink r:id="rId236">
+      <w:hyperlink r:id="rId241">
         <w:r>
           <w:rPr>
             <w:rStyle w:val="Hyperlink"/>
@@ -19761,8 +20034,8 @@
         <w:t xml:space="preserve">.</w:t>
       </w:r>
     </w:p>
-    <w:bookmarkEnd w:id="237"/>
-    <w:bookmarkStart w:id="239" w:name="ref-cursor_cloud_agents"/>
+    <w:bookmarkEnd w:id="242"/>
+    <w:bookmarkStart w:id="244" w:name="ref-cursor_cloud_agents"/>
     <w:p>
       <w:pPr>
         <w:pStyle w:val="Bibliography"/>
@@ -19786,7 +20059,7 @@
       <w:r>
         <w:t xml:space="preserve"> </w:t>
       </w:r>
-      <w:hyperlink r:id="rId238">
+      <w:hyperlink r:id="rId243">
         <w:r>
           <w:rPr>
             <w:rStyle w:val="Hyperlink"/>
@@ -19798,8 +20071,8 @@
         <w:t xml:space="preserve">.</w:t>
       </w:r>
     </w:p>
-    <w:bookmarkEnd w:id="239"/>
-    <w:bookmarkStart w:id="241" w:name="ref-humans_are_dead"/>
+    <w:bookmarkEnd w:id="244"/>
+    <w:bookmarkStart w:id="246" w:name="ref-humans_are_dead"/>
     <w:p>
       <w:pPr>
         <w:pStyle w:val="Bibliography"/>
@@ -19823,7 +20096,7 @@
       <w:r>
         <w:t xml:space="preserve"> </w:t>
       </w:r>
-      <w:hyperlink r:id="rId240">
+      <w:hyperlink r:id="rId245">
         <w:r>
           <w:rPr>
             <w:rStyle w:val="Hyperlink"/>
@@ -19835,8 +20108,8 @@
         <w:t xml:space="preserve">.</w:t>
       </w:r>
     </w:p>
-    <w:bookmarkEnd w:id="241"/>
-    <w:bookmarkStart w:id="243" w:name="ref-citadel_architecture"/>
+    <w:bookmarkEnd w:id="246"/>
+    <w:bookmarkStart w:id="248" w:name="ref-citadel_architecture"/>
     <w:p>
       <w:pPr>
         <w:pStyle w:val="Bibliography"/>
@@ -19860,7 +20133,7 @@
       <w:r>
         <w:t xml:space="preserve"> </w:t>
       </w:r>
-      <w:hyperlink r:id="rId242">
+      <w:hyperlink r:id="rId247">
         <w:r>
           <w:rPr>
             <w:rStyle w:val="Hyperlink"/>
@@ -19872,8 +20145,8 @@
         <w:t xml:space="preserve">.</w:t>
       </w:r>
     </w:p>
-    <w:bookmarkEnd w:id="243"/>
-    <w:bookmarkStart w:id="245" w:name="ref-citadel_experiments"/>
+    <w:bookmarkEnd w:id="248"/>
+    <w:bookmarkStart w:id="250" w:name="ref-citadel_experiments"/>
     <w:p>
       <w:pPr>
         <w:pStyle w:val="Bibliography"/>
@@ -19897,7 +20170,7 @@
       <w:r>
         <w:t xml:space="preserve"> </w:t>
       </w:r>
-      <w:hyperlink r:id="rId244">
+      <w:hyperlink r:id="rId249">
         <w:r>
           <w:rPr>
             <w:rStyle w:val="Hyperlink"/>
@@ -19909,8 +20182,8 @@
         <w:t xml:space="preserve">.</w:t>
       </w:r>
     </w:p>
-    <w:bookmarkEnd w:id="245"/>
-    <w:bookmarkStart w:id="247" w:name="ref-citadel_threat_model"/>
+    <w:bookmarkEnd w:id="250"/>
+    <w:bookmarkStart w:id="252" w:name="ref-citadel_threat_model"/>
     <w:p>
       <w:pPr>
         <w:pStyle w:val="Bibliography"/>
@@ -19934,7 +20207,7 @@
       <w:r>
         <w:t xml:space="preserve"> </w:t>
       </w:r>
-      <w:hyperlink r:id="rId246">
+      <w:hyperlink r:id="rId251">
         <w:r>
           <w:rPr>
             <w:rStyle w:val="Hyperlink"/>
@@ -19946,8 +20219,8 @@
         <w:t xml:space="preserve">.</w:t>
       </w:r>
     </w:p>
-    <w:bookmarkEnd w:id="247"/>
-    <w:bookmarkStart w:id="248" w:name="ref-citadel_repo"/>
+    <w:bookmarkEnd w:id="252"/>
+    <w:bookmarkStart w:id="253" w:name="ref-citadel_repo"/>
     <w:p>
       <w:pPr>
         <w:pStyle w:val="Bibliography"/>
@@ -19971,7 +20244,7 @@
       <w:r>
         <w:t xml:space="preserve"> </w:t>
       </w:r>
-      <w:hyperlink r:id="rId195">
+      <w:hyperlink r:id="rId200">
         <w:r>
           <w:rPr>
             <w:rStyle w:val="Hyperlink"/>
@@ -19983,8 +20256,8 @@
         <w:t xml:space="preserve">.</w:t>
       </w:r>
     </w:p>
-    <w:bookmarkEnd w:id="248"/>
-    <w:bookmarkStart w:id="250" w:name="ref-gemini_deep_research_max"/>
+    <w:bookmarkEnd w:id="253"/>
+    <w:bookmarkStart w:id="255" w:name="ref-gemini_deep_research_max"/>
     <w:p>
       <w:pPr>
         <w:pStyle w:val="Bibliography"/>
@@ -20008,7 +20281,7 @@
       <w:r>
         <w:t xml:space="preserve"> </w:t>
       </w:r>
-      <w:hyperlink r:id="rId249">
+      <w:hyperlink r:id="rId254">
         <w:r>
           <w:rPr>
             <w:rStyle w:val="Hyperlink"/>
@@ -20020,8 +20293,8 @@
         <w:t xml:space="preserve">.</w:t>
       </w:r>
     </w:p>
-    <w:bookmarkEnd w:id="250"/>
-    <w:bookmarkStart w:id="252" w:name="ref-gemini_apps_limits"/>
+    <w:bookmarkEnd w:id="255"/>
+    <w:bookmarkStart w:id="257" w:name="ref-gemini_apps_limits"/>
     <w:p>
       <w:pPr>
         <w:pStyle w:val="Bibliography"/>
@@ -20045,7 +20318,7 @@
       <w:r>
         <w:t xml:space="preserve"> </w:t>
       </w:r>
-      <w:hyperlink r:id="rId251">
+      <w:hyperlink r:id="rId256">
         <w:r>
           <w:rPr>
             <w:rStyle w:val="Hyperlink"/>
@@ -20057,8 +20330,8 @@
         <w:t xml:space="preserve">.</w:t>
       </w:r>
     </w:p>
-    <w:bookmarkEnd w:id="252"/>
-    <w:bookmarkStart w:id="253" w:name="ref-gemini_deep_research_api"/>
+    <w:bookmarkEnd w:id="257"/>
+    <w:bookmarkStart w:id="258" w:name="ref-gemini_deep_research_api"/>
     <w:p>
       <w:pPr>
         <w:pStyle w:val="Bibliography"/>
@@ -20082,7 +20355,7 @@
       <w:r>
         <w:t xml:space="preserve"> </w:t>
       </w:r>
-      <w:hyperlink r:id="rId134">
+      <w:hyperlink r:id="rId139">
         <w:r>
           <w:rPr>
             <w:rStyle w:val="Hyperlink"/>
@@ -20094,8 +20367,8 @@
         <w:t xml:space="preserve">.</w:t>
       </w:r>
     </w:p>
-    <w:bookmarkEnd w:id="253"/>
-    <w:bookmarkStart w:id="255" w:name="ref-jules_docs"/>
+    <w:bookmarkEnd w:id="258"/>
+    <w:bookmarkStart w:id="260" w:name="ref-jules_docs"/>
     <w:p>
       <w:pPr>
         <w:pStyle w:val="Bibliography"/>
@@ -20119,7 +20392,7 @@
       <w:r>
         <w:t xml:space="preserve"> </w:t>
       </w:r>
-      <w:hyperlink r:id="rId254">
+      <w:hyperlink r:id="rId259">
         <w:r>
           <w:rPr>
             <w:rStyle w:val="Hyperlink"/>
@@ -20131,8 +20404,8 @@
         <w:t xml:space="preserve">.</w:t>
       </w:r>
     </w:p>
-    <w:bookmarkEnd w:id="255"/>
-    <w:bookmarkStart w:id="256" w:name="ref-gemini_deep_research_help"/>
+    <w:bookmarkEnd w:id="260"/>
+    <w:bookmarkStart w:id="261" w:name="ref-gemini_deep_research_help"/>
     <w:p>
       <w:pPr>
         <w:pStyle w:val="Bibliography"/>
@@ -20156,7 +20429,7 @@
       <w:r>
         <w:t xml:space="preserve"> </w:t>
       </w:r>
-      <w:hyperlink r:id="rId133">
+      <w:hyperlink r:id="rId138">
         <w:r>
           <w:rPr>
             <w:rStyle w:val="Hyperlink"/>
@@ -20168,8 +20441,8 @@
         <w:t xml:space="preserve">.</w:t>
       </w:r>
     </w:p>
-    <w:bookmarkEnd w:id="256"/>
-    <w:bookmarkStart w:id="258" w:name="ref-dune"/>
+    <w:bookmarkEnd w:id="261"/>
+    <w:bookmarkStart w:id="263" w:name="ref-dune"/>
     <w:p>
       <w:pPr>
         <w:pStyle w:val="Bibliography"/>
@@ -20193,7 +20466,7 @@
       <w:r>
         <w:t xml:space="preserve"> </w:t>
       </w:r>
-      <w:hyperlink r:id="rId257">
+      <w:hyperlink r:id="rId262">
         <w:r>
           <w:rPr>
             <w:rStyle w:val="Hyperlink"/>
@@ -20205,8 +20478,8 @@
         <w:t xml:space="preserve">.</w:t>
       </w:r>
     </w:p>
-    <w:bookmarkEnd w:id="258"/>
-    <w:bookmarkStart w:id="260" w:name="ref-hyperautomation_claude_limits"/>
+    <w:bookmarkEnd w:id="263"/>
+    <w:bookmarkStart w:id="265" w:name="ref-hyperautomation_claude_limits"/>
     <w:p>
       <w:pPr>
         <w:pStyle w:val="Bibliography"/>
@@ -20230,7 +20503,7 @@
       <w:r>
         <w:t xml:space="preserve"> </w:t>
       </w:r>
-      <w:hyperlink r:id="rId259">
+      <w:hyperlink r:id="rId264">
         <w:r>
           <w:rPr>
             <w:rStyle w:val="Hyperlink"/>
@@ -20242,8 +20515,8 @@
         <w:t xml:space="preserve">.</w:t>
       </w:r>
     </w:p>
-    <w:bookmarkEnd w:id="260"/>
-    <w:bookmarkStart w:id="262" w:name="ref-lecun_world_models"/>
+    <w:bookmarkEnd w:id="265"/>
+    <w:bookmarkStart w:id="267" w:name="ref-lecun_world_models"/>
     <w:p>
       <w:pPr>
         <w:pStyle w:val="Bibliography"/>
@@ -20267,7 +20540,7 @@
       <w:r>
         <w:t xml:space="preserve"> </w:t>
       </w:r>
-      <w:hyperlink r:id="rId261">
+      <w:hyperlink r:id="rId266">
         <w:r>
           <w:rPr>
             <w:rStyle w:val="Hyperlink"/>
@@ -20279,8 +20552,8 @@
         <w:t xml:space="preserve">.</w:t>
       </w:r>
     </w:p>
-    <w:bookmarkEnd w:id="262"/>
-    <w:bookmarkStart w:id="263" w:name="ref-ms_copilot_conversation_modes"/>
+    <w:bookmarkEnd w:id="267"/>
+    <w:bookmarkStart w:id="268" w:name="ref-ms_copilot_conversation_modes"/>
     <w:p>
       <w:pPr>
         <w:pStyle w:val="Bibliography"/>
@@ -20304,7 +20577,7 @@
       <w:r>
         <w:t xml:space="preserve"> </w:t>
       </w:r>
-      <w:hyperlink r:id="rId140">
+      <w:hyperlink r:id="rId145">
         <w:r>
           <w:rPr>
             <w:rStyle w:val="Hyperlink"/>
@@ -20316,8 +20589,8 @@
         <w:t xml:space="preserve">.</w:t>
       </w:r>
     </w:p>
-    <w:bookmarkEnd w:id="263"/>
-    <w:bookmarkStart w:id="265" w:name="ref-ms_copilot_deep_research_retired"/>
+    <w:bookmarkEnd w:id="268"/>
+    <w:bookmarkStart w:id="270" w:name="ref-ms_copilot_deep_research_retired"/>
     <w:p>
       <w:pPr>
         <w:pStyle w:val="Bibliography"/>
@@ -20341,7 +20614,7 @@
       <w:r>
         <w:t xml:space="preserve"> </w:t>
       </w:r>
-      <w:hyperlink r:id="rId264">
+      <w:hyperlink r:id="rId269">
         <w:r>
           <w:rPr>
             <w:rStyle w:val="Hyperlink"/>
@@ -20353,8 +20626,8 @@
         <w:t xml:space="preserve">.</w:t>
       </w:r>
     </w:p>
-    <w:bookmarkEnd w:id="265"/>
-    <w:bookmarkStart w:id="266" w:name="ref-ms_researcher_help"/>
+    <w:bookmarkEnd w:id="270"/>
+    <w:bookmarkStart w:id="271" w:name="ref-ms_researcher_help"/>
     <w:p>
       <w:pPr>
         <w:pStyle w:val="Bibliography"/>
@@ -20378,7 +20651,7 @@
       <w:r>
         <w:t xml:space="preserve"> </w:t>
       </w:r>
-      <w:hyperlink r:id="rId139">
+      <w:hyperlink r:id="rId144">
         <w:r>
           <w:rPr>
             <w:rStyle w:val="Hyperlink"/>
@@ -20390,8 +20663,8 @@
         <w:t xml:space="preserve">.</w:t>
       </w:r>
     </w:p>
-    <w:bookmarkEnd w:id="266"/>
-    <w:bookmarkStart w:id="268" w:name="ref-ms_researcher_faq"/>
+    <w:bookmarkEnd w:id="271"/>
+    <w:bookmarkStart w:id="273" w:name="ref-ms_researcher_faq"/>
     <w:p>
       <w:pPr>
         <w:pStyle w:val="Bibliography"/>
@@ -20415,7 +20688,7 @@
       <w:r>
         <w:t xml:space="preserve"> </w:t>
       </w:r>
-      <w:hyperlink r:id="rId267">
+      <w:hyperlink r:id="rId272">
         <w:r>
           <w:rPr>
             <w:rStyle w:val="Hyperlink"/>
@@ -20427,8 +20700,8 @@
         <w:t xml:space="preserve">.</w:t>
       </w:r>
     </w:p>
-    <w:bookmarkEnd w:id="268"/>
-    <w:bookmarkStart w:id="270" w:name="ref-ms_researcher_overview"/>
+    <w:bookmarkEnd w:id="273"/>
+    <w:bookmarkStart w:id="275" w:name="ref-ms_researcher_overview"/>
     <w:p>
       <w:pPr>
         <w:pStyle w:val="Bibliography"/>
@@ -20452,7 +20725,7 @@
       <w:r>
         <w:t xml:space="preserve"> </w:t>
       </w:r>
-      <w:hyperlink r:id="rId269">
+      <w:hyperlink r:id="rId274">
         <w:r>
           <w:rPr>
             <w:rStyle w:val="Hyperlink"/>
@@ -20464,8 +20737,8 @@
         <w:t xml:space="preserve">.</w:t>
       </w:r>
     </w:p>
-    <w:bookmarkEnd w:id="270"/>
-    <w:bookmarkStart w:id="271" w:name="ref-ollama_site"/>
+    <w:bookmarkEnd w:id="275"/>
+    <w:bookmarkStart w:id="276" w:name="ref-ollama_site"/>
     <w:p>
       <w:pPr>
         <w:pStyle w:val="Bibliography"/>
@@ -20501,8 +20774,8 @@
         <w:t xml:space="preserve">.</w:t>
       </w:r>
     </w:p>
-    <w:bookmarkEnd w:id="271"/>
-    <w:bookmarkStart w:id="272" w:name="ref-openai_deep_research_api"/>
+    <w:bookmarkEnd w:id="276"/>
+    <w:bookmarkStart w:id="277" w:name="ref-openai_deep_research_api"/>
     <w:p>
       <w:pPr>
         <w:pStyle w:val="Bibliography"/>
@@ -20526,7 +20799,7 @@
       <w:r>
         <w:t xml:space="preserve"> </w:t>
       </w:r>
-      <w:hyperlink r:id="rId137">
+      <w:hyperlink r:id="rId142">
         <w:r>
           <w:rPr>
             <w:rStyle w:val="Hyperlink"/>
@@ -20538,8 +20811,8 @@
         <w:t xml:space="preserve">.</w:t>
       </w:r>
     </w:p>
-    <w:bookmarkEnd w:id="272"/>
-    <w:bookmarkStart w:id="273" w:name="ref-openai_deep_research_help"/>
+    <w:bookmarkEnd w:id="277"/>
+    <w:bookmarkStart w:id="278" w:name="ref-openai_deep_research_help"/>
     <w:p>
       <w:pPr>
         <w:pStyle w:val="Bibliography"/>
@@ -20563,7 +20836,7 @@
       <w:r>
         <w:t xml:space="preserve"> </w:t>
       </w:r>
-      <w:hyperlink r:id="rId136">
+      <w:hyperlink r:id="rId141">
         <w:r>
           <w:rPr>
             <w:rStyle w:val="Hyperlink"/>
@@ -20575,8 +20848,8 @@
         <w:t xml:space="preserve">.</w:t>
       </w:r>
     </w:p>
-    <w:bookmarkEnd w:id="273"/>
-    <w:bookmarkStart w:id="275" w:name="ref-opencode_docs"/>
+    <w:bookmarkEnd w:id="278"/>
+    <w:bookmarkStart w:id="280" w:name="ref-opencode_docs"/>
     <w:p>
       <w:pPr>
         <w:pStyle w:val="Bibliography"/>
@@ -20600,7 +20873,7 @@
       <w:r>
         <w:t xml:space="preserve"> </w:t>
       </w:r>
-      <w:hyperlink r:id="rId274">
+      <w:hyperlink r:id="rId279">
         <w:r>
           <w:rPr>
             <w:rStyle w:val="Hyperlink"/>
@@ -20612,8 +20885,8 @@
         <w:t xml:space="preserve">.</w:t>
       </w:r>
     </w:p>
-    <w:bookmarkEnd w:id="275"/>
-    <w:bookmarkStart w:id="276" w:name="ref-openhands_docs"/>
+    <w:bookmarkEnd w:id="280"/>
+    <w:bookmarkStart w:id="281" w:name="ref-openhands_docs"/>
     <w:p>
       <w:pPr>
         <w:pStyle w:val="Bibliography"/>
@@ -20649,8 +20922,8 @@
         <w:t xml:space="preserve">.</w:t>
       </w:r>
     </w:p>
-    <w:bookmarkEnd w:id="276"/>
-    <w:bookmarkStart w:id="277" w:name="ref-perplexity_sonar_deep_research"/>
+    <w:bookmarkEnd w:id="281"/>
+    <w:bookmarkStart w:id="282" w:name="ref-perplexity_sonar_deep_research"/>
     <w:p>
       <w:pPr>
         <w:pStyle w:val="Bibliography"/>
@@ -20674,7 +20947,7 @@
       <w:r>
         <w:t xml:space="preserve"> </w:t>
       </w:r>
-      <w:hyperlink r:id="rId144">
+      <w:hyperlink r:id="rId149">
         <w:r>
           <w:rPr>
             <w:rStyle w:val="Hyperlink"/>
@@ -20686,8 +20959,8 @@
         <w:t xml:space="preserve">.</w:t>
       </w:r>
     </w:p>
-    <w:bookmarkEnd w:id="277"/>
-    <w:bookmarkStart w:id="278" w:name="ref-perplexity_research_mode"/>
+    <w:bookmarkEnd w:id="282"/>
+    <w:bookmarkStart w:id="283" w:name="ref-perplexity_research_mode"/>
     <w:p>
       <w:pPr>
         <w:pStyle w:val="Bibliography"/>
@@ -20711,7 +20984,7 @@
       <w:r>
         <w:t xml:space="preserve"> </w:t>
       </w:r>
-      <w:hyperlink r:id="rId142">
+      <w:hyperlink r:id="rId147">
         <w:r>
           <w:rPr>
             <w:rStyle w:val="Hyperlink"/>
@@ -20723,8 +20996,8 @@
         <w:t xml:space="preserve">.</w:t>
       </w:r>
     </w:p>
-    <w:bookmarkEnd w:id="278"/>
-    <w:bookmarkStart w:id="279" w:name="ref-perplexity_advanced_deep_research"/>
+    <w:bookmarkEnd w:id="283"/>
+    <w:bookmarkStart w:id="284" w:name="ref-perplexity_advanced_deep_research"/>
     <w:p>
       <w:pPr>
         <w:pStyle w:val="Bibliography"/>
@@ -20748,7 +21021,7 @@
       <w:r>
         <w:t xml:space="preserve"> </w:t>
       </w:r>
-      <w:hyperlink r:id="rId143">
+      <w:hyperlink r:id="rId148">
         <w:r>
           <w:rPr>
             <w:rStyle w:val="Hyperlink"/>
@@ -20760,17 +21033,54 @@
         <w:t xml:space="preserve">.</w:t>
       </w:r>
     </w:p>
-    <w:bookmarkEnd w:id="279"/>
-    <w:bookmarkStart w:id="281" w:name="ref-terminator"/>
+    <w:bookmarkEnd w:id="284"/>
+    <w:bookmarkStart w:id="286" w:name="ref-ng_one_skill_stay_relevant"/>
     <w:p>
       <w:pPr>
         <w:pStyle w:val="Bibliography"/>
       </w:pPr>
+      <w:r>
+        <w:t xml:space="preserve">Stanford Online, and Andrew Ng. 2026.</w:t>
+      </w:r>
+      <w:r>
+        <w:t xml:space="preserve"> </w:t>
+      </w:r>
       <w:r>
         <w:rPr>
           <w:i/>
           <w:iCs/>
         </w:rPr>
+        <w:t xml:space="preserve">Andrew Ng: One Skill to Stay Relevant in the Age of AI</w:t>
+      </w:r>
+      <w:r>
+        <w:t xml:space="preserve">. Video.</w:t>
+      </w:r>
+      <w:r>
+        <w:t xml:space="preserve"> </w:t>
+      </w:r>
+      <w:hyperlink r:id="rId285">
+        <w:r>
+          <w:rPr>
+            <w:rStyle w:val="Hyperlink"/>
+          </w:rPr>
+          <w:t xml:space="preserve">https://www.youtube.com/watch?v=HTlf3KNNez0</w:t>
+        </w:r>
+      </w:hyperlink>
+      <w:r>
+        <w:t xml:space="preserve">.</w:t>
+      </w:r>
+    </w:p>
+    <w:bookmarkEnd w:id="286"/>
+    <w:bookmarkStart w:id="288" w:name="ref-terminator"/>
+    <w:p>
+      <w:pPr>
+        <w:pStyle w:val="Bibliography"/>
+      </w:pPr>
+      <w:r>
+        <w:rPr>
+          <w:i/>
+          <w:iCs/>
+        </w:rPr>
         <w:t xml:space="preserve">Terminator 3: Rise of the Machines</w:t>
       </w:r>
       <w:r>
@@ -20779,7 +21089,7 @@
       <w:r>
         <w:t xml:space="preserve"> </w:t>
       </w:r>
-      <w:hyperlink r:id="rId280">
+      <w:hyperlink r:id="rId287">
         <w:r>
           <w:rPr>
             <w:rStyle w:val="Hyperlink"/>
@@ -20791,8 +21101,8 @@
         <w:t xml:space="preserve">.</w:t>
       </w:r>
     </w:p>
-    <w:bookmarkEnd w:id="281"/>
-    <w:bookmarkStart w:id="283" w:name="ref-matrix"/>
+    <w:bookmarkEnd w:id="288"/>
+    <w:bookmarkStart w:id="290" w:name="ref-matrix"/>
     <w:p>
       <w:pPr>
         <w:pStyle w:val="Bibliography"/>
@@ -20810,7 +21120,7 @@
       <w:r>
         <w:t xml:space="preserve"> </w:t>
       </w:r>
-      <w:hyperlink r:id="rId282">
+      <w:hyperlink r:id="rId289">
         <w:r>
           <w:rPr>
             <w:rStyle w:val="Hyperlink"/>
@@ -20822,8 +21132,8 @@
         <w:t xml:space="preserve">.</w:t>
       </w:r>
     </w:p>
-    <w:bookmarkEnd w:id="283"/>
-    <w:bookmarkStart w:id="285" w:name="ref-wargames"/>
+    <w:bookmarkEnd w:id="290"/>
+    <w:bookmarkStart w:id="292" w:name="ref-wargames"/>
     <w:p>
       <w:pPr>
         <w:pStyle w:val="Bibliography"/>
@@ -20841,7 +21151,7 @@
       <w:r>
         <w:t xml:space="preserve"> </w:t>
       </w:r>
-      <w:hyperlink r:id="rId284">
+      <w:hyperlink r:id="rId291">
         <w:r>
           <w:rPr>
             <w:rStyle w:val="Hyperlink"/>
@@ -20853,8 +21163,8 @@
         <w:t xml:space="preserve">.</w:t>
       </w:r>
     </w:p>
-    <w:bookmarkEnd w:id="285"/>
-    <w:bookmarkStart w:id="286" w:name="ref-warp_docs"/>
+    <w:bookmarkEnd w:id="292"/>
+    <w:bookmarkStart w:id="293" w:name="ref-warp_docs"/>
     <w:p>
       <w:pPr>
         <w:pStyle w:val="Bibliography"/>
@@ -20890,9 +21200,9 @@
         <w:t xml:space="preserve">.</w:t>
       </w:r>
     </w:p>
-    <w:bookmarkEnd w:id="286"/>
-    <w:bookmarkEnd w:id="287"/>
-    <w:bookmarkEnd w:id="288"/>
+    <w:bookmarkEnd w:id="293"/>
+    <w:bookmarkEnd w:id="294"/>
+    <w:bookmarkEnd w:id="295"/>
     <w:sectPr>
       <w:footnotePr>
         <w:numRestart w:val="eachSect"/>
@@ -20922,7 +21232,7 @@
       </w:r>
     </w:p>
   </w:footnote>
-  <w:footnote w:id="126">
+  <w:footnote w:id="131">
     <w:p>
       <w:pPr>
         <w:pStyle w:val="FootnoteText"/>
@@ -21295,34 +21605,7 @@
     <w:abstractNumId w:val="991"/>
   </w:num>
   <w:num w:numId="1019">
-    <w:abstractNumId w:val="99411"/>
-    <w:lvlOverride w:ilvl="0">
-      <w:startOverride w:val="1"/>
-    </w:lvlOverride>
-    <w:lvlOverride w:ilvl="1">
-      <w:startOverride w:val="1"/>
-    </w:lvlOverride>
-    <w:lvlOverride w:ilvl="2">
-      <w:startOverride w:val="1"/>
-    </w:lvlOverride>
-    <w:lvlOverride w:ilvl="3">
-      <w:startOverride w:val="1"/>
-    </w:lvlOverride>
-    <w:lvlOverride w:ilvl="4">
-      <w:startOverride w:val="1"/>
-    </w:lvlOverride>
-    <w:lvlOverride w:ilvl="5">
-      <w:startOverride w:val="1"/>
-    </w:lvlOverride>
-    <w:lvlOverride w:ilvl="6">
-      <w:startOverride w:val="1"/>
-    </w:lvlOverride>
-    <w:lvlOverride w:ilvl="7">
-      <w:startOverride w:val="1"/>
-    </w:lvlOverride>
-    <w:lvlOverride w:ilvl="8">
-      <w:startOverride w:val="1"/>
-    </w:lvlOverride>
+    <w:abstractNumId w:val="991"/>
   </w:num>
   <w:num w:numId="1020">
     <w:abstractNumId w:val="99411"/>
@@ -21355,7 +21638,34 @@
     </w:lvlOverride>
   </w:num>
   <w:num w:numId="1021">
-    <w:abstractNumId w:val="991"/>
+    <w:abstractNumId w:val="99411"/>
+    <w:lvlOverride w:ilvl="0">
+      <w:startOverride w:val="1"/>
+    </w:lvlOverride>
+    <w:lvlOverride w:ilvl="1">
+      <w:startOverride w:val="1"/>
+    </w:lvlOverride>
+    <w:lvlOverride w:ilvl="2">
+      <w:startOverride w:val="1"/>
+    </w:lvlOverride>
+    <w:lvlOverride w:ilvl="3">
+      <w:startOverride w:val="1"/>
+    </w:lvlOverride>
+    <w:lvlOverride w:ilvl="4">
+      <w:startOverride w:val="1"/>
+    </w:lvlOverride>
+    <w:lvlOverride w:ilvl="5">
+      <w:startOverride w:val="1"/>
+    </w:lvlOverride>
+    <w:lvlOverride w:ilvl="6">
+      <w:startOverride w:val="1"/>
+    </w:lvlOverride>
+    <w:lvlOverride w:ilvl="7">
+      <w:startOverride w:val="1"/>
+    </w:lvlOverride>
+    <w:lvlOverride w:ilvl="8">
+      <w:startOverride w:val="1"/>
+    </w:lvlOverride>
   </w:num>
   <w:num w:numId="1022">
     <w:abstractNumId w:val="991"/>
@@ -21397,6 +21707,9 @@
     <w:abstractNumId w:val="991"/>
   </w:num>
   <w:num w:numId="1035">
+    <w:abstractNumId w:val="991"/>
+  </w:num>
+  <w:num w:numId="1036">
     <w:abstractNumId w:val="99411"/>
     <w:lvlOverride w:ilvl="0">
       <w:startOverride w:val="1"/>
@@ -21426,13 +21739,13 @@
       <w:startOverride w:val="1"/>
     </w:lvlOverride>
   </w:num>
-  <w:num w:numId="1036">
-    <w:abstractNumId w:val="991"/>
-  </w:num>
   <w:num w:numId="1037">
     <w:abstractNumId w:val="991"/>
   </w:num>
   <w:num w:numId="1038">
+    <w:abstractNumId w:val="991"/>
+  </w:num>
+  <w:num w:numId="1039">
     <w:abstractNumId w:val="99411"/>
     <w:lvlOverride w:ilvl="0">
       <w:startOverride w:val="1"/>
@@ -21462,9 +21775,6 @@
       <w:startOverride w:val="1"/>
     </w:lvlOverride>
   </w:num>
-  <w:num w:numId="1039">
-    <w:abstractNumId w:val="991"/>
-  </w:num>
   <w:num w:numId="1040">
     <w:abstractNumId w:val="991"/>
   </w:num>
@@ -21472,34 +21782,7 @@
     <w:abstractNumId w:val="991"/>
   </w:num>
   <w:num w:numId="1042">
-    <w:abstractNumId w:val="99411"/>
-    <w:lvlOverride w:ilvl="0">
-      <w:startOverride w:val="1"/>
-    </w:lvlOverride>
-    <w:lvlOverride w:ilvl="1">
-      <w:startOverride w:val="1"/>
-    </w:lvlOverride>
-    <w:lvlOverride w:ilvl="2">
-      <w:startOverride w:val="1"/>
-    </w:lvlOverride>
-    <w:lvlOverride w:ilvl="3">
-      <w:startOverride w:val="1"/>
-    </w:lvlOverride>
-    <w:lvlOverride w:ilvl="4">
-      <w:startOverride w:val="1"/>
-    </w:lvlOverride>
-    <w:lvlOverride w:ilvl="5">
-      <w:startOverride w:val="1"/>
-    </w:lvlOverride>
-    <w:lvlOverride w:ilvl="6">
-      <w:startOverride w:val="1"/>
-    </w:lvlOverride>
-    <w:lvlOverride w:ilvl="7">
-      <w:startOverride w:val="1"/>
-    </w:lvlOverride>
-    <w:lvlOverride w:ilvl="8">
-      <w:startOverride w:val="1"/>
-    </w:lvlOverride>
+    <w:abstractNumId w:val="991"/>
   </w:num>
   <w:num w:numId="1043">
     <w:abstractNumId w:val="99411"/>
@@ -21532,24 +21815,6 @@
     </w:lvlOverride>
   </w:num>
   <w:num w:numId="1044">
-    <w:abstractNumId w:val="991"/>
-  </w:num>
-  <w:num w:numId="1045">
-    <w:abstractNumId w:val="991"/>
-  </w:num>
-  <w:num w:numId="1046">
-    <w:abstractNumId w:val="991"/>
-  </w:num>
-  <w:num w:numId="1047">
-    <w:abstractNumId w:val="991"/>
-  </w:num>
-  <w:num w:numId="1048">
-    <w:abstractNumId w:val="991"/>
-  </w:num>
-  <w:num w:numId="1049">
-    <w:abstractNumId w:val="991"/>
-  </w:num>
-  <w:num w:numId="1050">
     <w:abstractNumId w:val="99411"/>
     <w:lvlOverride w:ilvl="0">
       <w:startOverride w:val="1"/>
@@ -21579,8 +21844,53 @@
       <w:startOverride w:val="1"/>
     </w:lvlOverride>
   </w:num>
+  <w:num w:numId="1045">
+    <w:abstractNumId w:val="991"/>
+  </w:num>
+  <w:num w:numId="1046">
+    <w:abstractNumId w:val="991"/>
+  </w:num>
+  <w:num w:numId="1047">
+    <w:abstractNumId w:val="991"/>
+  </w:num>
+  <w:num w:numId="1048">
+    <w:abstractNumId w:val="991"/>
+  </w:num>
+  <w:num w:numId="1049">
+    <w:abstractNumId w:val="991"/>
+  </w:num>
+  <w:num w:numId="1050">
+    <w:abstractNumId w:val="991"/>
+  </w:num>
   <w:num w:numId="1051">
-    <w:abstractNumId w:val="991"/>
+    <w:abstractNumId w:val="99411"/>
+    <w:lvlOverride w:ilvl="0">
+      <w:startOverride w:val="1"/>
+    </w:lvlOverride>
+    <w:lvlOverride w:ilvl="1">
+      <w:startOverride w:val="1"/>
+    </w:lvlOverride>
+    <w:lvlOverride w:ilvl="2">
+      <w:startOverride w:val="1"/>
+    </w:lvlOverride>
+    <w:lvlOverride w:ilvl="3">
+      <w:startOverride w:val="1"/>
+    </w:lvlOverride>
+    <w:lvlOverride w:ilvl="4">
+      <w:startOverride w:val="1"/>
+    </w:lvlOverride>
+    <w:lvlOverride w:ilvl="5">
+      <w:startOverride w:val="1"/>
+    </w:lvlOverride>
+    <w:lvlOverride w:ilvl="6">
+      <w:startOverride w:val="1"/>
+    </w:lvlOverride>
+    <w:lvlOverride w:ilvl="7">
+      <w:startOverride w:val="1"/>
+    </w:lvlOverride>
+    <w:lvlOverride w:ilvl="8">
+      <w:startOverride w:val="1"/>
+    </w:lvlOverride>
   </w:num>
   <w:num w:numId="1052">
     <w:abstractNumId w:val="991"/>
@@ -21625,6 +21935,9 @@
     <w:abstractNumId w:val="991"/>
   </w:num>
   <w:num w:numId="1066">
+    <w:abstractNumId w:val="991"/>
+  </w:num>
+  <w:num w:numId="1067">
     <w:abstractNumId w:val="991"/>
   </w:num>
 </w:numbering>

</xml_diff>

<commit_message>
Deploying to gh-pages from @ Morrison-Lab/wai@602d257854c0c0384ceb5eb92a08d7b8643d8518 🚀
</commit_message>
<xml_diff>
--- a/chapters/coding-agents.docx
+++ b/chapters/coding-agents.docx
@@ -15,7 +15,7 @@
         <w:pStyle w:val="Date"/>
       </w:pPr>
       <w:r>
-        <w:t xml:space="preserve">Last modified: 2026-09-26 19:26:49 (PDT)</w:t>
+        <w:t xml:space="preserve">Last modified: 2026-09-27 01:26:56 (PDT)</w:t>
       </w:r>
     </w:p>
     <w:p>
@@ -1923,7 +1923,7 @@
           <w:rPr>
             <w:rStyle w:val="Hyperlink"/>
           </w:rPr>
-          <w:t xml:space="preserve">Section 18</w:t>
+          <w:t xml:space="preserve">Section 19</w:t>
         </w:r>
       </w:hyperlink>
       <w:r>
@@ -7799,13 +7799,13 @@
     </w:p>
     <w:bookmarkEnd w:id="124"/>
     <w:bookmarkEnd w:id="125"/>
-    <w:bookmarkStart w:id="130" w:name="sec-ai-andrew-ng-learning-to-code"/>
+    <w:bookmarkStart w:id="131" w:name="sec-ai-quicksilver"/>
     <w:p>
       <w:pPr>
         <w:pStyle w:val="Heading1"/>
       </w:pPr>
       <w:r>
-        <w:t xml:space="preserve">9. Andrew Ng on Learning to Code in the Age of AI</w:t>
+        <w:t xml:space="preserve">9. Delegating Bulk Judgments with Quicksilver</w:t>
       </w:r>
     </w:p>
     <w:p>
@@ -7813,6 +7813,452 @@
         <w:pStyle w:val="FirstParagraph"/>
       </w:pPr>
       <w:hyperlink r:id="rId126">
+        <w:r>
+          <w:rPr>
+            <w:rStyle w:val="Hyperlink"/>
+          </w:rPr>
+          <w:t xml:space="preserve">Issue #247</w:t>
+        </w:r>
+      </w:hyperlink>
+      <w:r>
+        <w:t xml:space="preserve"> </w:t>
+      </w:r>
+      <w:r>
+        <w:t xml:space="preserve">notes</w:t>
+      </w:r>
+      <w:r>
+        <w:t xml:space="preserve"> </w:t>
+      </w:r>
+      <w:hyperlink r:id="rId127">
+        <w:r>
+          <w:rPr>
+            <w:rStyle w:val="Hyperlink"/>
+          </w:rPr>
+          <w:t xml:space="preserve">Quicksilver</w:t>
+        </w:r>
+      </w:hyperlink>
+      <w:r>
+        <w:t xml:space="preserve">,</w:t>
+      </w:r>
+      <w:r>
+        <w:t xml:space="preserve"> </w:t>
+      </w:r>
+      <w:r>
+        <w:t xml:space="preserve">an open-source Claude Code skill and plugin authored by Udit Akhouri</w:t>
+      </w:r>
+      <w:r>
+        <w:t xml:space="preserve"> </w:t>
+      </w:r>
+      <w:r>
+        <w:t xml:space="preserve">(Akhouri 2026)</w:t>
+      </w:r>
+      <w:r>
+        <w:t xml:space="preserve">.</w:t>
+      </w:r>
+      <w:r>
+        <w:t xml:space="preserve"> </w:t>
+      </w:r>
+      <w:r>
+        <w:t xml:space="preserve">Quicksilver addresses a central inefficiency in agent workflows:</w:t>
+      </w:r>
+      <w:r>
+        <w:t xml:space="preserve"> </w:t>
+      </w:r>
+      <w:r>
+        <w:t xml:space="preserve">paying an expensive frontier model to skim hundreds of files, logs, or tickets</w:t>
+      </w:r>
+      <w:r>
+        <w:t xml:space="preserve"> </w:t>
+      </w:r>
+      <w:r>
+        <w:t xml:space="preserve">just to determine which subset actually requires deep analysis.</w:t>
+      </w:r>
+    </w:p>
+    <w:bookmarkStart w:id="128" w:name="X78450bc5e036d9c8efc617e75afba8966a6d537"/>
+    <w:p>
+      <w:pPr>
+        <w:pStyle w:val="Heading4"/>
+      </w:pPr>
+      <w:r>
+        <w:t xml:space="preserve">Delegating bulk judgment to lightweight models</w:t>
+      </w:r>
+    </w:p>
+    <w:p>
+      <w:pPr>
+        <w:pStyle w:val="FirstParagraph"/>
+      </w:pPr>
+      <w:r>
+        <w:t xml:space="preserve">When asked questions such as</w:t>
+      </w:r>
+      <w:r>
+        <w:t xml:space="preserve"> </w:t>
+      </w:r>
+      <w:r>
+        <w:t xml:space="preserve">“which files handle authentication?”</w:t>
+      </w:r>
+      <w:r>
+        <w:t xml:space="preserve"> </w:t>
+      </w:r>
+      <w:r>
+        <w:t xml:space="preserve">or</w:t>
+      </w:r>
+      <w:r>
+        <w:t xml:space="preserve"> </w:t>
+      </w:r>
+      <w:r>
+        <w:t xml:space="preserve">“which lines report errors?”</w:t>
+      </w:r>
+      <w:r>
+        <w:t xml:space="preserve">,</w:t>
+      </w:r>
+      <w:r>
+        <w:t xml:space="preserve"> </w:t>
+      </w:r>
+      <w:r>
+        <w:t xml:space="preserve">a frontier model typically reads every candidate file or log line into its context window.</w:t>
+      </w:r>
+      <w:r>
+        <w:t xml:space="preserve"> </w:t>
+      </w:r>
+      <w:r>
+        <w:t xml:space="preserve">This process burns thousands of tokens on routine filtering, fills the context with irrelevant noise,</w:t>
+      </w:r>
+      <w:r>
+        <w:t xml:space="preserve"> </w:t>
+      </w:r>
+      <w:r>
+        <w:t xml:space="preserve">and rapidly approaches session usage limits.</w:t>
+      </w:r>
+    </w:p>
+    <w:p>
+      <w:pPr>
+        <w:pStyle w:val="BodyText"/>
+      </w:pPr>
+      <w:r>
+        <w:t xml:space="preserve">Quicksilver restructures this workflow by routing candidate items to Jev,</w:t>
+      </w:r>
+      <w:r>
+        <w:t xml:space="preserve"> </w:t>
+      </w:r>
+      <w:r>
+        <w:t xml:space="preserve">a lightweight model from TypeSafe designed for high-throughput System One judgment.</w:t>
+      </w:r>
+      <w:r>
+        <w:t xml:space="preserve"> </w:t>
+      </w:r>
+      <w:r>
+        <w:t xml:space="preserve">Jev evaluates items in parallel and returns typed verdicts (boolean flags, categorical labels, or scores)</w:t>
+      </w:r>
+      <w:r>
+        <w:t xml:space="preserve"> </w:t>
+      </w:r>
+      <w:r>
+        <w:t xml:space="preserve">in approximately one second at a fraction of frontier model pricing ($0.042 per million input tokens, with free output tokens).</w:t>
+      </w:r>
+      <w:r>
+        <w:t xml:space="preserve"> </w:t>
+      </w:r>
+      <w:r>
+        <w:t xml:space="preserve">Claude receives only a filtered shortlist of relevant items with confidence ratings,</w:t>
+      </w:r>
+      <w:r>
+        <w:t xml:space="preserve"> </w:t>
+      </w:r>
+      <w:r>
+        <w:t xml:space="preserve">reserving its reasoning tokens for synthesis, refactoring, and code changes.</w:t>
+      </w:r>
+    </w:p>
+    <w:bookmarkEnd w:id="128"/>
+    <w:bookmarkStart w:id="129" w:name="measured-benchmark-results"/>
+    <w:p>
+      <w:pPr>
+        <w:pStyle w:val="Heading4"/>
+      </w:pPr>
+      <w:r>
+        <w:t xml:space="preserve">Measured benchmark results</w:t>
+      </w:r>
+    </w:p>
+    <w:p>
+      <w:pPr>
+        <w:pStyle w:val="FirstParagraph"/>
+      </w:pPr>
+      <w:r>
+        <w:t xml:space="preserve">On a benchmark of twelve real-world tasks across public datasets</w:t>
+      </w:r>
+      <w:r>
+        <w:t xml:space="preserve"> </w:t>
+      </w:r>
+      <w:r>
+        <w:t xml:space="preserve">(including supercomputer logs,</w:t>
+      </w:r>
+      <w:r>
+        <w:t xml:space="preserve"> </w:t>
+      </w:r>
+      <w:r>
+        <w:rPr>
+          <w:rStyle w:val="VerbatimChar"/>
+        </w:rPr>
+        <w:t xml:space="preserve">Banking77</w:t>
+      </w:r>
+      <w:r>
+        <w:t xml:space="preserve"> </w:t>
+      </w:r>
+      <w:r>
+        <w:t xml:space="preserve">intent classification, UCI SMS spam,</w:t>
+      </w:r>
+      <w:r>
+        <w:t xml:space="preserve"> </w:t>
+      </w:r>
+      <w:r>
+        <w:rPr>
+          <w:rStyle w:val="VerbatimChar"/>
+        </w:rPr>
+        <w:t xml:space="preserve">SST-2</w:t>
+      </w:r>
+      <w:r>
+        <w:t xml:space="preserve"> </w:t>
+      </w:r>
+      <w:r>
+        <w:t xml:space="preserve">sentiment analysis,</w:t>
+      </w:r>
+      <w:r>
+        <w:t xml:space="preserve"> </w:t>
+      </w:r>
+      <w:r>
+        <w:t xml:space="preserve">the Hono repository, and</w:t>
+      </w:r>
+      <w:r>
+        <w:t xml:space="preserve"> </w:t>
+      </w:r>
+      <w:r>
+        <w:rPr>
+          <w:rStyle w:val="VerbatimChar"/>
+        </w:rPr>
+        <w:t xml:space="preserve">lodash</w:t>
+      </w:r>
+      <w:r>
+        <w:t xml:space="preserve"> </w:t>
+      </w:r>
+      <w:r>
+        <w:t xml:space="preserve">source code)</w:t>
+      </w:r>
+      <w:r>
+        <w:t xml:space="preserve"> </w:t>
+      </w:r>
+      <w:r>
+        <w:t xml:space="preserve">(Akhouri 2026)</w:t>
+      </w:r>
+      <w:r>
+        <w:t xml:space="preserve">:</w:t>
+      </w:r>
+    </w:p>
+    <w:p>
+      <w:pPr>
+        <w:pStyle w:val="Compact"/>
+        <w:numPr>
+          <w:ilvl w:val="0"/>
+          <w:numId w:val="1016"/>
+        </w:numPr>
+      </w:pPr>
+      <w:r>
+        <w:rPr>
+          <w:b/>
+          <w:bCs/>
+        </w:rPr>
+        <w:t xml:space="preserve">Token reduction:</w:t>
+      </w:r>
+      <w:r>
+        <w:t xml:space="preserve"> </w:t>
+      </w:r>
+      <w:r>
+        <w:t xml:space="preserve">Claude token consumption was reduced by an average of 86 percent (median 82 percent).</w:t>
+      </w:r>
+    </w:p>
+    <w:p>
+      <w:pPr>
+        <w:pStyle w:val="Compact"/>
+        <w:numPr>
+          <w:ilvl w:val="0"/>
+          <w:numId w:val="1016"/>
+        </w:numPr>
+      </w:pPr>
+      <w:r>
+        <w:rPr>
+          <w:b/>
+          <w:bCs/>
+        </w:rPr>
+        <w:t xml:space="preserve">Execution speed:</w:t>
+      </w:r>
+      <w:r>
+        <w:t xml:space="preserve"> </w:t>
+      </w:r>
+      <w:r>
+        <w:t xml:space="preserve">Tasks involving needle-in-haystack search and log triage completed up to 20 times faster.</w:t>
+      </w:r>
+    </w:p>
+    <w:p>
+      <w:pPr>
+        <w:pStyle w:val="Compact"/>
+        <w:numPr>
+          <w:ilvl w:val="0"/>
+          <w:numId w:val="1016"/>
+        </w:numPr>
+      </w:pPr>
+      <w:r>
+        <w:rPr>
+          <w:b/>
+          <w:bCs/>
+        </w:rPr>
+        <w:t xml:space="preserve">Accuracy parity:</w:t>
+      </w:r>
+      <w:r>
+        <w:t xml:space="preserve"> </w:t>
+      </w:r>
+      <w:r>
+        <w:t xml:space="preserve">Quicksilver matched Claude’s baseline accuracy on 8 of the 12 evaluation tasks.</w:t>
+      </w:r>
+    </w:p>
+    <w:bookmarkEnd w:id="129"/>
+    <w:bookmarkStart w:id="130" w:name="X33262b616c7a0ee56dc81b8b51ca8e3de581b06"/>
+    <w:p>
+      <w:pPr>
+        <w:pStyle w:val="Heading4"/>
+      </w:pPr>
+      <w:r>
+        <w:t xml:space="preserve">Appropriate use cases and boundary conditions</w:t>
+      </w:r>
+    </w:p>
+    <w:p>
+      <w:pPr>
+        <w:pStyle w:val="FirstParagraph"/>
+      </w:pPr>
+      <w:r>
+        <w:t xml:space="preserve">Quicksilver is most effective when tasks can be formulated as a narrow, typed judgment:</w:t>
+      </w:r>
+    </w:p>
+    <w:p>
+      <w:pPr>
+        <w:pStyle w:val="Compact"/>
+        <w:numPr>
+          <w:ilvl w:val="0"/>
+          <w:numId w:val="1017"/>
+        </w:numPr>
+      </w:pPr>
+      <w:r>
+        <w:rPr>
+          <w:b/>
+          <w:bCs/>
+        </w:rPr>
+        <w:t xml:space="preserve">Needle-in-haystack scans:</w:t>
+      </w:r>
+      <w:r>
+        <w:t xml:space="preserve"> </w:t>
+      </w:r>
+      <w:r>
+        <w:t xml:space="preserve">Locating relevant implementation files across a multi-hundred-file repository,</w:t>
+      </w:r>
+      <w:r>
+        <w:t xml:space="preserve"> </w:t>
+      </w:r>
+      <w:r>
+        <w:t xml:space="preserve">pinpointing rare error signatures in multi-thousand-line server logs,</w:t>
+      </w:r>
+      <w:r>
+        <w:t xml:space="preserve"> </w:t>
+      </w:r>
+      <w:r>
+        <w:t xml:space="preserve">or isolating target helper routines in large single-file modules.</w:t>
+      </w:r>
+    </w:p>
+    <w:p>
+      <w:pPr>
+        <w:pStyle w:val="Compact"/>
+        <w:numPr>
+          <w:ilvl w:val="0"/>
+          <w:numId w:val="1017"/>
+        </w:numPr>
+      </w:pPr>
+      <w:r>
+        <w:rPr>
+          <w:b/>
+          <w:bCs/>
+        </w:rPr>
+        <w:t xml:space="preserve">Structured ticket and log classification:</w:t>
+      </w:r>
+      <w:r>
+        <w:t xml:space="preserve"> </w:t>
+      </w:r>
+      <w:r>
+        <w:t xml:space="preserve">Categorizing user requests or triage items against closed label sets.</w:t>
+      </w:r>
+    </w:p>
+    <w:p>
+      <w:pPr>
+        <w:pStyle w:val="Compact"/>
+        <w:numPr>
+          <w:ilvl w:val="0"/>
+          <w:numId w:val="1017"/>
+        </w:numPr>
+      </w:pPr>
+      <w:r>
+        <w:rPr>
+          <w:b/>
+          <w:bCs/>
+        </w:rPr>
+        <w:t xml:space="preserve">Borderline case review:</w:t>
+      </w:r>
+      <w:r>
+        <w:t xml:space="preserve"> </w:t>
+      </w:r>
+      <w:r>
+        <w:t xml:space="preserve">Quicksilver flags ambiguous or borderline items (annotated with a question mark),</w:t>
+      </w:r>
+      <w:r>
+        <w:t xml:space="preserve"> </w:t>
+      </w:r>
+      <w:r>
+        <w:t xml:space="preserve">enabling Claude to inspect only the uncertain cases rather than the entire corpus.</w:t>
+      </w:r>
+    </w:p>
+    <w:p>
+      <w:pPr>
+        <w:pStyle w:val="FirstParagraph"/>
+      </w:pPr>
+      <w:r>
+        <w:t xml:space="preserve">Quicksilver is not intended for authoring code, complex multi-step reasoning, or tasks that deterministic tools like</w:t>
+      </w:r>
+      <w:r>
+        <w:t xml:space="preserve"> </w:t>
+      </w:r>
+      <w:r>
+        <w:rPr>
+          <w:rStyle w:val="VerbatimChar"/>
+        </w:rPr>
+        <w:t xml:space="preserve">grep</w:t>
+      </w:r>
+      <w:r>
+        <w:t xml:space="preserve"> </w:t>
+      </w:r>
+      <w:r>
+        <w:t xml:space="preserve">can answer directly.</w:t>
+      </w:r>
+    </w:p>
+    <w:bookmarkEnd w:id="130"/>
+    <w:bookmarkEnd w:id="131"/>
+    <w:bookmarkStart w:id="136" w:name="sec-ai-andrew-ng-learning-to-code"/>
+    <w:p>
+      <w:pPr>
+        <w:pStyle w:val="Heading1"/>
+      </w:pPr>
+      <w:r>
+        <w:t xml:space="preserve">10. Andrew Ng on Learning to Code in the Age of AI</w:t>
+      </w:r>
+    </w:p>
+    <w:p>
+      <w:pPr>
+        <w:pStyle w:val="FirstParagraph"/>
+      </w:pPr>
+      <w:hyperlink r:id="rId132">
         <w:r>
           <w:rPr>
             <w:rStyle w:val="Hyperlink"/>
@@ -7875,7 +8321,7 @@
         <w:t xml:space="preserve">“What’s one skill professionals should start learning now if they want to stay relevant in the age of AI?”</w:t>
       </w:r>
     </w:p>
-    <w:bookmarkStart w:id="127" w:name="X2585d35de08cc404764c5b3e676c5fcc497846e"/>
+    <w:bookmarkStart w:id="133" w:name="X2585d35de08cc404764c5b3e676c5fcc497846e"/>
     <w:p>
       <w:pPr>
         <w:pStyle w:val="Heading4"/>
@@ -7916,8 +8362,8 @@
         <w:t xml:space="preserve">across all organizational roles rather than only within software engineering.</w:t>
       </w:r>
     </w:p>
-    <w:bookmarkEnd w:id="127"/>
-    <w:bookmarkStart w:id="128" w:name="X9429e6d799a3fcf433b7cb54e1628b26ec04661"/>
+    <w:bookmarkEnd w:id="133"/>
+    <w:bookmarkStart w:id="134" w:name="X9429e6d799a3fcf433b7cb54e1628b26ec04661"/>
     <w:p>
       <w:pPr>
         <w:pStyle w:val="Heading4"/>
@@ -7965,7 +8411,7 @@
         <w:pStyle w:val="Compact"/>
         <w:numPr>
           <w:ilvl w:val="0"/>
-          <w:numId w:val="1016"/>
+          <w:numId w:val="1018"/>
         </w:numPr>
       </w:pPr>
       <w:r>
@@ -7993,7 +8439,7 @@
         <w:pStyle w:val="Compact"/>
         <w:numPr>
           <w:ilvl w:val="0"/>
-          <w:numId w:val="1016"/>
+          <w:numId w:val="1018"/>
         </w:numPr>
       </w:pPr>
       <w:r>
@@ -8016,8 +8462,8 @@
         <w:t xml:space="preserve">instead of manually reviewing hundreds of candidates by hand.</w:t>
       </w:r>
     </w:p>
-    <w:bookmarkEnd w:id="128"/>
-    <w:bookmarkStart w:id="129" w:name="countering-the-advice-to-abandon-coding"/>
+    <w:bookmarkEnd w:id="134"/>
+    <w:bookmarkStart w:id="135" w:name="countering-the-advice-to-abandon-coding"/>
     <w:p>
       <w:pPr>
         <w:pStyle w:val="Heading4"/>
@@ -8070,15 +8516,15 @@
         <w:t xml:space="preserve">amplifies individual effectiveness in every profession.</w:t>
       </w:r>
     </w:p>
-    <w:bookmarkEnd w:id="129"/>
-    <w:bookmarkEnd w:id="130"/>
-    <w:bookmarkStart w:id="134" w:name="sec-ai-when-to-use"/>
+    <w:bookmarkEnd w:id="135"/>
+    <w:bookmarkEnd w:id="136"/>
+    <w:bookmarkStart w:id="140" w:name="sec-ai-when-to-use"/>
     <w:p>
       <w:pPr>
         <w:pStyle w:val="Heading1"/>
       </w:pPr>
       <w:r>
-        <w:t xml:space="preserve">10. When to use a coding agent</w:t>
+        <w:t xml:space="preserve">11. When to use a coding agent</w:t>
       </w:r>
     </w:p>
     <w:p>
@@ -8092,7 +8538,7 @@
         <w:rPr>
           <w:rStyle w:val="FootnoteReference"/>
         </w:rPr>
-        <w:footnoteReference w:id="131"/>
+        <w:footnoteReference w:id="137"/>
       </w:r>
       <w:r>
         <w:t xml:space="preserve"> </w:t>
@@ -8124,7 +8570,7 @@
       <w:r>
         <w:t xml:space="preserve"> </w:t>
       </w:r>
-      <w:hyperlink r:id="rId132">
+      <w:hyperlink r:id="rId138">
         <w:r>
           <w:rPr>
             <w:rStyle w:val="Hyperlink"/>
@@ -8183,7 +8629,7 @@
       <w:r>
         <w:t xml:space="preserve"> </w:t>
       </w:r>
-      <w:hyperlink r:id="rId133">
+      <w:hyperlink r:id="rId139">
         <w:r>
           <w:rPr>
             <w:rStyle w:val="Hyperlink"/>
@@ -8302,14 +8748,14 @@
         <w:t xml:space="preserve">just like you would for any other skill you want to maintain.</w:t>
       </w:r>
     </w:p>
-    <w:bookmarkEnd w:id="134"/>
-    <w:bookmarkStart w:id="155" w:name="sec-ai-research-modes"/>
+    <w:bookmarkEnd w:id="140"/>
+    <w:bookmarkStart w:id="161" w:name="sec-ai-research-modes"/>
     <w:p>
       <w:pPr>
         <w:pStyle w:val="Heading1"/>
       </w:pPr>
       <w:r>
-        <w:t xml:space="preserve">11. Deep Research Modes</w:t>
+        <w:t xml:space="preserve">12. Deep Research Modes</w:t>
       </w:r>
     </w:p>
     <w:p>
@@ -8393,7 +8839,7 @@
         <w:pStyle w:val="Compact"/>
         <w:numPr>
           <w:ilvl w:val="0"/>
-          <w:numId w:val="1017"/>
+          <w:numId w:val="1019"/>
         </w:numPr>
       </w:pPr>
       <w:r>
@@ -8405,7 +8851,7 @@
         <w:pStyle w:val="Compact"/>
         <w:numPr>
           <w:ilvl w:val="0"/>
-          <w:numId w:val="1017"/>
+          <w:numId w:val="1019"/>
         </w:numPr>
       </w:pPr>
       <w:r>
@@ -8417,7 +8863,7 @@
         <w:pStyle w:val="Compact"/>
         <w:numPr>
           <w:ilvl w:val="0"/>
-          <w:numId w:val="1017"/>
+          <w:numId w:val="1019"/>
         </w:numPr>
       </w:pPr>
       <w:r>
@@ -8429,7 +8875,7 @@
         <w:pStyle w:val="Compact"/>
         <w:numPr>
           <w:ilvl w:val="0"/>
-          <w:numId w:val="1017"/>
+          <w:numId w:val="1019"/>
         </w:numPr>
       </w:pPr>
       <w:r>
@@ -8441,7 +8887,7 @@
         <w:pStyle w:val="Compact"/>
         <w:numPr>
           <w:ilvl w:val="0"/>
-          <w:numId w:val="1017"/>
+          <w:numId w:val="1019"/>
         </w:numPr>
       </w:pPr>
       <w:r>
@@ -8498,7 +8944,7 @@
         <w:t xml:space="preserve">vendors change plan limits often, so re-check before relying on one.</w:t>
       </w:r>
     </w:p>
-    <w:bookmarkStart w:id="137" w:name="claude-research"/>
+    <w:bookmarkStart w:id="143" w:name="claude-research"/>
     <w:p>
       <w:pPr>
         <w:pStyle w:val="Heading4"/>
@@ -8511,7 +8957,7 @@
       <w:pPr>
         <w:pStyle w:val="FirstParagraph"/>
       </w:pPr>
-      <w:hyperlink r:id="rId135">
+      <w:hyperlink r:id="rId141">
         <w:r>
           <w:rPr>
             <w:rStyle w:val="Hyperlink"/>
@@ -8670,7 +9116,7 @@
       <w:r>
         <w:t xml:space="preserve"> </w:t>
       </w:r>
-      <w:hyperlink r:id="rId136">
+      <w:hyperlink r:id="rId142">
         <w:r>
           <w:rPr>
             <w:rStyle w:val="Hyperlink"/>
@@ -8745,8 +9191,8 @@
         <w:t xml:space="preserve">not something you call.</w:t>
       </w:r>
     </w:p>
-    <w:bookmarkEnd w:id="137"/>
-    <w:bookmarkStart w:id="140" w:name="gemini-deep-research"/>
+    <w:bookmarkEnd w:id="143"/>
+    <w:bookmarkStart w:id="146" w:name="gemini-deep-research"/>
     <w:p>
       <w:pPr>
         <w:pStyle w:val="Heading4"/>
@@ -8759,7 +9205,7 @@
       <w:pPr>
         <w:pStyle w:val="FirstParagraph"/>
       </w:pPr>
-      <w:hyperlink r:id="rId138">
+      <w:hyperlink r:id="rId144">
         <w:r>
           <w:rPr>
             <w:rStyle w:val="Hyperlink"/>
@@ -8915,7 +9361,7 @@
       <w:r>
         <w:t xml:space="preserve"> </w:t>
       </w:r>
-      <w:hyperlink r:id="rId139">
+      <w:hyperlink r:id="rId145">
         <w:r>
           <w:rPr>
             <w:rStyle w:val="Hyperlink"/>
@@ -9032,8 +9478,8 @@
         <w:t xml:space="preserve">and the docs estimate $1-3 per standard task and $3-7 per Max task.</w:t>
       </w:r>
     </w:p>
-    <w:bookmarkEnd w:id="140"/>
-    <w:bookmarkStart w:id="143" w:name="chatgpt-deep-research"/>
+    <w:bookmarkEnd w:id="146"/>
+    <w:bookmarkStart w:id="149" w:name="chatgpt-deep-research"/>
     <w:p>
       <w:pPr>
         <w:pStyle w:val="Heading4"/>
@@ -9046,7 +9492,7 @@
       <w:pPr>
         <w:pStyle w:val="FirstParagraph"/>
       </w:pPr>
-      <w:hyperlink r:id="rId141">
+      <w:hyperlink r:id="rId147">
         <w:r>
           <w:rPr>
             <w:rStyle w:val="Hyperlink"/>
@@ -9187,7 +9633,7 @@
       <w:r>
         <w:t xml:space="preserve"> </w:t>
       </w:r>
-      <w:hyperlink r:id="rId142">
+      <w:hyperlink r:id="rId148">
         <w:r>
           <w:rPr>
             <w:rStyle w:val="Hyperlink"/>
@@ -9274,8 +9720,8 @@
         <w:t xml:space="preserve">Output carries inline citations as annotations with a URL, title, and character offsets.</w:t>
       </w:r>
     </w:p>
-    <w:bookmarkEnd w:id="143"/>
-    <w:bookmarkStart w:id="146" w:name="Xc017de845cc5a3087b50d6c735b9b56e74687ad"/>
+    <w:bookmarkEnd w:id="149"/>
+    <w:bookmarkStart w:id="152" w:name="Xc017de845cc5a3087b50d6c735b9b56e74687ad"/>
     <w:p>
       <w:pPr>
         <w:pStyle w:val="Heading4"/>
@@ -9318,7 +9764,7 @@
       <w:r>
         <w:t xml:space="preserve"> </w:t>
       </w:r>
-      <w:hyperlink r:id="rId144">
+      <w:hyperlink r:id="rId150">
         <w:r>
           <w:rPr>
             <w:rStyle w:val="Hyperlink"/>
@@ -9513,7 +9959,7 @@
       <w:r>
         <w:t xml:space="preserve"> </w:t>
       </w:r>
-      <w:hyperlink r:id="rId145">
+      <w:hyperlink r:id="rId151">
         <w:r>
           <w:rPr>
             <w:rStyle w:val="Hyperlink"/>
@@ -9570,8 +10016,8 @@
         <w:t xml:space="preserve">not of Researcher.</w:t>
       </w:r>
     </w:p>
-    <w:bookmarkEnd w:id="146"/>
-    <w:bookmarkStart w:id="150" w:name="perplexity-research"/>
+    <w:bookmarkEnd w:id="152"/>
+    <w:bookmarkStart w:id="156" w:name="perplexity-research"/>
     <w:p>
       <w:pPr>
         <w:pStyle w:val="Heading4"/>
@@ -9584,7 +10030,7 @@
       <w:pPr>
         <w:pStyle w:val="FirstParagraph"/>
       </w:pPr>
-      <w:hyperlink r:id="rId147">
+      <w:hyperlink r:id="rId153">
         <w:r>
           <w:rPr>
             <w:rStyle w:val="Hyperlink"/>
@@ -9658,7 +10104,7 @@
       <w:r>
         <w:t xml:space="preserve"> </w:t>
       </w:r>
-      <w:hyperlink r:id="rId148">
+      <w:hyperlink r:id="rId154">
         <w:r>
           <w:rPr>
             <w:rStyle w:val="Hyperlink"/>
@@ -9731,7 +10177,7 @@
       <w:r>
         <w:t xml:space="preserve"> </w:t>
       </w:r>
-      <w:hyperlink r:id="rId149">
+      <w:hyperlink r:id="rId155">
         <w:r>
           <w:rPr>
             <w:rStyle w:val="VerbatimChar"/>
@@ -9791,8 +10237,8 @@
         <w:t xml:space="preserve">with the old interface supported until 2026-09-27.</w:t>
       </w:r>
     </w:p>
-    <w:bookmarkEnd w:id="150"/>
-    <w:bookmarkStart w:id="151" w:name="comparison"/>
+    <w:bookmarkEnd w:id="156"/>
+    <w:bookmarkStart w:id="157" w:name="comparison"/>
     <w:p>
       <w:pPr>
         <w:pStyle w:val="Heading4"/>
@@ -10425,8 +10871,8 @@
         </w:tc>
       </w:tr>
     </w:tbl>
-    <w:bookmarkEnd w:id="151"/>
-    <w:bookmarkStart w:id="154" w:name="useful-to-us"/>
+    <w:bookmarkEnd w:id="157"/>
+    <w:bookmarkStart w:id="160" w:name="useful-to-us"/>
     <w:p>
       <w:pPr>
         <w:pStyle w:val="Heading4"/>
@@ -10515,7 +10961,7 @@
       <w:r>
         <w:t xml:space="preserve"> </w:t>
       </w:r>
-      <w:hyperlink r:id="rId152">
+      <w:hyperlink r:id="rId158">
         <w:r>
           <w:rPr>
             <w:rStyle w:val="Hyperlink"/>
@@ -10603,7 +11049,7 @@
           <w:rPr>
             <w:rStyle w:val="Hyperlink"/>
           </w:rPr>
-          <w:t xml:space="preserve">Section 10</w:t>
+          <w:t xml:space="preserve">Section 11</w:t>
         </w:r>
       </w:hyperlink>
       <w:r>
@@ -10638,7 +11084,7 @@
         <w:pStyle w:val="Compact"/>
         <w:numPr>
           <w:ilvl w:val="0"/>
-          <w:numId w:val="1018"/>
+          <w:numId w:val="1020"/>
         </w:numPr>
       </w:pPr>
       <w:r>
@@ -10672,7 +11118,7 @@
       <w:r>
         <w:t xml:space="preserve">and budget them like any other agent spend (</w:t>
       </w:r>
-      <w:hyperlink r:id="rId153">
+      <w:hyperlink r:id="rId159">
         <w:r>
           <w:rPr>
             <w:rStyle w:val="Hyperlink"/>
@@ -10689,7 +11135,7 @@
         <w:pStyle w:val="Compact"/>
         <w:numPr>
           <w:ilvl w:val="0"/>
-          <w:numId w:val="1018"/>
+          <w:numId w:val="1020"/>
         </w:numPr>
       </w:pPr>
       <w:r>
@@ -10718,15 +11164,15 @@
         <w:t xml:space="preserve">exactly as the fact-check rules in this manual require of any AI-drafted prose.</w:t>
       </w:r>
     </w:p>
-    <w:bookmarkEnd w:id="154"/>
-    <w:bookmarkEnd w:id="155"/>
-    <w:bookmarkStart w:id="166" w:name="how-to-work-with-coding-agents"/>
+    <w:bookmarkEnd w:id="160"/>
+    <w:bookmarkEnd w:id="161"/>
+    <w:bookmarkStart w:id="172" w:name="how-to-work-with-coding-agents"/>
     <w:p>
       <w:pPr>
         <w:pStyle w:val="Heading1"/>
       </w:pPr>
       <w:r>
-        <w:t xml:space="preserve">12. How to Work with Coding Agents</w:t>
+        <w:t xml:space="preserve">13. How to Work with Coding Agents</w:t>
       </w:r>
     </w:p>
     <w:p>
@@ -10755,7 +11201,7 @@
         <w:t xml:space="preserve">and collaboration style.</w:t>
       </w:r>
     </w:p>
-    <w:bookmarkStart w:id="156" w:name="ways-to-interact-with-coding-agents"/>
+    <w:bookmarkStart w:id="162" w:name="ways-to-interact-with-coding-agents"/>
     <w:p>
       <w:pPr>
         <w:pStyle w:val="Heading4"/>
@@ -10789,7 +11235,7 @@
         <w:pStyle w:val="Compact"/>
         <w:numPr>
           <w:ilvl w:val="0"/>
-          <w:numId w:val="1019"/>
+          <w:numId w:val="1021"/>
         </w:numPr>
       </w:pPr>
       <w:r>
@@ -10862,7 +11308,7 @@
         <w:pStyle w:val="Compact"/>
         <w:numPr>
           <w:ilvl w:val="0"/>
-          <w:numId w:val="1019"/>
+          <w:numId w:val="1021"/>
         </w:numPr>
       </w:pPr>
       <w:r>
@@ -10917,7 +11363,7 @@
         <w:pStyle w:val="Compact"/>
         <w:numPr>
           <w:ilvl w:val="0"/>
-          <w:numId w:val="1019"/>
+          <w:numId w:val="1021"/>
         </w:numPr>
       </w:pPr>
       <w:r>
@@ -10972,7 +11418,7 @@
         <w:pStyle w:val="Compact"/>
         <w:numPr>
           <w:ilvl w:val="0"/>
-          <w:numId w:val="1019"/>
+          <w:numId w:val="1021"/>
         </w:numPr>
       </w:pPr>
       <w:r>
@@ -11056,8 +11502,8 @@
         <w:t xml:space="preserve">for assigning and managing coding tasks.</w:t>
       </w:r>
     </w:p>
-    <w:bookmarkEnd w:id="156"/>
-    <w:bookmarkStart w:id="157" w:name="assigning-issues-to-copilot"/>
+    <w:bookmarkEnd w:id="162"/>
+    <w:bookmarkStart w:id="163" w:name="assigning-issues-to-copilot"/>
     <w:p>
       <w:pPr>
         <w:pStyle w:val="Heading4"/>
@@ -11093,7 +11539,7 @@
       <w:pPr>
         <w:numPr>
           <w:ilvl w:val="0"/>
-          <w:numId w:val="1020"/>
+          <w:numId w:val="1022"/>
         </w:numPr>
       </w:pPr>
       <w:r>
@@ -11117,7 +11563,7 @@
       <w:pPr>
         <w:numPr>
           <w:ilvl w:val="0"/>
-          <w:numId w:val="1020"/>
+          <w:numId w:val="1022"/>
         </w:numPr>
       </w:pPr>
       <w:r>
@@ -11153,7 +11599,7 @@
       <w:pPr>
         <w:numPr>
           <w:ilvl w:val="0"/>
-          <w:numId w:val="1020"/>
+          <w:numId w:val="1022"/>
         </w:numPr>
       </w:pPr>
       <w:r>
@@ -11173,8 +11619,8 @@
         <w:t xml:space="preserve">Delegate tasks to Copilot directly from the chat interface in supported editors</w:t>
       </w:r>
     </w:p>
-    <w:bookmarkEnd w:id="157"/>
-    <w:bookmarkStart w:id="158" w:name="the-agent-workflow"/>
+    <w:bookmarkEnd w:id="163"/>
+    <w:bookmarkStart w:id="164" w:name="the-agent-workflow"/>
     <w:p>
       <w:pPr>
         <w:pStyle w:val="Heading4"/>
@@ -11201,7 +11647,7 @@
       <w:pPr>
         <w:numPr>
           <w:ilvl w:val="0"/>
-          <w:numId w:val="1021"/>
+          <w:numId w:val="1023"/>
         </w:numPr>
       </w:pPr>
       <w:r>
@@ -11243,7 +11689,7 @@
       <w:pPr>
         <w:numPr>
           <w:ilvl w:val="0"/>
-          <w:numId w:val="1021"/>
+          <w:numId w:val="1023"/>
         </w:numPr>
       </w:pPr>
       <w:r>
@@ -11267,7 +11713,7 @@
       <w:pPr>
         <w:numPr>
           <w:ilvl w:val="0"/>
-          <w:numId w:val="1021"/>
+          <w:numId w:val="1023"/>
         </w:numPr>
       </w:pPr>
       <w:r>
@@ -11309,7 +11755,7 @@
       <w:pPr>
         <w:numPr>
           <w:ilvl w:val="0"/>
-          <w:numId w:val="1021"/>
+          <w:numId w:val="1023"/>
         </w:numPr>
       </w:pPr>
       <w:r>
@@ -11345,7 +11791,7 @@
       <w:pPr>
         <w:numPr>
           <w:ilvl w:val="0"/>
-          <w:numId w:val="1021"/>
+          <w:numId w:val="1023"/>
         </w:numPr>
       </w:pPr>
       <w:r>
@@ -11371,8 +11817,8 @@
         <w:t xml:space="preserve">the agent will iterate based on your feedback</w:t>
       </w:r>
     </w:p>
-    <w:bookmarkEnd w:id="158"/>
-    <w:bookmarkStart w:id="159" w:name="collaborating-with-coding-agents"/>
+    <w:bookmarkEnd w:id="164"/>
+    <w:bookmarkStart w:id="165" w:name="collaborating-with-coding-agents"/>
     <w:p>
       <w:pPr>
         <w:pStyle w:val="Heading4"/>
@@ -11405,7 +11851,7 @@
       <w:pPr>
         <w:numPr>
           <w:ilvl w:val="0"/>
-          <w:numId w:val="1022"/>
+          <w:numId w:val="1024"/>
         </w:numPr>
       </w:pPr>
       <w:r>
@@ -11435,7 +11881,7 @@
       <w:pPr>
         <w:numPr>
           <w:ilvl w:val="0"/>
-          <w:numId w:val="1022"/>
+          <w:numId w:val="1024"/>
         </w:numPr>
       </w:pPr>
       <w:r>
@@ -11481,7 +11927,7 @@
         <w:pStyle w:val="Compact"/>
         <w:numPr>
           <w:ilvl w:val="0"/>
-          <w:numId w:val="1023"/>
+          <w:numId w:val="1025"/>
         </w:numPr>
       </w:pPr>
       <w:r>
@@ -11493,7 +11939,7 @@
         <w:pStyle w:val="Compact"/>
         <w:numPr>
           <w:ilvl w:val="0"/>
-          <w:numId w:val="1023"/>
+          <w:numId w:val="1025"/>
         </w:numPr>
       </w:pPr>
       <w:r>
@@ -11505,7 +11951,7 @@
         <w:pStyle w:val="Compact"/>
         <w:numPr>
           <w:ilvl w:val="0"/>
-          <w:numId w:val="1023"/>
+          <w:numId w:val="1025"/>
         </w:numPr>
       </w:pPr>
       <w:r>
@@ -11545,8 +11991,8 @@
         <w:t xml:space="preserve">Then assign new work to the agent for the next iteration.</w:t>
       </w:r>
     </w:p>
-    <w:bookmarkEnd w:id="159"/>
-    <w:bookmarkStart w:id="160" w:name="directly-prompting-for-pull-requests"/>
+    <w:bookmarkEnd w:id="165"/>
+    <w:bookmarkStart w:id="166" w:name="directly-prompting-for-pull-requests"/>
     <w:p>
       <w:pPr>
         <w:pStyle w:val="Heading4"/>
@@ -11568,7 +12014,7 @@
         <w:pStyle w:val="Compact"/>
         <w:numPr>
           <w:ilvl w:val="0"/>
-          <w:numId w:val="1024"/>
+          <w:numId w:val="1026"/>
         </w:numPr>
       </w:pPr>
       <w:r>
@@ -11580,7 +12026,7 @@
         <w:pStyle w:val="Compact"/>
         <w:numPr>
           <w:ilvl w:val="0"/>
-          <w:numId w:val="1024"/>
+          <w:numId w:val="1026"/>
         </w:numPr>
       </w:pPr>
       <w:r>
@@ -11592,15 +12038,15 @@
         <w:pStyle w:val="Compact"/>
         <w:numPr>
           <w:ilvl w:val="0"/>
-          <w:numId w:val="1024"/>
+          <w:numId w:val="1026"/>
         </w:numPr>
       </w:pPr>
       <w:r>
         <w:t xml:space="preserve">This is useful for quick fixes or well-defined tasks</w:t>
       </w:r>
     </w:p>
-    <w:bookmarkEnd w:id="160"/>
-    <w:bookmarkStart w:id="161" w:name="important-safeguards"/>
+    <w:bookmarkEnd w:id="166"/>
+    <w:bookmarkStart w:id="167" w:name="important-safeguards"/>
     <w:p>
       <w:pPr>
         <w:pStyle w:val="Heading4"/>
@@ -11614,7 +12060,7 @@
         <w:pStyle w:val="Compact"/>
         <w:numPr>
           <w:ilvl w:val="0"/>
-          <w:numId w:val="1025"/>
+          <w:numId w:val="1027"/>
         </w:numPr>
       </w:pPr>
       <w:r>
@@ -11639,7 +12085,7 @@
         <w:pStyle w:val="Compact"/>
         <w:numPr>
           <w:ilvl w:val="0"/>
-          <w:numId w:val="1025"/>
+          <w:numId w:val="1027"/>
         </w:numPr>
       </w:pPr>
       <w:r>
@@ -11676,7 +12122,7 @@
         <w:pStyle w:val="Compact"/>
         <w:numPr>
           <w:ilvl w:val="0"/>
-          <w:numId w:val="1025"/>
+          <w:numId w:val="1027"/>
         </w:numPr>
       </w:pPr>
       <w:r>
@@ -11696,8 +12142,8 @@
         <w:t xml:space="preserve">All agent actions are logged and visible in the PR</w:t>
       </w:r>
     </w:p>
-    <w:bookmarkEnd w:id="161"/>
-    <w:bookmarkStart w:id="165" w:name="workflow-approval-requirements"/>
+    <w:bookmarkEnd w:id="167"/>
+    <w:bookmarkStart w:id="171" w:name="workflow-approval-requirements"/>
     <w:p>
       <w:pPr>
         <w:pStyle w:val="Heading4"/>
@@ -11785,7 +12231,7 @@
         <w:pStyle w:val="Compact"/>
         <w:numPr>
           <w:ilvl w:val="0"/>
-          <w:numId w:val="1026"/>
+          <w:numId w:val="1028"/>
         </w:numPr>
       </w:pPr>
       <w:r>
@@ -11816,7 +12262,7 @@
         <w:pStyle w:val="Compact"/>
         <w:numPr>
           <w:ilvl w:val="0"/>
-          <w:numId w:val="1026"/>
+          <w:numId w:val="1028"/>
         </w:numPr>
       </w:pPr>
       <w:r>
@@ -11862,7 +12308,7 @@
         <w:pStyle w:val="Compact"/>
         <w:numPr>
           <w:ilvl w:val="0"/>
-          <w:numId w:val="1026"/>
+          <w:numId w:val="1028"/>
         </w:numPr>
       </w:pPr>
       <w:r>
@@ -11951,10 +12397,10 @@
         <w:pStyle w:val="Compact"/>
         <w:numPr>
           <w:ilvl w:val="0"/>
-          <w:numId w:val="1027"/>
-        </w:numPr>
-      </w:pPr>
-      <w:hyperlink r:id="rId162">
+          <w:numId w:val="1029"/>
+        </w:numPr>
+      </w:pPr>
+      <w:hyperlink r:id="rId168">
         <w:r>
           <w:rPr>
             <w:rStyle w:val="Hyperlink"/>
@@ -11977,10 +12423,10 @@
         <w:pStyle w:val="Compact"/>
         <w:numPr>
           <w:ilvl w:val="0"/>
-          <w:numId w:val="1027"/>
-        </w:numPr>
-      </w:pPr>
-      <w:hyperlink r:id="rId163">
+          <w:numId w:val="1029"/>
+        </w:numPr>
+      </w:pPr>
+      <w:hyperlink r:id="rId169">
         <w:r>
           <w:rPr>
             <w:rStyle w:val="Hyperlink"/>
@@ -12014,7 +12460,7 @@
       <w:r>
         <w:t xml:space="preserve"> </w:t>
       </w:r>
-      <w:hyperlink r:id="rId164">
+      <w:hyperlink r:id="rId170">
         <w:r>
           <w:rPr>
             <w:rStyle w:val="Hyperlink"/>
@@ -12026,15 +12472,15 @@
         <w:t xml:space="preserve">.</w:t>
       </w:r>
     </w:p>
-    <w:bookmarkEnd w:id="165"/>
-    <w:bookmarkEnd w:id="166"/>
-    <w:bookmarkStart w:id="169" w:name="useful-prompt-formats"/>
+    <w:bookmarkEnd w:id="171"/>
+    <w:bookmarkEnd w:id="172"/>
+    <w:bookmarkStart w:id="175" w:name="useful-prompt-formats"/>
     <w:p>
       <w:pPr>
         <w:pStyle w:val="Heading1"/>
       </w:pPr>
       <w:r>
-        <w:t xml:space="preserve">13. Useful Prompt Formats</w:t>
+        <w:t xml:space="preserve">14. Useful Prompt Formats</w:t>
       </w:r>
     </w:p>
     <w:p>
@@ -12057,7 +12503,7 @@
         <w:t xml:space="preserve">Here are some useful prompt formats that you can use when requesting assistance from coding agents:</w:t>
       </w:r>
     </w:p>
-    <w:bookmarkStart w:id="167" w:name="common-task-patterns"/>
+    <w:bookmarkStart w:id="173" w:name="common-task-patterns"/>
     <w:p>
       <w:pPr>
         <w:pStyle w:val="Heading4"/>
@@ -12083,7 +12529,7 @@
         <w:pStyle w:val="Compact"/>
         <w:numPr>
           <w:ilvl w:val="0"/>
-          <w:numId w:val="1028"/>
+          <w:numId w:val="1030"/>
         </w:numPr>
       </w:pPr>
       <w:r>
@@ -12095,7 +12541,7 @@
         <w:pStyle w:val="Compact"/>
         <w:numPr>
           <w:ilvl w:val="0"/>
-          <w:numId w:val="1028"/>
+          <w:numId w:val="1030"/>
         </w:numPr>
       </w:pPr>
       <w:r>
@@ -12107,7 +12553,7 @@
         <w:pStyle w:val="Compact"/>
         <w:numPr>
           <w:ilvl w:val="0"/>
-          <w:numId w:val="1028"/>
+          <w:numId w:val="1030"/>
         </w:numPr>
       </w:pPr>
       <w:r>
@@ -12137,7 +12583,7 @@
         <w:pStyle w:val="Compact"/>
         <w:numPr>
           <w:ilvl w:val="0"/>
-          <w:numId w:val="1029"/>
+          <w:numId w:val="1031"/>
         </w:numPr>
       </w:pPr>
       <w:r>
@@ -12149,7 +12595,7 @@
         <w:pStyle w:val="Compact"/>
         <w:numPr>
           <w:ilvl w:val="0"/>
-          <w:numId w:val="1029"/>
+          <w:numId w:val="1031"/>
         </w:numPr>
       </w:pPr>
       <w:r>
@@ -12161,7 +12607,7 @@
         <w:pStyle w:val="Compact"/>
         <w:numPr>
           <w:ilvl w:val="0"/>
-          <w:numId w:val="1029"/>
+          <w:numId w:val="1031"/>
         </w:numPr>
       </w:pPr>
       <w:r>
@@ -12191,7 +12637,7 @@
         <w:pStyle w:val="Compact"/>
         <w:numPr>
           <w:ilvl w:val="0"/>
-          <w:numId w:val="1030"/>
+          <w:numId w:val="1032"/>
         </w:numPr>
       </w:pPr>
       <w:r>
@@ -12203,7 +12649,7 @@
         <w:pStyle w:val="Compact"/>
         <w:numPr>
           <w:ilvl w:val="0"/>
-          <w:numId w:val="1030"/>
+          <w:numId w:val="1032"/>
         </w:numPr>
       </w:pPr>
       <w:r>
@@ -12215,7 +12661,7 @@
         <w:pStyle w:val="Compact"/>
         <w:numPr>
           <w:ilvl w:val="0"/>
-          <w:numId w:val="1030"/>
+          <w:numId w:val="1032"/>
         </w:numPr>
       </w:pPr>
       <w:r>
@@ -12245,7 +12691,7 @@
         <w:pStyle w:val="Compact"/>
         <w:numPr>
           <w:ilvl w:val="0"/>
-          <w:numId w:val="1031"/>
+          <w:numId w:val="1033"/>
         </w:numPr>
       </w:pPr>
       <w:r>
@@ -12257,7 +12703,7 @@
         <w:pStyle w:val="Compact"/>
         <w:numPr>
           <w:ilvl w:val="0"/>
-          <w:numId w:val="1031"/>
+          <w:numId w:val="1033"/>
         </w:numPr>
       </w:pPr>
       <w:r>
@@ -12269,7 +12715,7 @@
         <w:pStyle w:val="Compact"/>
         <w:numPr>
           <w:ilvl w:val="0"/>
-          <w:numId w:val="1031"/>
+          <w:numId w:val="1033"/>
         </w:numPr>
       </w:pPr>
       <w:r>
@@ -12299,7 +12745,7 @@
         <w:pStyle w:val="Compact"/>
         <w:numPr>
           <w:ilvl w:val="0"/>
-          <w:numId w:val="1032"/>
+          <w:numId w:val="1034"/>
         </w:numPr>
       </w:pPr>
       <w:r>
@@ -12311,7 +12757,7 @@
         <w:pStyle w:val="Compact"/>
         <w:numPr>
           <w:ilvl w:val="0"/>
-          <w:numId w:val="1032"/>
+          <w:numId w:val="1034"/>
         </w:numPr>
       </w:pPr>
       <w:r>
@@ -12323,7 +12769,7 @@
         <w:pStyle w:val="Compact"/>
         <w:numPr>
           <w:ilvl w:val="0"/>
-          <w:numId w:val="1032"/>
+          <w:numId w:val="1034"/>
         </w:numPr>
       </w:pPr>
       <w:r>
@@ -12353,7 +12799,7 @@
         <w:pStyle w:val="Compact"/>
         <w:numPr>
           <w:ilvl w:val="0"/>
-          <w:numId w:val="1033"/>
+          <w:numId w:val="1035"/>
         </w:numPr>
       </w:pPr>
       <w:r>
@@ -12365,7 +12811,7 @@
         <w:pStyle w:val="Compact"/>
         <w:numPr>
           <w:ilvl w:val="0"/>
-          <w:numId w:val="1033"/>
+          <w:numId w:val="1035"/>
         </w:numPr>
       </w:pPr>
       <w:r>
@@ -12377,7 +12823,7 @@
         <w:pStyle w:val="Compact"/>
         <w:numPr>
           <w:ilvl w:val="0"/>
-          <w:numId w:val="1033"/>
+          <w:numId w:val="1035"/>
         </w:numPr>
       </w:pPr>
       <w:r>
@@ -12407,7 +12853,7 @@
         <w:pStyle w:val="Compact"/>
         <w:numPr>
           <w:ilvl w:val="0"/>
-          <w:numId w:val="1034"/>
+          <w:numId w:val="1036"/>
         </w:numPr>
       </w:pPr>
       <w:r>
@@ -12419,7 +12865,7 @@
         <w:pStyle w:val="Compact"/>
         <w:numPr>
           <w:ilvl w:val="0"/>
-          <w:numId w:val="1034"/>
+          <w:numId w:val="1036"/>
         </w:numPr>
       </w:pPr>
       <w:r>
@@ -12431,7 +12877,7 @@
         <w:pStyle w:val="Compact"/>
         <w:numPr>
           <w:ilvl w:val="0"/>
-          <w:numId w:val="1034"/>
+          <w:numId w:val="1036"/>
         </w:numPr>
       </w:pPr>
       <w:r>
@@ -12444,8 +12890,8 @@
         <w:t xml:space="preserve">“clarify the explanation of the analysis workflow”</w:t>
       </w:r>
     </w:p>
-    <w:bookmarkEnd w:id="167"/>
-    <w:bookmarkStart w:id="168" w:name="tips-for-effective-prompts"/>
+    <w:bookmarkEnd w:id="173"/>
+    <w:bookmarkStart w:id="174" w:name="tips-for-effective-prompts"/>
     <w:p>
       <w:pPr>
         <w:pStyle w:val="Heading4"/>
@@ -12459,7 +12905,7 @@
         <w:pStyle w:val="Compact"/>
         <w:numPr>
           <w:ilvl w:val="0"/>
-          <w:numId w:val="1035"/>
+          <w:numId w:val="1037"/>
         </w:numPr>
       </w:pPr>
       <w:r>
@@ -12478,7 +12924,7 @@
         <w:pStyle w:val="Compact"/>
         <w:numPr>
           <w:ilvl w:val="0"/>
-          <w:numId w:val="1035"/>
+          <w:numId w:val="1037"/>
         </w:numPr>
       </w:pPr>
       <w:r>
@@ -12497,7 +12943,7 @@
         <w:pStyle w:val="Compact"/>
         <w:numPr>
           <w:ilvl w:val="0"/>
-          <w:numId w:val="1035"/>
+          <w:numId w:val="1037"/>
         </w:numPr>
       </w:pPr>
       <w:r>
@@ -12516,7 +12962,7 @@
         <w:pStyle w:val="Compact"/>
         <w:numPr>
           <w:ilvl w:val="0"/>
-          <w:numId w:val="1035"/>
+          <w:numId w:val="1037"/>
         </w:numPr>
       </w:pPr>
       <w:r>
@@ -12530,15 +12976,15 @@
         <w:t xml:space="preserve">: Ask the agent to test or verify its changes when appropriate</w:t>
       </w:r>
     </w:p>
-    <w:bookmarkEnd w:id="168"/>
-    <w:bookmarkEnd w:id="169"/>
-    <w:bookmarkStart w:id="174" w:name="editing-with-.docx-files"/>
+    <w:bookmarkEnd w:id="174"/>
+    <w:bookmarkEnd w:id="175"/>
+    <w:bookmarkStart w:id="180" w:name="editing-with-.docx-files"/>
     <w:p>
       <w:pPr>
         <w:pStyle w:val="Heading1"/>
       </w:pPr>
       <w:r>
-        <w:t xml:space="preserve">14. Editing with</w:t>
+        <w:t xml:space="preserve">15. Editing with</w:t>
       </w:r>
       <w:r>
         <w:t xml:space="preserve"> </w:t>
@@ -12584,7 +13030,7 @@
         <w:pStyle w:val="Compact"/>
         <w:numPr>
           <w:ilvl w:val="0"/>
-          <w:numId w:val="1036"/>
+          <w:numId w:val="1038"/>
         </w:numPr>
       </w:pPr>
       <w:r>
@@ -12596,7 +13042,7 @@
         <w:pStyle w:val="Compact"/>
         <w:numPr>
           <w:ilvl w:val="0"/>
-          <w:numId w:val="1036"/>
+          <w:numId w:val="1038"/>
         </w:numPr>
       </w:pPr>
       <w:r>
@@ -12608,7 +13054,7 @@
         <w:pStyle w:val="Compact"/>
         <w:numPr>
           <w:ilvl w:val="0"/>
-          <w:numId w:val="1036"/>
+          <w:numId w:val="1038"/>
         </w:numPr>
       </w:pPr>
       <w:r>
@@ -12643,7 +13089,7 @@
         <w:pStyle w:val="Compact"/>
         <w:numPr>
           <w:ilvl w:val="0"/>
-          <w:numId w:val="1037"/>
+          <w:numId w:val="1039"/>
         </w:numPr>
       </w:pPr>
       <w:r>
@@ -12670,7 +13116,7 @@
         <w:pStyle w:val="Compact"/>
         <w:numPr>
           <w:ilvl w:val="0"/>
-          <w:numId w:val="1037"/>
+          <w:numId w:val="1039"/>
         </w:numPr>
       </w:pPr>
       <w:r>
@@ -12697,7 +13143,7 @@
         <w:pStyle w:val="Compact"/>
         <w:numPr>
           <w:ilvl w:val="0"/>
-          <w:numId w:val="1037"/>
+          <w:numId w:val="1039"/>
         </w:numPr>
       </w:pPr>
       <w:r>
@@ -12712,7 +13158,7 @@
         <w:t xml:space="preserve">This approach makes it easier for collaborators who are more comfortable with Word to contribute while maintaining the source files in Quarto format.</w:t>
       </w:r>
     </w:p>
-    <w:bookmarkStart w:id="173" w:name="known-issue-document-1-warning-in-word"/>
+    <w:bookmarkStart w:id="179" w:name="known-issue-document-1-warning-in-word"/>
     <w:p>
       <w:pPr>
         <w:pStyle w:val="Heading4"/>
@@ -12794,10 +13240,10 @@
         <w:pStyle w:val="Compact"/>
         <w:numPr>
           <w:ilvl w:val="0"/>
-          <w:numId w:val="1038"/>
-        </w:numPr>
-      </w:pPr>
-      <w:hyperlink r:id="rId170">
+          <w:numId w:val="1040"/>
+        </w:numPr>
+      </w:pPr>
+      <w:hyperlink r:id="rId176">
         <w:r>
           <w:rPr>
             <w:rStyle w:val="Hyperlink"/>
@@ -12811,10 +13257,10 @@
         <w:pStyle w:val="Compact"/>
         <w:numPr>
           <w:ilvl w:val="0"/>
-          <w:numId w:val="1038"/>
-        </w:numPr>
-      </w:pPr>
-      <w:hyperlink r:id="rId171">
+          <w:numId w:val="1040"/>
+        </w:numPr>
+      </w:pPr>
+      <w:hyperlink r:id="rId177">
         <w:r>
           <w:rPr>
             <w:rStyle w:val="Hyperlink"/>
@@ -12828,10 +13274,10 @@
         <w:pStyle w:val="Compact"/>
         <w:numPr>
           <w:ilvl w:val="0"/>
-          <w:numId w:val="1038"/>
-        </w:numPr>
-      </w:pPr>
-      <w:hyperlink r:id="rId172">
+          <w:numId w:val="1040"/>
+        </w:numPr>
+      </w:pPr>
+      <w:hyperlink r:id="rId178">
         <w:r>
           <w:rPr>
             <w:rStyle w:val="Hyperlink"/>
@@ -12869,7 +13315,7 @@
         <w:pStyle w:val="Compact"/>
         <w:numPr>
           <w:ilvl w:val="0"/>
-          <w:numId w:val="1039"/>
+          <w:numId w:val="1041"/>
         </w:numPr>
       </w:pPr>
       <w:r>
@@ -12881,7 +13327,7 @@
         <w:pStyle w:val="Compact"/>
         <w:numPr>
           <w:ilvl w:val="0"/>
-          <w:numId w:val="1039"/>
+          <w:numId w:val="1041"/>
         </w:numPr>
       </w:pPr>
       <w:r>
@@ -12893,7 +13339,7 @@
         <w:pStyle w:val="Compact"/>
         <w:numPr>
           <w:ilvl w:val="0"/>
-          <w:numId w:val="1039"/>
+          <w:numId w:val="1041"/>
         </w:numPr>
       </w:pPr>
       <w:r>
@@ -12911,7 +13357,7 @@
         <w:pStyle w:val="Compact"/>
         <w:numPr>
           <w:ilvl w:val="0"/>
-          <w:numId w:val="1039"/>
+          <w:numId w:val="1041"/>
         </w:numPr>
       </w:pPr>
       <w:r>
@@ -12944,15 +13390,15 @@
         <w:t xml:space="preserve">warning and can immediately add comments and track changes without issues.</w:t>
       </w:r>
     </w:p>
-    <w:bookmarkEnd w:id="173"/>
-    <w:bookmarkEnd w:id="174"/>
-    <w:bookmarkStart w:id="176" w:name="copilot-instructions-for-this-repository"/>
+    <w:bookmarkEnd w:id="179"/>
+    <w:bookmarkEnd w:id="180"/>
+    <w:bookmarkStart w:id="182" w:name="copilot-instructions-for-this-repository"/>
     <w:p>
       <w:pPr>
         <w:pStyle w:val="Heading1"/>
       </w:pPr>
       <w:r>
-        <w:t xml:space="preserve">15. Copilot Instructions for this Repository</w:t>
+        <w:t xml:space="preserve">16. Copilot Instructions for this Repository</w:t>
       </w:r>
     </w:p>
     <w:p>
@@ -13033,7 +13479,7 @@
         <w:pStyle w:val="Compact"/>
         <w:numPr>
           <w:ilvl w:val="0"/>
-          <w:numId w:val="1040"/>
+          <w:numId w:val="1042"/>
         </w:numPr>
       </w:pPr>
       <w:r>
@@ -13045,7 +13491,7 @@
         <w:pStyle w:val="Compact"/>
         <w:numPr>
           <w:ilvl w:val="0"/>
-          <w:numId w:val="1040"/>
+          <w:numId w:val="1042"/>
         </w:numPr>
       </w:pPr>
       <w:r>
@@ -13069,7 +13515,7 @@
         <w:pStyle w:val="Compact"/>
         <w:numPr>
           <w:ilvl w:val="0"/>
-          <w:numId w:val="1040"/>
+          <w:numId w:val="1042"/>
         </w:numPr>
       </w:pPr>
       <w:r>
@@ -13081,7 +13527,7 @@
         <w:pStyle w:val="Compact"/>
         <w:numPr>
           <w:ilvl w:val="0"/>
-          <w:numId w:val="1040"/>
+          <w:numId w:val="1042"/>
         </w:numPr>
       </w:pPr>
       <w:r>
@@ -13093,7 +13539,7 @@
         <w:pStyle w:val="Compact"/>
         <w:numPr>
           <w:ilvl w:val="0"/>
-          <w:numId w:val="1040"/>
+          <w:numId w:val="1042"/>
         </w:numPr>
       </w:pPr>
       <w:r>
@@ -13111,7 +13557,7 @@
         <w:pStyle w:val="Compact"/>
         <w:numPr>
           <w:ilvl w:val="0"/>
-          <w:numId w:val="1040"/>
+          <w:numId w:val="1042"/>
         </w:numPr>
       </w:pPr>
       <w:r>
@@ -13178,7 +13624,7 @@
       <w:r>
         <w:t xml:space="preserve"> </w:t>
       </w:r>
-      <w:hyperlink r:id="rId175">
+      <w:hyperlink r:id="rId181">
         <w:r>
           <w:rPr>
             <w:rStyle w:val="VerbatimChar"/>
@@ -13193,14 +13639,14 @@
         <w:t xml:space="preserve">for a working example.</w:t>
       </w:r>
     </w:p>
-    <w:bookmarkEnd w:id="176"/>
-    <w:bookmarkStart w:id="185" w:name="sec-ai-addressing-failing-workflows"/>
+    <w:bookmarkEnd w:id="182"/>
+    <w:bookmarkStart w:id="191" w:name="sec-ai-addressing-failing-workflows"/>
     <w:p>
       <w:pPr>
         <w:pStyle w:val="Heading1"/>
       </w:pPr>
       <w:r>
-        <w:t xml:space="preserve">16. Addressing Failing GitHub Actions Workflows</w:t>
+        <w:t xml:space="preserve">17. Addressing Failing GitHub Actions Workflows</w:t>
       </w:r>
     </w:p>
     <w:p>
@@ -13241,7 +13687,7 @@
         <w:t xml:space="preserve">or in the workflow configuration itself.</w:t>
       </w:r>
     </w:p>
-    <w:bookmarkStart w:id="177" w:name="X16724e8c4d0535f38e98d560729d113d43f9447"/>
+    <w:bookmarkStart w:id="183" w:name="X16724e8c4d0535f38e98d560729d113d43f9447"/>
     <w:p>
       <w:pPr>
         <w:pStyle w:val="Heading4"/>
@@ -13315,7 +13761,7 @@
         <w:pStyle w:val="Compact"/>
         <w:numPr>
           <w:ilvl w:val="0"/>
-          <w:numId w:val="1041"/>
+          <w:numId w:val="1043"/>
         </w:numPr>
       </w:pPr>
       <w:r>
@@ -13327,7 +13773,7 @@
         <w:pStyle w:val="Compact"/>
         <w:numPr>
           <w:ilvl w:val="0"/>
-          <w:numId w:val="1041"/>
+          <w:numId w:val="1043"/>
         </w:numPr>
       </w:pPr>
       <w:r>
@@ -13339,7 +13785,7 @@
         <w:pStyle w:val="Compact"/>
         <w:numPr>
           <w:ilvl w:val="0"/>
-          <w:numId w:val="1041"/>
+          <w:numId w:val="1043"/>
         </w:numPr>
       </w:pPr>
       <w:r>
@@ -13351,7 +13797,7 @@
         <w:pStyle w:val="Compact"/>
         <w:numPr>
           <w:ilvl w:val="0"/>
-          <w:numId w:val="1041"/>
+          <w:numId w:val="1043"/>
         </w:numPr>
       </w:pPr>
       <w:r>
@@ -13436,8 +13882,8 @@
         <w:t xml:space="preserve">your carefully-configured CI/CD pipeline.</w:t>
       </w:r>
     </w:p>
-    <w:bookmarkEnd w:id="177"/>
-    <w:bookmarkStart w:id="180" w:name="X609a80533191ba40baf6d2372d9b8d862b0620d"/>
+    <w:bookmarkEnd w:id="183"/>
+    <w:bookmarkStart w:id="186" w:name="X609a80533191ba40baf6d2372d9b8d862b0620d"/>
     <w:p>
       <w:pPr>
         <w:pStyle w:val="Heading4"/>
@@ -13511,7 +13957,7 @@
         <w:pStyle w:val="Compact"/>
         <w:numPr>
           <w:ilvl w:val="0"/>
-          <w:numId w:val="1042"/>
+          <w:numId w:val="1044"/>
         </w:numPr>
       </w:pPr>
       <w:r>
@@ -13523,7 +13969,7 @@
         <w:pStyle w:val="Compact"/>
         <w:numPr>
           <w:ilvl w:val="0"/>
-          <w:numId w:val="1042"/>
+          <w:numId w:val="1044"/>
         </w:numPr>
       </w:pPr>
       <w:r>
@@ -13535,7 +13981,7 @@
         <w:pStyle w:val="Compact"/>
         <w:numPr>
           <w:ilvl w:val="0"/>
-          <w:numId w:val="1042"/>
+          <w:numId w:val="1044"/>
         </w:numPr>
       </w:pPr>
       <w:r>
@@ -13607,12 +14053,12 @@
                 <wp:inline>
                   <wp:extent cx="152400" cy="152400"/>
                   <wp:effectExtent b="0" l="0" r="0" t="0"/>
-                  <wp:docPr descr="" title="" id="178" name="Picture"/>
+                  <wp:docPr descr="" title="" id="184" name="Picture"/>
                   <a:graphic>
                     <a:graphicData uri="http://schemas.openxmlformats.org/drawingml/2006/picture">
                       <pic:pic>
                         <pic:nvPicPr>
-                          <pic:cNvPr descr="/opt/quarto/share/formats/docx/warning.png" id="179" name="Picture"/>
+                          <pic:cNvPr descr="/opt/quarto/share/formats/docx/warning.png" id="185" name="Picture"/>
                           <pic:cNvPicPr>
                             <a:picLocks noChangeArrowheads="1" noChangeAspect="1"/>
                           </pic:cNvPicPr>
@@ -13701,7 +14147,7 @@
               <w:pStyle w:val="Compact"/>
               <w:numPr>
                 <w:ilvl w:val="0"/>
-                <w:numId w:val="1043"/>
+                <w:numId w:val="1045"/>
               </w:numPr>
             </w:pPr>
             <w:r>
@@ -13723,7 +14169,7 @@
               <w:pStyle w:val="Compact"/>
               <w:numPr>
                 <w:ilvl w:val="0"/>
-                <w:numId w:val="1043"/>
+                <w:numId w:val="1045"/>
               </w:numPr>
             </w:pPr>
             <w:r>
@@ -13745,7 +14191,7 @@
               <w:pStyle w:val="Compact"/>
               <w:numPr>
                 <w:ilvl w:val="0"/>
-                <w:numId w:val="1043"/>
+                <w:numId w:val="1045"/>
               </w:numPr>
             </w:pPr>
             <w:r>
@@ -13767,7 +14213,7 @@
               <w:pStyle w:val="Compact"/>
               <w:numPr>
                 <w:ilvl w:val="0"/>
-                <w:numId w:val="1043"/>
+                <w:numId w:val="1045"/>
               </w:numPr>
             </w:pPr>
             <w:r>
@@ -13802,7 +14248,7 @@
                 <w:rPr>
                   <w:rStyle w:val="Hyperlink"/>
                 </w:rPr>
-                <w:t xml:space="preserve">Section 18</w:t>
+                <w:t xml:space="preserve">Section 19</w:t>
               </w:r>
             </w:hyperlink>
             <w:r>
@@ -13859,7 +14305,7 @@
           <w:rPr>
             <w:rStyle w:val="Hyperlink"/>
           </w:rPr>
-          <w:t xml:space="preserve">Section 10</w:t>
+          <w:t xml:space="preserve">Section 11</w:t>
         </w:r>
       </w:hyperlink>
       <w:r>
@@ -13869,8 +14315,8 @@
         <w:t xml:space="preserve">for more guidance.</w:t>
       </w:r>
     </w:p>
-    <w:bookmarkEnd w:id="180"/>
-    <w:bookmarkStart w:id="181" w:name="X73d86ac2fd20fdb79b2a5c7f2662f883788810e"/>
+    <w:bookmarkEnd w:id="186"/>
+    <w:bookmarkStart w:id="187" w:name="X73d86ac2fd20fdb79b2a5c7f2662f883788810e"/>
     <w:p>
       <w:pPr>
         <w:pStyle w:val="Heading4"/>
@@ -13920,7 +14366,7 @@
         <w:pStyle w:val="Compact"/>
         <w:numPr>
           <w:ilvl w:val="0"/>
-          <w:numId w:val="1044"/>
+          <w:numId w:val="1046"/>
         </w:numPr>
       </w:pPr>
       <w:r>
@@ -13939,7 +14385,7 @@
         <w:pStyle w:val="Compact"/>
         <w:numPr>
           <w:ilvl w:val="1"/>
-          <w:numId w:val="1045"/>
+          <w:numId w:val="1047"/>
         </w:numPr>
       </w:pPr>
       <w:r>
@@ -13951,7 +14397,7 @@
         <w:pStyle w:val="Compact"/>
         <w:numPr>
           <w:ilvl w:val="1"/>
-          <w:numId w:val="1045"/>
+          <w:numId w:val="1047"/>
         </w:numPr>
       </w:pPr>
       <w:r>
@@ -13963,7 +14409,7 @@
         <w:pStyle w:val="Compact"/>
         <w:numPr>
           <w:ilvl w:val="1"/>
-          <w:numId w:val="1045"/>
+          <w:numId w:val="1047"/>
         </w:numPr>
       </w:pPr>
       <w:r>
@@ -13975,7 +14421,7 @@
         <w:pStyle w:val="Compact"/>
         <w:numPr>
           <w:ilvl w:val="1"/>
-          <w:numId w:val="1045"/>
+          <w:numId w:val="1047"/>
         </w:numPr>
       </w:pPr>
       <w:r>
@@ -13987,7 +14433,7 @@
         <w:pStyle w:val="Compact"/>
         <w:numPr>
           <w:ilvl w:val="0"/>
-          <w:numId w:val="1044"/>
+          <w:numId w:val="1046"/>
         </w:numPr>
       </w:pPr>
       <w:r>
@@ -14006,31 +14452,31 @@
         <w:pStyle w:val="Compact"/>
         <w:numPr>
           <w:ilvl w:val="1"/>
+          <w:numId w:val="1048"/>
+        </w:numPr>
+      </w:pPr>
+      <w:r>
+        <w:t xml:space="preserve">“examine the failing workflow logs and identify whether the issue is in the code or the workflow configuration”</w:t>
+      </w:r>
+    </w:p>
+    <w:p>
+      <w:pPr>
+        <w:pStyle w:val="Compact"/>
+        <w:numPr>
+          <w:ilvl w:val="1"/>
+          <w:numId w:val="1048"/>
+        </w:numPr>
+      </w:pPr>
+      <w:r>
+        <w:t xml:space="preserve">“diagnose the root cause of the workflow failure”</w:t>
+      </w:r>
+    </w:p>
+    <w:p>
+      <w:pPr>
+        <w:pStyle w:val="Compact"/>
+        <w:numPr>
+          <w:ilvl w:val="0"/>
           <w:numId w:val="1046"/>
-        </w:numPr>
-      </w:pPr>
-      <w:r>
-        <w:t xml:space="preserve">“examine the failing workflow logs and identify whether the issue is in the code or the workflow configuration”</w:t>
-      </w:r>
-    </w:p>
-    <w:p>
-      <w:pPr>
-        <w:pStyle w:val="Compact"/>
-        <w:numPr>
-          <w:ilvl w:val="1"/>
-          <w:numId w:val="1046"/>
-        </w:numPr>
-      </w:pPr>
-      <w:r>
-        <w:t xml:space="preserve">“diagnose the root cause of the workflow failure”</w:t>
-      </w:r>
-    </w:p>
-    <w:p>
-      <w:pPr>
-        <w:pStyle w:val="Compact"/>
-        <w:numPr>
-          <w:ilvl w:val="0"/>
-          <w:numId w:val="1044"/>
         </w:numPr>
       </w:pPr>
       <w:r>
@@ -14106,8 +14552,8 @@
         <w:t xml:space="preserve">3. Prompt: "fix the linting errors in src/analysis.R"</w:t>
       </w:r>
     </w:p>
-    <w:bookmarkEnd w:id="181"/>
-    <w:bookmarkStart w:id="184" w:name="additional-resources"/>
+    <w:bookmarkEnd w:id="187"/>
+    <w:bookmarkStart w:id="190" w:name="additional-resources"/>
     <w:p>
       <w:pPr>
         <w:pStyle w:val="Heading4"/>
@@ -14121,7 +14567,7 @@
         <w:pStyle w:val="Compact"/>
         <w:numPr>
           <w:ilvl w:val="0"/>
-          <w:numId w:val="1047"/>
+          <w:numId w:val="1049"/>
         </w:numPr>
       </w:pPr>
       <w:r>
@@ -14130,7 +14576,7 @@
       <w:r>
         <w:t xml:space="preserve"> </w:t>
       </w:r>
-      <w:hyperlink r:id="rId182">
+      <w:hyperlink r:id="rId188">
         <w:r>
           <w:rPr>
             <w:rStyle w:val="Hyperlink"/>
@@ -14150,7 +14596,7 @@
         <w:pStyle w:val="Compact"/>
         <w:numPr>
           <w:ilvl w:val="0"/>
-          <w:numId w:val="1047"/>
+          <w:numId w:val="1049"/>
         </w:numPr>
       </w:pPr>
       <w:r>
@@ -14160,6 +14606,23 @@
         <w:t xml:space="preserve"> </w:t>
       </w:r>
       <w:hyperlink w:anchor="sec-ai-best-practices">
+        <w:r>
+          <w:rPr>
+            <w:rStyle w:val="Hyperlink"/>
+          </w:rPr>
+          <w:t xml:space="preserve">Section 19</w:t>
+        </w:r>
+      </w:hyperlink>
+      <w:r>
+        <w:t xml:space="preserve"> </w:t>
+      </w:r>
+      <w:r>
+        <w:t xml:space="preserve">and</w:t>
+      </w:r>
+      <w:r>
+        <w:t xml:space="preserve"> </w:t>
+      </w:r>
+      <w:hyperlink w:anchor="sec-ai-benefits-hazards">
         <w:r>
           <w:rPr>
             <w:rStyle w:val="Hyperlink"/>
@@ -14171,23 +14634,6 @@
         <w:t xml:space="preserve"> </w:t>
       </w:r>
       <w:r>
-        <w:t xml:space="preserve">and</w:t>
-      </w:r>
-      <w:r>
-        <w:t xml:space="preserve"> </w:t>
-      </w:r>
-      <w:hyperlink w:anchor="sec-ai-benefits-hazards">
-        <w:r>
-          <w:rPr>
-            <w:rStyle w:val="Hyperlink"/>
-          </w:rPr>
-          <w:t xml:space="preserve">Section 17</w:t>
-        </w:r>
-      </w:hyperlink>
-      <w:r>
-        <w:t xml:space="preserve"> </w:t>
-      </w:r>
-      <w:r>
         <w:t xml:space="preserve">for security considerations with workflow files</w:t>
       </w:r>
     </w:p>
@@ -14196,7 +14642,7 @@
         <w:pStyle w:val="Compact"/>
         <w:numPr>
           <w:ilvl w:val="0"/>
-          <w:numId w:val="1047"/>
+          <w:numId w:val="1049"/>
         </w:numPr>
       </w:pPr>
       <w:r>
@@ -14210,7 +14656,7 @@
           <w:rPr>
             <w:rStyle w:val="Hyperlink"/>
           </w:rPr>
-          <w:t xml:space="preserve">Section 10</w:t>
+          <w:t xml:space="preserve">Section 11</w:t>
         </w:r>
       </w:hyperlink>
       <w:r>
@@ -14225,7 +14671,7 @@
         <w:pStyle w:val="Compact"/>
         <w:numPr>
           <w:ilvl w:val="0"/>
-          <w:numId w:val="1047"/>
+          <w:numId w:val="1049"/>
         </w:numPr>
       </w:pPr>
       <w:r>
@@ -14234,7 +14680,7 @@
       <w:r>
         <w:t xml:space="preserve"> </w:t>
       </w:r>
-      <w:hyperlink r:id="rId183">
+      <w:hyperlink r:id="rId189">
         <w:r>
           <w:rPr>
             <w:rStyle w:val="Hyperlink"/>
@@ -14249,15 +14695,15 @@
         <w:t xml:space="preserve">for workflow syntax and troubleshooting</w:t>
       </w:r>
     </w:p>
-    <w:bookmarkEnd w:id="184"/>
-    <w:bookmarkEnd w:id="185"/>
-    <w:bookmarkStart w:id="191" w:name="sec-ai-benefits-hazards"/>
+    <w:bookmarkEnd w:id="190"/>
+    <w:bookmarkEnd w:id="191"/>
+    <w:bookmarkStart w:id="197" w:name="sec-ai-benefits-hazards"/>
     <w:p>
       <w:pPr>
         <w:pStyle w:val="Heading1"/>
       </w:pPr>
       <w:r>
-        <w:t xml:space="preserve">17. Benefits and Hazards</w:t>
+        <w:t xml:space="preserve">18. Benefits and Hazards</w:t>
       </w:r>
     </w:p>
     <w:p>
@@ -14310,7 +14756,7 @@
       <w:pPr>
         <w:numPr>
           <w:ilvl w:val="0"/>
-          <w:numId w:val="1048"/>
+          <w:numId w:val="1050"/>
         </w:numPr>
       </w:pPr>
       <w:r>
@@ -14334,7 +14780,7 @@
       <w:pPr>
         <w:numPr>
           <w:ilvl w:val="0"/>
-          <w:numId w:val="1048"/>
+          <w:numId w:val="1050"/>
         </w:numPr>
       </w:pPr>
       <w:r>
@@ -14358,7 +14804,7 @@
       <w:pPr>
         <w:numPr>
           <w:ilvl w:val="0"/>
-          <w:numId w:val="1048"/>
+          <w:numId w:val="1050"/>
         </w:numPr>
       </w:pPr>
       <w:r>
@@ -14382,7 +14828,7 @@
       <w:pPr>
         <w:numPr>
           <w:ilvl w:val="0"/>
-          <w:numId w:val="1048"/>
+          <w:numId w:val="1050"/>
         </w:numPr>
       </w:pPr>
       <w:r>
@@ -14406,7 +14852,7 @@
       <w:pPr>
         <w:numPr>
           <w:ilvl w:val="0"/>
-          <w:numId w:val="1048"/>
+          <w:numId w:val="1050"/>
         </w:numPr>
       </w:pPr>
       <w:r>
@@ -14430,7 +14876,7 @@
       <w:pPr>
         <w:numPr>
           <w:ilvl w:val="0"/>
-          <w:numId w:val="1048"/>
+          <w:numId w:val="1050"/>
         </w:numPr>
       </w:pPr>
       <w:r>
@@ -14462,7 +14908,7 @@
       <w:pPr>
         <w:numPr>
           <w:ilvl w:val="0"/>
-          <w:numId w:val="1049"/>
+          <w:numId w:val="1051"/>
         </w:numPr>
       </w:pPr>
       <w:r>
@@ -14486,7 +14932,7 @@
       <w:pPr>
         <w:numPr>
           <w:ilvl w:val="0"/>
-          <w:numId w:val="1049"/>
+          <w:numId w:val="1051"/>
         </w:numPr>
       </w:pPr>
       <w:r>
@@ -14510,7 +14956,7 @@
       <w:pPr>
         <w:numPr>
           <w:ilvl w:val="0"/>
-          <w:numId w:val="1049"/>
+          <w:numId w:val="1051"/>
         </w:numPr>
       </w:pPr>
       <w:r>
@@ -14534,7 +14980,7 @@
       <w:pPr>
         <w:numPr>
           <w:ilvl w:val="0"/>
-          <w:numId w:val="1049"/>
+          <w:numId w:val="1051"/>
         </w:numPr>
       </w:pPr>
       <w:r>
@@ -14558,7 +15004,7 @@
       <w:pPr>
         <w:numPr>
           <w:ilvl w:val="0"/>
-          <w:numId w:val="1049"/>
+          <w:numId w:val="1051"/>
         </w:numPr>
       </w:pPr>
       <w:r>
@@ -14582,7 +15028,7 @@
       <w:pPr>
         <w:numPr>
           <w:ilvl w:val="0"/>
-          <w:numId w:val="1049"/>
+          <w:numId w:val="1051"/>
         </w:numPr>
       </w:pPr>
       <w:r>
@@ -14606,7 +15052,7 @@
       <w:pPr>
         <w:numPr>
           <w:ilvl w:val="0"/>
-          <w:numId w:val="1049"/>
+          <w:numId w:val="1051"/>
         </w:numPr>
       </w:pPr>
       <w:r>
@@ -14635,7 +15081,7 @@
         <w:t xml:space="preserve">) or setup configurations can inadvertently or maliciously compromise repository security, expose secrets, or execute harmful commands</w:t>
       </w:r>
     </w:p>
-    <w:bookmarkStart w:id="190" w:name="further-readingviewing"/>
+    <w:bookmarkStart w:id="196" w:name="further-readingviewing"/>
     <w:p>
       <w:pPr>
         <w:pStyle w:val="Heading4"/>
@@ -14649,7 +15095,7 @@
         <w:pStyle w:val="Compact"/>
         <w:numPr>
           <w:ilvl w:val="0"/>
-          <w:numId w:val="1050"/>
+          <w:numId w:val="1052"/>
         </w:numPr>
       </w:pPr>
       <w:r>
@@ -14671,7 +15117,7 @@
         <w:pStyle w:val="Compact"/>
         <w:numPr>
           <w:ilvl w:val="0"/>
-          <w:numId w:val="1050"/>
+          <w:numId w:val="1052"/>
         </w:numPr>
       </w:pPr>
       <w:r>
@@ -14693,7 +15139,7 @@
         <w:pStyle w:val="Compact"/>
         <w:numPr>
           <w:ilvl w:val="0"/>
-          <w:numId w:val="1050"/>
+          <w:numId w:val="1052"/>
         </w:numPr>
       </w:pPr>
       <w:r>
@@ -14715,7 +15161,7 @@
         <w:pStyle w:val="Compact"/>
         <w:numPr>
           <w:ilvl w:val="0"/>
-          <w:numId w:val="1050"/>
+          <w:numId w:val="1052"/>
         </w:numPr>
       </w:pPr>
       <w:r>
@@ -14737,7 +15183,7 @@
         <w:pStyle w:val="Compact"/>
         <w:numPr>
           <w:ilvl w:val="0"/>
-          <w:numId w:val="1050"/>
+          <w:numId w:val="1052"/>
         </w:numPr>
       </w:pPr>
       <w:r>
@@ -14759,7 +15205,7 @@
         <w:pStyle w:val="Compact"/>
         <w:numPr>
           <w:ilvl w:val="0"/>
-          <w:numId w:val="1050"/>
+          <w:numId w:val="1052"/>
         </w:numPr>
       </w:pPr>
       <w:r>
@@ -14781,7 +15227,7 @@
         <w:pStyle w:val="Compact"/>
         <w:numPr>
           <w:ilvl w:val="0"/>
-          <w:numId w:val="1050"/>
+          <w:numId w:val="1052"/>
         </w:numPr>
       </w:pPr>
       <w:r>
@@ -14803,7 +15249,7 @@
         <w:pStyle w:val="Compact"/>
         <w:numPr>
           <w:ilvl w:val="0"/>
-          <w:numId w:val="1050"/>
+          <w:numId w:val="1052"/>
         </w:numPr>
       </w:pPr>
       <w:r>
@@ -14844,7 +15290,7 @@
         <w:pStyle w:val="Compact"/>
         <w:numPr>
           <w:ilvl w:val="0"/>
-          <w:numId w:val="1050"/>
+          <w:numId w:val="1052"/>
         </w:numPr>
       </w:pPr>
       <w:r>
@@ -14866,7 +15312,7 @@
         <w:pStyle w:val="Compact"/>
         <w:numPr>
           <w:ilvl w:val="0"/>
-          <w:numId w:val="1050"/>
+          <w:numId w:val="1052"/>
         </w:numPr>
       </w:pPr>
       <w:r>
@@ -14888,18 +15334,18 @@
           <wp:inline>
             <wp:extent cx="5334000" cy="2224278"/>
             <wp:effectExtent b="0" l="0" r="0" t="0"/>
-            <wp:docPr descr="Agents" title="" id="187" name="Picture"/>
+            <wp:docPr descr="Agents" title="" id="193" name="Picture"/>
             <a:graphic>
               <a:graphicData uri="http://schemas.openxmlformats.org/drawingml/2006/picture">
                 <pic:pic>
                   <pic:nvPicPr>
-                    <pic:cNvPr descr="assets/images/matrix-agents.png" id="188" name="Picture"/>
+                    <pic:cNvPr descr="assets/images/matrix-agents.png" id="194" name="Picture"/>
                     <pic:cNvPicPr>
                       <a:picLocks noChangeArrowheads="1" noChangeAspect="1"/>
                     </pic:cNvPicPr>
                   </pic:nvPicPr>
                   <pic:blipFill>
-                    <a:blip r:embed="rId186"/>
+                    <a:blip r:embed="rId192"/>
                     <a:stretch>
                       <a:fillRect/>
                     </a:stretch>
@@ -14930,7 +15376,7 @@
       <w:pPr>
         <w:pStyle w:val="ImageCaption"/>
       </w:pPr>
-      <w:hyperlink r:id="rId189">
+      <w:hyperlink r:id="rId195">
         <w:r>
           <w:rPr>
             <w:rStyle w:val="Hyperlink"/>
@@ -14939,15 +15385,15 @@
         </w:r>
       </w:hyperlink>
     </w:p>
-    <w:bookmarkEnd w:id="190"/>
-    <w:bookmarkEnd w:id="191"/>
-    <w:bookmarkStart w:id="198" w:name="sec-ai-best-practices"/>
+    <w:bookmarkEnd w:id="196"/>
+    <w:bookmarkEnd w:id="197"/>
+    <w:bookmarkStart w:id="204" w:name="sec-ai-best-practices"/>
     <w:p>
       <w:pPr>
         <w:pStyle w:val="Heading1"/>
       </w:pPr>
       <w:r>
-        <w:t xml:space="preserve">18. Best Practices for Safe and Successful Use</w:t>
+        <w:t xml:space="preserve">19. Best Practices for Safe and Successful Use</w:t>
       </w:r>
     </w:p>
     <w:p>
@@ -14962,7 +15408,7 @@
       <w:pPr>
         <w:numPr>
           <w:ilvl w:val="0"/>
-          <w:numId w:val="1051"/>
+          <w:numId w:val="1053"/>
         </w:numPr>
       </w:pPr>
       <w:r>
@@ -14992,7 +15438,7 @@
       <w:pPr>
         <w:numPr>
           <w:ilvl w:val="0"/>
-          <w:numId w:val="1051"/>
+          <w:numId w:val="1053"/>
         </w:numPr>
       </w:pPr>
       <w:r>
@@ -15028,7 +15474,7 @@
       <w:pPr>
         <w:numPr>
           <w:ilvl w:val="0"/>
-          <w:numId w:val="1051"/>
+          <w:numId w:val="1053"/>
         </w:numPr>
       </w:pPr>
       <w:r>
@@ -15137,7 +15583,7 @@
       <w:pPr>
         <w:numPr>
           <w:ilvl w:val="0"/>
-          <w:numId w:val="1051"/>
+          <w:numId w:val="1053"/>
         </w:numPr>
       </w:pPr>
       <w:r>
@@ -15173,7 +15619,7 @@
       <w:pPr>
         <w:numPr>
           <w:ilvl w:val="0"/>
-          <w:numId w:val="1051"/>
+          <w:numId w:val="1053"/>
         </w:numPr>
       </w:pPr>
       <w:r>
@@ -15215,7 +15661,7 @@
       <w:pPr>
         <w:numPr>
           <w:ilvl w:val="0"/>
-          <w:numId w:val="1051"/>
+          <w:numId w:val="1053"/>
         </w:numPr>
       </w:pPr>
       <w:r>
@@ -15245,7 +15691,7 @@
       <w:pPr>
         <w:numPr>
           <w:ilvl w:val="0"/>
-          <w:numId w:val="1051"/>
+          <w:numId w:val="1053"/>
         </w:numPr>
       </w:pPr>
       <w:r>
@@ -15281,7 +15727,7 @@
       <w:pPr>
         <w:numPr>
           <w:ilvl w:val="0"/>
-          <w:numId w:val="1051"/>
+          <w:numId w:val="1053"/>
         </w:numPr>
       </w:pPr>
       <w:r>
@@ -15348,18 +15794,18 @@
                 <wp:inline>
                   <wp:extent cx="152400" cy="152400"/>
                   <wp:effectExtent b="0" l="0" r="0" t="0"/>
-                  <wp:docPr descr="" title="" id="193" name="Picture"/>
+                  <wp:docPr descr="" title="" id="199" name="Picture"/>
                   <a:graphic>
                     <a:graphicData uri="http://schemas.openxmlformats.org/drawingml/2006/picture">
                       <pic:pic>
                         <pic:nvPicPr>
-                          <pic:cNvPr descr="/opt/quarto/share/formats/docx/note.png" id="194" name="Picture"/>
+                          <pic:cNvPr descr="/opt/quarto/share/formats/docx/note.png" id="200" name="Picture"/>
                           <pic:cNvPicPr>
                             <a:picLocks noChangeArrowheads="1" noChangeAspect="1"/>
                           </pic:cNvPicPr>
                         </pic:nvPicPr>
                         <pic:blipFill>
-                          <a:blip r:embed="rId192"/>
+                          <a:blip r:embed="rId198"/>
                           <a:stretch>
                             <a:fillRect/>
                           </a:stretch>
@@ -15421,7 +15867,7 @@
             <w:r>
               <w:t xml:space="preserve"> </w:t>
             </w:r>
-            <w:hyperlink r:id="rId195">
+            <w:hyperlink r:id="rId201">
               <w:r>
                 <w:rPr>
                   <w:rStyle w:val="Hyperlink"/>
@@ -15528,12 +15974,12 @@
                 <wp:inline>
                   <wp:extent cx="152400" cy="152400"/>
                   <wp:effectExtent b="0" l="0" r="0" t="0"/>
-                  <wp:docPr descr="" title="" id="196" name="Picture"/>
+                  <wp:docPr descr="" title="" id="202" name="Picture"/>
                   <a:graphic>
                     <a:graphicData uri="http://schemas.openxmlformats.org/drawingml/2006/picture">
                       <pic:pic>
                         <pic:nvPicPr>
-                          <pic:cNvPr descr="/opt/quarto/share/formats/docx/warning.png" id="197" name="Picture"/>
+                          <pic:cNvPr descr="/opt/quarto/share/formats/docx/warning.png" id="203" name="Picture"/>
                           <pic:cNvPicPr>
                             <a:picLocks noChangeArrowheads="1" noChangeAspect="1"/>
                           </pic:cNvPicPr>
@@ -15616,7 +16062,7 @@
               <w:pStyle w:val="Compact"/>
               <w:numPr>
                 <w:ilvl w:val="0"/>
-                <w:numId w:val="1052"/>
+                <w:numId w:val="1054"/>
               </w:numPr>
             </w:pPr>
             <w:r>
@@ -15628,7 +16074,7 @@
               <w:pStyle w:val="Compact"/>
               <w:numPr>
                 <w:ilvl w:val="0"/>
-                <w:numId w:val="1052"/>
+                <w:numId w:val="1054"/>
               </w:numPr>
             </w:pPr>
             <w:r>
@@ -15640,7 +16086,7 @@
               <w:pStyle w:val="Compact"/>
               <w:numPr>
                 <w:ilvl w:val="0"/>
-                <w:numId w:val="1052"/>
+                <w:numId w:val="1054"/>
               </w:numPr>
             </w:pPr>
             <w:r>
@@ -15805,14 +16251,14 @@
         <w:t xml:space="preserve">The quality and correctness of your work remains your responsibility.</w:t>
       </w:r>
     </w:p>
-    <w:bookmarkEnd w:id="198"/>
-    <w:bookmarkStart w:id="212" w:name="sec-ai-citadel-and-maturity-levels"/>
+    <w:bookmarkEnd w:id="204"/>
+    <w:bookmarkStart w:id="218" w:name="sec-ai-citadel-and-maturity-levels"/>
     <w:p>
       <w:pPr>
         <w:pStyle w:val="Heading1"/>
       </w:pPr>
       <w:r>
-        <w:t xml:space="preserve">19. Citadel and Levels of Claude Code Use</w:t>
+        <w:t xml:space="preserve">20. Citadel and Levels of Claude Code Use</w:t>
       </w:r>
     </w:p>
     <w:p>
@@ -15837,7 +16283,7 @@
       <w:r>
         <w:t xml:space="preserve"> </w:t>
       </w:r>
-      <w:hyperlink r:id="rId199">
+      <w:hyperlink r:id="rId205">
         <w:r>
           <w:rPr>
             <w:rStyle w:val="Hyperlink"/>
@@ -15896,7 +16342,7 @@
       <w:r>
         <w:t xml:space="preserve"> </w:t>
       </w:r>
-      <w:hyperlink r:id="rId200">
+      <w:hyperlink r:id="rId206">
         <w:r>
           <w:rPr>
             <w:rStyle w:val="Hyperlink"/>
@@ -15940,7 +16386,7 @@
       <w:r>
         <w:t xml:space="preserve"> </w:t>
       </w:r>
-      <w:hyperlink r:id="rId201">
+      <w:hyperlink r:id="rId207">
         <w:r>
           <w:rPr>
             <w:rStyle w:val="Hyperlink"/>
@@ -15996,7 +16442,7 @@
       <w:r>
         <w:t xml:space="preserve"> </w:t>
       </w:r>
-      <w:hyperlink r:id="rId202">
+      <w:hyperlink r:id="rId208">
         <w:r>
           <w:rPr>
             <w:rStyle w:val="Hyperlink"/>
@@ -16014,7 +16460,7 @@
         <w:t xml:space="preserve">and the ladder discussed here is Citadel’s own.</w:t>
       </w:r>
     </w:p>
-    <w:bookmarkStart w:id="204" w:name="what-citadel-is"/>
+    <w:bookmarkStart w:id="210" w:name="what-citadel-is"/>
     <w:p>
       <w:pPr>
         <w:pStyle w:val="Heading4"/>
@@ -16030,7 +16476,7 @@
       <w:r>
         <w:t xml:space="preserve">Citadel is a plugin, not a harness (</w:t>
       </w:r>
-      <w:hyperlink r:id="rId203">
+      <w:hyperlink r:id="rId209">
         <w:r>
           <w:rPr>
             <w:rStyle w:val="Hyperlink"/>
@@ -16074,7 +16520,7 @@
         <w:pStyle w:val="Compact"/>
         <w:numPr>
           <w:ilvl w:val="0"/>
-          <w:numId w:val="1053"/>
+          <w:numId w:val="1055"/>
         </w:numPr>
       </w:pPr>
       <w:r>
@@ -16098,7 +16544,7 @@
         <w:pStyle w:val="Compact"/>
         <w:numPr>
           <w:ilvl w:val="0"/>
-          <w:numId w:val="1053"/>
+          <w:numId w:val="1055"/>
         </w:numPr>
       </w:pPr>
       <w:r>
@@ -16125,7 +16571,7 @@
         <w:pStyle w:val="Compact"/>
         <w:numPr>
           <w:ilvl w:val="0"/>
-          <w:numId w:val="1053"/>
+          <w:numId w:val="1055"/>
         </w:numPr>
       </w:pPr>
       <w:r>
@@ -16137,7 +16583,7 @@
         <w:pStyle w:val="Compact"/>
         <w:numPr>
           <w:ilvl w:val="0"/>
-          <w:numId w:val="1053"/>
+          <w:numId w:val="1055"/>
         </w:numPr>
       </w:pPr>
       <w:r>
@@ -16333,8 +16779,8 @@
         <w:t xml:space="preserve">so that a session ending is not the same as the work being lost.</w:t>
       </w:r>
     </w:p>
-    <w:bookmarkEnd w:id="204"/>
-    <w:bookmarkStart w:id="207" w:name="the-orchestration-ladder"/>
+    <w:bookmarkEnd w:id="210"/>
+    <w:bookmarkStart w:id="213" w:name="the-orchestration-ladder"/>
     <w:p>
       <w:pPr>
         <w:pStyle w:val="Heading4"/>
@@ -16382,7 +16828,7 @@
       <w:tr>
         <w:tc>
           <w:tcPr/>
-          <w:bookmarkStart w:id="205" w:name="tbl-citadel-ladder"/>
+          <w:bookmarkStart w:id="211" w:name="tbl-citadel-ladder"/>
           <w:p>
             <w:pPr>
               <w:jc w:val="center"/>
@@ -16724,7 +17170,7 @@
               </w:tc>
             </w:tr>
           </w:tbl>
-          <w:bookmarkEnd w:id="205"/>
+          <w:bookmarkEnd w:id="211"/>
           <w:p/>
         </w:tc>
       </w:tr>
@@ -16754,7 +17200,7 @@
       <w:r>
         <w:t xml:space="preserve"> </w:t>
       </w:r>
-      <w:hyperlink r:id="rId206">
+      <w:hyperlink r:id="rId212">
         <w:r>
           <w:rPr>
             <w:rStyle w:val="Hyperlink"/>
@@ -16882,8 +17328,8 @@
         <w:t xml:space="preserve">without bypassing the approval or verification boundaries.</w:t>
       </w:r>
     </w:p>
-    <w:bookmarkEnd w:id="207"/>
-    <w:bookmarkStart w:id="208" w:name="enforcement-and-evidence"/>
+    <w:bookmarkEnd w:id="213"/>
+    <w:bookmarkStart w:id="214" w:name="enforcement-and-evidence"/>
     <w:p>
       <w:pPr>
         <w:pStyle w:val="Heading4"/>
@@ -16908,7 +17354,7 @@
       <w:r>
         <w:t xml:space="preserve"> </w:t>
       </w:r>
-      <w:hyperlink r:id="rId199">
+      <w:hyperlink r:id="rId205">
         <w:r>
           <w:rPr>
             <w:rStyle w:val="Hyperlink"/>
@@ -16949,7 +17395,7 @@
         <w:pStyle w:val="Compact"/>
         <w:numPr>
           <w:ilvl w:val="0"/>
-          <w:numId w:val="1054"/>
+          <w:numId w:val="1056"/>
         </w:numPr>
       </w:pPr>
       <w:r>
@@ -17013,7 +17459,7 @@
         <w:pStyle w:val="Compact"/>
         <w:numPr>
           <w:ilvl w:val="0"/>
-          <w:numId w:val="1054"/>
+          <w:numId w:val="1056"/>
         </w:numPr>
       </w:pPr>
       <w:r>
@@ -17059,7 +17505,7 @@
         <w:pStyle w:val="Compact"/>
         <w:numPr>
           <w:ilvl w:val="0"/>
-          <w:numId w:val="1054"/>
+          <w:numId w:val="1056"/>
         </w:numPr>
       </w:pPr>
       <w:r>
@@ -17127,7 +17573,7 @@
           <w:rPr>
             <w:rStyle w:val="Hyperlink"/>
           </w:rPr>
-          <w:t xml:space="preserve">Section 18</w:t>
+          <w:t xml:space="preserve">Section 19</w:t>
         </w:r>
       </w:hyperlink>
       <w:r>
@@ -17229,8 +17675,8 @@
         <w:t xml:space="preserve">.</w:t>
       </w:r>
     </w:p>
-    <w:bookmarkEnd w:id="208"/>
-    <w:bookmarkStart w:id="209" w:name="what-the-evidence-does-and-does-not-show"/>
+    <w:bookmarkEnd w:id="214"/>
+    <w:bookmarkStart w:id="215" w:name="what-the-evidence-does-and-does-not-show"/>
     <w:p>
       <w:pPr>
         <w:pStyle w:val="Heading4"/>
@@ -17399,8 +17845,8 @@
         <w:t xml:space="preserve">the case for Citadel is governance and recoverability, not throughput.</w:t>
       </w:r>
     </w:p>
-    <w:bookmarkEnd w:id="209"/>
-    <w:bookmarkStart w:id="211" w:name="X7982003934b1c259fb22776aa5f25094a8f76dc"/>
+    <w:bookmarkEnd w:id="215"/>
+    <w:bookmarkStart w:id="217" w:name="X7982003934b1c259fb22776aa5f25094a8f76dc"/>
     <w:p>
       <w:pPr>
         <w:pStyle w:val="Heading4"/>
@@ -17419,7 +17865,7 @@
       <w:r>
         <w:t xml:space="preserve"> </w:t>
       </w:r>
-      <w:hyperlink r:id="rId210">
+      <w:hyperlink r:id="rId216">
         <w:r>
           <w:rPr>
             <w:rStyle w:val="VerbatimChar"/>
@@ -17439,7 +17885,7 @@
       <w:r>
         <w:t xml:space="preserve"> </w:t>
       </w:r>
-      <w:hyperlink r:id="rId199">
+      <w:hyperlink r:id="rId205">
         <w:r>
           <w:rPr>
             <w:rStyle w:val="Hyperlink"/>
@@ -17477,7 +17923,7 @@
         <w:pStyle w:val="Compact"/>
         <w:numPr>
           <w:ilvl w:val="0"/>
-          <w:numId w:val="1055"/>
+          <w:numId w:val="1057"/>
         </w:numPr>
       </w:pPr>
       <w:r>
@@ -17489,7 +17935,7 @@
         <w:pStyle w:val="Compact"/>
         <w:numPr>
           <w:ilvl w:val="0"/>
-          <w:numId w:val="1055"/>
+          <w:numId w:val="1057"/>
         </w:numPr>
       </w:pPr>
       <w:r>
@@ -17540,7 +17986,7 @@
         <w:pStyle w:val="Compact"/>
         <w:numPr>
           <w:ilvl w:val="0"/>
-          <w:numId w:val="1055"/>
+          <w:numId w:val="1057"/>
         </w:numPr>
       </w:pPr>
       <w:r>
@@ -17552,7 +17998,7 @@
         <w:pStyle w:val="Compact"/>
         <w:numPr>
           <w:ilvl w:val="0"/>
-          <w:numId w:val="1055"/>
+          <w:numId w:val="1057"/>
         </w:numPr>
       </w:pPr>
       <w:r>
@@ -17573,7 +18019,7 @@
         <w:pStyle w:val="Compact"/>
         <w:numPr>
           <w:ilvl w:val="0"/>
-          <w:numId w:val="1055"/>
+          <w:numId w:val="1057"/>
         </w:numPr>
       </w:pPr>
       <w:r>
@@ -17613,7 +18059,7 @@
         <w:pStyle w:val="Compact"/>
         <w:numPr>
           <w:ilvl w:val="0"/>
-          <w:numId w:val="1056"/>
+          <w:numId w:val="1058"/>
         </w:numPr>
       </w:pPr>
       <w:r>
@@ -17647,7 +18093,7 @@
         <w:pStyle w:val="Compact"/>
         <w:numPr>
           <w:ilvl w:val="0"/>
-          <w:numId w:val="1056"/>
+          <w:numId w:val="1058"/>
         </w:numPr>
       </w:pPr>
       <w:r>
@@ -17687,7 +18133,7 @@
         <w:pStyle w:val="Compact"/>
         <w:numPr>
           <w:ilvl w:val="0"/>
-          <w:numId w:val="1056"/>
+          <w:numId w:val="1058"/>
         </w:numPr>
       </w:pPr>
       <w:r>
@@ -17739,7 +18185,7 @@
         <w:pStyle w:val="Compact"/>
         <w:numPr>
           <w:ilvl w:val="0"/>
-          <w:numId w:val="1056"/>
+          <w:numId w:val="1058"/>
         </w:numPr>
       </w:pPr>
       <w:r>
@@ -17869,7 +18315,7 @@
         <w:pStyle w:val="Compact"/>
         <w:numPr>
           <w:ilvl w:val="0"/>
-          <w:numId w:val="1057"/>
+          <w:numId w:val="1059"/>
         </w:numPr>
       </w:pPr>
       <w:r>
@@ -17921,7 +18367,7 @@
         <w:pStyle w:val="Compact"/>
         <w:numPr>
           <w:ilvl w:val="0"/>
-          <w:numId w:val="1057"/>
+          <w:numId w:val="1059"/>
         </w:numPr>
       </w:pPr>
       <w:r>
@@ -17970,7 +18416,7 @@
         <w:pStyle w:val="Compact"/>
         <w:numPr>
           <w:ilvl w:val="0"/>
-          <w:numId w:val="1057"/>
+          <w:numId w:val="1059"/>
         </w:numPr>
       </w:pPr>
       <w:r>
@@ -17995,7 +18441,7 @@
         <w:pStyle w:val="Compact"/>
         <w:numPr>
           <w:ilvl w:val="0"/>
-          <w:numId w:val="1057"/>
+          <w:numId w:val="1059"/>
         </w:numPr>
       </w:pPr>
       <w:r>
@@ -18085,15 +18531,15 @@
         <w:t xml:space="preserve">and published the answer either way.</w:t>
       </w:r>
     </w:p>
-    <w:bookmarkEnd w:id="211"/>
-    <w:bookmarkEnd w:id="212"/>
-    <w:bookmarkStart w:id="223" w:name="sec-ai-firewall"/>
+    <w:bookmarkEnd w:id="217"/>
+    <w:bookmarkEnd w:id="218"/>
+    <w:bookmarkStart w:id="229" w:name="sec-ai-firewall"/>
     <w:p>
       <w:pPr>
         <w:pStyle w:val="Heading1"/>
       </w:pPr>
       <w:r>
-        <w:t xml:space="preserve">20. Firewall and Network Configuration</w:t>
+        <w:t xml:space="preserve">21. Firewall and Network Configuration</w:t>
       </w:r>
     </w:p>
     <w:p>
@@ -18116,7 +18562,7 @@
         <w:t xml:space="preserve">you may need to configure allowlists to enable coding agent functionality.</w:t>
       </w:r>
     </w:p>
-    <w:bookmarkStart w:id="214" w:name="built-in-agent-firewall"/>
+    <w:bookmarkStart w:id="220" w:name="built-in-agent-firewall"/>
     <w:p>
       <w:pPr>
         <w:pStyle w:val="Heading4"/>
@@ -18150,7 +18596,7 @@
         <w:pStyle w:val="Compact"/>
         <w:numPr>
           <w:ilvl w:val="0"/>
-          <w:numId w:val="1058"/>
+          <w:numId w:val="1060"/>
         </w:numPr>
       </w:pPr>
       <w:r>
@@ -18162,7 +18608,7 @@
         <w:pStyle w:val="Compact"/>
         <w:numPr>
           <w:ilvl w:val="0"/>
-          <w:numId w:val="1058"/>
+          <w:numId w:val="1060"/>
         </w:numPr>
       </w:pPr>
       <w:r>
@@ -18174,7 +18620,7 @@
         <w:pStyle w:val="Compact"/>
         <w:numPr>
           <w:ilvl w:val="0"/>
-          <w:numId w:val="1058"/>
+          <w:numId w:val="1060"/>
         </w:numPr>
       </w:pPr>
       <w:r>
@@ -18194,7 +18640,7 @@
         <w:pStyle w:val="Compact"/>
         <w:numPr>
           <w:ilvl w:val="0"/>
-          <w:numId w:val="1059"/>
+          <w:numId w:val="1061"/>
         </w:numPr>
       </w:pPr>
       <w:r>
@@ -18206,7 +18652,7 @@
         <w:pStyle w:val="Compact"/>
         <w:numPr>
           <w:ilvl w:val="0"/>
-          <w:numId w:val="1059"/>
+          <w:numId w:val="1061"/>
         </w:numPr>
       </w:pPr>
       <w:r>
@@ -18218,7 +18664,7 @@
         <w:pStyle w:val="Compact"/>
         <w:numPr>
           <w:ilvl w:val="0"/>
-          <w:numId w:val="1059"/>
+          <w:numId w:val="1061"/>
         </w:numPr>
       </w:pPr>
       <w:r>
@@ -18230,7 +18676,7 @@
         <w:pStyle w:val="Compact"/>
         <w:numPr>
           <w:ilvl w:val="0"/>
-          <w:numId w:val="1059"/>
+          <w:numId w:val="1061"/>
         </w:numPr>
       </w:pPr>
       <w:r>
@@ -18253,7 +18699,7 @@
       <w:r>
         <w:t xml:space="preserve"> </w:t>
       </w:r>
-      <w:hyperlink r:id="rId213">
+      <w:hyperlink r:id="rId219">
         <w:r>
           <w:rPr>
             <w:rStyle w:val="Hyperlink"/>
@@ -18265,8 +18711,8 @@
         <w:t xml:space="preserve">.</w:t>
       </w:r>
     </w:p>
-    <w:bookmarkEnd w:id="214"/>
-    <w:bookmarkStart w:id="216" w:name="customizing-agent-firewall-settings"/>
+    <w:bookmarkEnd w:id="220"/>
+    <w:bookmarkStart w:id="222" w:name="customizing-agent-firewall-settings"/>
     <w:p>
       <w:pPr>
         <w:pStyle w:val="Heading4"/>
@@ -18306,7 +18752,7 @@
         <w:pStyle w:val="Compact"/>
         <w:numPr>
           <w:ilvl w:val="0"/>
-          <w:numId w:val="1060"/>
+          <w:numId w:val="1062"/>
         </w:numPr>
       </w:pPr>
       <w:r>
@@ -18318,7 +18764,7 @@
         <w:pStyle w:val="Compact"/>
         <w:numPr>
           <w:ilvl w:val="0"/>
-          <w:numId w:val="1060"/>
+          <w:numId w:val="1062"/>
         </w:numPr>
       </w:pPr>
       <w:r>
@@ -18330,7 +18776,7 @@
         <w:pStyle w:val="Compact"/>
         <w:numPr>
           <w:ilvl w:val="0"/>
-          <w:numId w:val="1060"/>
+          <w:numId w:val="1062"/>
         </w:numPr>
       </w:pPr>
       <w:r>
@@ -18373,7 +18819,7 @@
       <w:r>
         <w:t xml:space="preserve"> </w:t>
       </w:r>
-      <w:hyperlink r:id="rId215">
+      <w:hyperlink r:id="rId221">
         <w:r>
           <w:rPr>
             <w:rStyle w:val="Hyperlink"/>
@@ -18385,8 +18831,8 @@
         <w:t xml:space="preserve">.</w:t>
       </w:r>
     </w:p>
-    <w:bookmarkEnd w:id="216"/>
-    <w:bookmarkStart w:id="222" w:name="Xbbad9df60dbc05443efb3cae36c1e0daa9b491b"/>
+    <w:bookmarkEnd w:id="222"/>
+    <w:bookmarkStart w:id="228" w:name="Xbbad9df60dbc05443efb3cae36c1e0daa9b491b"/>
     <w:p>
       <w:pPr>
         <w:pStyle w:val="Heading4"/>
@@ -18444,7 +18890,7 @@
         <w:pStyle w:val="Compact"/>
         <w:numPr>
           <w:ilvl w:val="0"/>
-          <w:numId w:val="1061"/>
+          <w:numId w:val="1063"/>
         </w:numPr>
       </w:pPr>
       <w:r>
@@ -18480,7 +18926,7 @@
         <w:pStyle w:val="Compact"/>
         <w:numPr>
           <w:ilvl w:val="0"/>
-          <w:numId w:val="1061"/>
+          <w:numId w:val="1063"/>
         </w:numPr>
       </w:pPr>
       <w:r>
@@ -18534,7 +18980,7 @@
         <w:pStyle w:val="Compact"/>
         <w:numPr>
           <w:ilvl w:val="0"/>
-          <w:numId w:val="1061"/>
+          <w:numId w:val="1063"/>
         </w:numPr>
       </w:pPr>
       <w:r>
@@ -18570,7 +19016,7 @@
         <w:pStyle w:val="Compact"/>
         <w:numPr>
           <w:ilvl w:val="0"/>
-          <w:numId w:val="1061"/>
+          <w:numId w:val="1063"/>
         </w:numPr>
       </w:pPr>
       <w:r>
@@ -18606,7 +19052,7 @@
         <w:pStyle w:val="Compact"/>
         <w:numPr>
           <w:ilvl w:val="0"/>
-          <w:numId w:val="1061"/>
+          <w:numId w:val="1063"/>
         </w:numPr>
       </w:pPr>
       <w:r>
@@ -18642,7 +19088,7 @@
         <w:pStyle w:val="Compact"/>
         <w:numPr>
           <w:ilvl w:val="0"/>
-          <w:numId w:val="1061"/>
+          <w:numId w:val="1063"/>
         </w:numPr>
       </w:pPr>
       <w:r>
@@ -18678,7 +19124,7 @@
         <w:pStyle w:val="Compact"/>
         <w:numPr>
           <w:ilvl w:val="0"/>
-          <w:numId w:val="1061"/>
+          <w:numId w:val="1063"/>
         </w:numPr>
       </w:pPr>
       <w:r>
@@ -18714,7 +19160,7 @@
         <w:pStyle w:val="Compact"/>
         <w:numPr>
           <w:ilvl w:val="0"/>
-          <w:numId w:val="1061"/>
+          <w:numId w:val="1063"/>
         </w:numPr>
       </w:pPr>
       <w:r>
@@ -18750,7 +19196,7 @@
         <w:pStyle w:val="Compact"/>
         <w:numPr>
           <w:ilvl w:val="0"/>
-          <w:numId w:val="1061"/>
+          <w:numId w:val="1063"/>
         </w:numPr>
       </w:pPr>
       <w:r>
@@ -18798,7 +19244,7 @@
         <w:pStyle w:val="Compact"/>
         <w:numPr>
           <w:ilvl w:val="0"/>
-          <w:numId w:val="1062"/>
+          <w:numId w:val="1064"/>
         </w:numPr>
       </w:pPr>
       <w:r>
@@ -18819,7 +19265,7 @@
         <w:pStyle w:val="Compact"/>
         <w:numPr>
           <w:ilvl w:val="0"/>
-          <w:numId w:val="1062"/>
+          <w:numId w:val="1064"/>
         </w:numPr>
       </w:pPr>
       <w:r>
@@ -18840,7 +19286,7 @@
         <w:pStyle w:val="Compact"/>
         <w:numPr>
           <w:ilvl w:val="0"/>
-          <w:numId w:val="1062"/>
+          <w:numId w:val="1064"/>
         </w:numPr>
       </w:pPr>
       <w:r>
@@ -18873,7 +19319,7 @@
         <w:pStyle w:val="Compact"/>
         <w:numPr>
           <w:ilvl w:val="0"/>
-          <w:numId w:val="1062"/>
+          <w:numId w:val="1064"/>
         </w:numPr>
       </w:pPr>
       <w:r>
@@ -18909,7 +19355,7 @@
         <w:pStyle w:val="Compact"/>
         <w:numPr>
           <w:ilvl w:val="0"/>
-          <w:numId w:val="1062"/>
+          <w:numId w:val="1064"/>
         </w:numPr>
       </w:pPr>
       <w:r>
@@ -18954,7 +19400,7 @@
         <w:pStyle w:val="Compact"/>
         <w:numPr>
           <w:ilvl w:val="0"/>
-          <w:numId w:val="1063"/>
+          <w:numId w:val="1065"/>
         </w:numPr>
       </w:pPr>
       <w:r>
@@ -18990,7 +19436,7 @@
         <w:pStyle w:val="Compact"/>
         <w:numPr>
           <w:ilvl w:val="0"/>
-          <w:numId w:val="1063"/>
+          <w:numId w:val="1065"/>
         </w:numPr>
       </w:pPr>
       <w:r>
@@ -19026,7 +19472,7 @@
         <w:pStyle w:val="Compact"/>
         <w:numPr>
           <w:ilvl w:val="0"/>
-          <w:numId w:val="1063"/>
+          <w:numId w:val="1065"/>
         </w:numPr>
       </w:pPr>
       <w:r>
@@ -19062,7 +19508,7 @@
         <w:pStyle w:val="Compact"/>
         <w:numPr>
           <w:ilvl w:val="0"/>
-          <w:numId w:val="1063"/>
+          <w:numId w:val="1065"/>
         </w:numPr>
       </w:pPr>
       <w:r>
@@ -19095,7 +19541,7 @@
         <w:pStyle w:val="Compact"/>
         <w:numPr>
           <w:ilvl w:val="0"/>
-          <w:numId w:val="1064"/>
+          <w:numId w:val="1066"/>
         </w:numPr>
       </w:pPr>
       <w:r>
@@ -19116,7 +19562,7 @@
         <w:pStyle w:val="Compact"/>
         <w:numPr>
           <w:ilvl w:val="0"/>
-          <w:numId w:val="1064"/>
+          <w:numId w:val="1066"/>
         </w:numPr>
       </w:pPr>
       <w:r>
@@ -19137,7 +19583,7 @@
         <w:pStyle w:val="Compact"/>
         <w:numPr>
           <w:ilvl w:val="0"/>
-          <w:numId w:val="1064"/>
+          <w:numId w:val="1066"/>
         </w:numPr>
       </w:pPr>
       <w:r>
@@ -19158,7 +19604,7 @@
         <w:pStyle w:val="Compact"/>
         <w:numPr>
           <w:ilvl w:val="0"/>
-          <w:numId w:val="1064"/>
+          <w:numId w:val="1066"/>
         </w:numPr>
       </w:pPr>
       <w:r>
@@ -19191,7 +19637,7 @@
         <w:pStyle w:val="Compact"/>
         <w:numPr>
           <w:ilvl w:val="0"/>
-          <w:numId w:val="1065"/>
+          <w:numId w:val="1067"/>
         </w:numPr>
       </w:pPr>
       <w:r>
@@ -19212,7 +19658,7 @@
         <w:pStyle w:val="Compact"/>
         <w:numPr>
           <w:ilvl w:val="0"/>
-          <w:numId w:val="1065"/>
+          <w:numId w:val="1067"/>
         </w:numPr>
       </w:pPr>
       <w:r>
@@ -19233,7 +19679,7 @@
         <w:pStyle w:val="Compact"/>
         <w:numPr>
           <w:ilvl w:val="0"/>
-          <w:numId w:val="1065"/>
+          <w:numId w:val="1067"/>
         </w:numPr>
       </w:pPr>
       <w:r>
@@ -19254,7 +19700,7 @@
         <w:pStyle w:val="Compact"/>
         <w:numPr>
           <w:ilvl w:val="0"/>
-          <w:numId w:val="1065"/>
+          <w:numId w:val="1067"/>
         </w:numPr>
       </w:pPr>
       <w:r>
@@ -19311,18 +19757,18 @@
                 <wp:inline>
                   <wp:extent cx="152400" cy="152400"/>
                   <wp:effectExtent b="0" l="0" r="0" t="0"/>
-                  <wp:docPr descr="" title="" id="218" name="Picture"/>
+                  <wp:docPr descr="" title="" id="224" name="Picture"/>
                   <a:graphic>
                     <a:graphicData uri="http://schemas.openxmlformats.org/drawingml/2006/picture">
                       <pic:pic>
                         <pic:nvPicPr>
-                          <pic:cNvPr descr="/opt/quarto/share/formats/docx/tip.png" id="219" name="Picture"/>
+                          <pic:cNvPr descr="/opt/quarto/share/formats/docx/tip.png" id="225" name="Picture"/>
                           <pic:cNvPicPr>
                             <a:picLocks noChangeArrowheads="1" noChangeAspect="1"/>
                           </pic:cNvPicPr>
                         </pic:nvPicPr>
                         <pic:blipFill>
-                          <a:blip r:embed="rId217"/>
+                          <a:blip r:embed="rId223"/>
                           <a:stretch>
                             <a:fillRect/>
                           </a:stretch>
@@ -19387,7 +19833,7 @@
               <w:pStyle w:val="Compact"/>
               <w:numPr>
                 <w:ilvl w:val="0"/>
-                <w:numId w:val="1066"/>
+                <w:numId w:val="1068"/>
               </w:numPr>
             </w:pPr>
             <w:r>
@@ -19399,7 +19845,7 @@
               <w:pStyle w:val="Compact"/>
               <w:numPr>
                 <w:ilvl w:val="0"/>
-                <w:numId w:val="1066"/>
+                <w:numId w:val="1068"/>
               </w:numPr>
             </w:pPr>
             <w:r>
@@ -19411,7 +19857,7 @@
               <w:pStyle w:val="Compact"/>
               <w:numPr>
                 <w:ilvl w:val="0"/>
-                <w:numId w:val="1066"/>
+                <w:numId w:val="1068"/>
               </w:numPr>
             </w:pPr>
             <w:r>
@@ -19488,18 +19934,18 @@
                 <wp:inline>
                   <wp:extent cx="152400" cy="152400"/>
                   <wp:effectExtent b="0" l="0" r="0" t="0"/>
-                  <wp:docPr descr="" title="" id="220" name="Picture"/>
+                  <wp:docPr descr="" title="" id="226" name="Picture"/>
                   <a:graphic>
                     <a:graphicData uri="http://schemas.openxmlformats.org/drawingml/2006/picture">
                       <pic:pic>
                         <pic:nvPicPr>
-                          <pic:cNvPr descr="/opt/quarto/share/formats/docx/note.png" id="221" name="Picture"/>
+                          <pic:cNvPr descr="/opt/quarto/share/formats/docx/note.png" id="227" name="Picture"/>
                           <pic:cNvPicPr>
                             <a:picLocks noChangeArrowheads="1" noChangeAspect="1"/>
                           </pic:cNvPicPr>
                         </pic:nvPicPr>
                         <pic:blipFill>
-                          <a:blip r:embed="rId192"/>
+                          <a:blip r:embed="rId198"/>
                           <a:stretch>
                             <a:fillRect/>
                           </a:stretch>
@@ -19564,7 +20010,7 @@
               <w:pStyle w:val="Compact"/>
               <w:numPr>
                 <w:ilvl w:val="0"/>
-                <w:numId w:val="1067"/>
+                <w:numId w:val="1069"/>
               </w:numPr>
             </w:pPr>
             <w:r>
@@ -19576,7 +20022,7 @@
               <w:pStyle w:val="Compact"/>
               <w:numPr>
                 <w:ilvl w:val="0"/>
-                <w:numId w:val="1067"/>
+                <w:numId w:val="1069"/>
               </w:numPr>
             </w:pPr>
             <w:r>
@@ -19588,7 +20034,7 @@
               <w:pStyle w:val="Compact"/>
               <w:numPr>
                 <w:ilvl w:val="0"/>
-                <w:numId w:val="1067"/>
+                <w:numId w:val="1069"/>
               </w:numPr>
             </w:pPr>
             <w:r>
@@ -19600,7 +20046,7 @@
               <w:pStyle w:val="Compact"/>
               <w:numPr>
                 <w:ilvl w:val="0"/>
-                <w:numId w:val="1067"/>
+                <w:numId w:val="1069"/>
               </w:numPr>
             </w:pPr>
             <w:r>
@@ -19634,9 +20080,9 @@
         </w:tc>
       </w:tr>
     </w:tbl>
-    <w:bookmarkEnd w:id="222"/>
-    <w:bookmarkEnd w:id="223"/>
-    <w:bookmarkStart w:id="295" w:name="references"/>
+    <w:bookmarkEnd w:id="228"/>
+    <w:bookmarkEnd w:id="229"/>
+    <w:bookmarkStart w:id="302" w:name="references"/>
     <w:p>
       <w:pPr>
         <w:pStyle w:val="Heading1"/>
@@ -19645,8 +20091,8 @@
         <w:t xml:space="preserve">References</w:t>
       </w:r>
     </w:p>
-    <w:bookmarkStart w:id="294" w:name="refs"/>
-    <w:bookmarkStart w:id="225" w:name="ref-space_odyssey"/>
+    <w:bookmarkStart w:id="301" w:name="refs"/>
+    <w:bookmarkStart w:id="231" w:name="ref-space_odyssey"/>
     <w:p>
       <w:pPr>
         <w:pStyle w:val="Bibliography"/>
@@ -19664,7 +20110,7 @@
       <w:r>
         <w:t xml:space="preserve"> </w:t>
       </w:r>
-      <w:hyperlink r:id="rId224">
+      <w:hyperlink r:id="rId230">
         <w:r>
           <w:rPr>
             <w:rStyle w:val="Hyperlink"/>
@@ -19676,14 +20122,14 @@
         <w:t xml:space="preserve">.</w:t>
       </w:r>
     </w:p>
-    <w:bookmarkEnd w:id="225"/>
-    <w:bookmarkStart w:id="227" w:name="ref-kiro_docs"/>
+    <w:bookmarkEnd w:id="231"/>
+    <w:bookmarkStart w:id="232" w:name="ref-akhouri_quicksilver"/>
     <w:p>
       <w:pPr>
         <w:pStyle w:val="Bibliography"/>
       </w:pPr>
       <w:r>
-        <w:t xml:space="preserve">Amazon Web Services. 2026.</w:t>
+        <w:t xml:space="preserve">Akhouri, Udit. 2026.</w:t>
       </w:r>
       <w:r>
         <w:t xml:space="preserve"> </w:t>
@@ -19693,6 +20139,43 @@
           <w:i/>
           <w:iCs/>
         </w:rPr>
+        <w:t xml:space="preserve">Quicksilver: Claude Code Skill and Plugin for Bulk Judgment Delegation</w:t>
+      </w:r>
+      <w:r>
+        <w:t xml:space="preserve">. GitHub repository.</w:t>
+      </w:r>
+      <w:r>
+        <w:t xml:space="preserve"> </w:t>
+      </w:r>
+      <w:hyperlink r:id="rId127">
+        <w:r>
+          <w:rPr>
+            <w:rStyle w:val="Hyperlink"/>
+          </w:rPr>
+          <w:t xml:space="preserve">https://github.com/UditAkhourii/quicksilver</w:t>
+        </w:r>
+      </w:hyperlink>
+      <w:r>
+        <w:t xml:space="preserve">.</w:t>
+      </w:r>
+    </w:p>
+    <w:bookmarkEnd w:id="232"/>
+    <w:bookmarkStart w:id="234" w:name="ref-kiro_docs"/>
+    <w:p>
+      <w:pPr>
+        <w:pStyle w:val="Bibliography"/>
+      </w:pPr>
+      <w:r>
+        <w:t xml:space="preserve">Amazon Web Services. 2026.</w:t>
+      </w:r>
+      <w:r>
+        <w:t xml:space="preserve"> </w:t>
+      </w:r>
+      <w:r>
+        <w:rPr>
+          <w:i/>
+          <w:iCs/>
+        </w:rPr>
         <w:t xml:space="preserve">Kiro Documentation</w:t>
       </w:r>
       <w:r>
@@ -19701,7 +20184,7 @@
       <w:r>
         <w:t xml:space="preserve"> </w:t>
       </w:r>
-      <w:hyperlink r:id="rId226">
+      <w:hyperlink r:id="rId233">
         <w:r>
           <w:rPr>
             <w:rStyle w:val="Hyperlink"/>
@@ -19713,8 +20196,8 @@
         <w:t xml:space="preserve">.</w:t>
       </w:r>
     </w:p>
-    <w:bookmarkEnd w:id="227"/>
-    <w:bookmarkStart w:id="228" w:name="ref-claude_research_help"/>
+    <w:bookmarkEnd w:id="234"/>
+    <w:bookmarkStart w:id="235" w:name="ref-claude_research_help"/>
     <w:p>
       <w:pPr>
         <w:pStyle w:val="Bibliography"/>
@@ -19738,7 +20221,7 @@
       <w:r>
         <w:t xml:space="preserve"> </w:t>
       </w:r>
-      <w:hyperlink r:id="rId135">
+      <w:hyperlink r:id="rId141">
         <w:r>
           <w:rPr>
             <w:rStyle w:val="Hyperlink"/>
@@ -19750,8 +20233,8 @@
         <w:t xml:space="preserve">.</w:t>
       </w:r>
     </w:p>
-    <w:bookmarkEnd w:id="228"/>
-    <w:bookmarkStart w:id="229" w:name="ref-claude_web_search_tool"/>
+    <w:bookmarkEnd w:id="235"/>
+    <w:bookmarkStart w:id="236" w:name="ref-claude_web_search_tool"/>
     <w:p>
       <w:pPr>
         <w:pStyle w:val="Bibliography"/>
@@ -19775,7 +20258,7 @@
       <w:r>
         <w:t xml:space="preserve"> </w:t>
       </w:r>
-      <w:hyperlink r:id="rId136">
+      <w:hyperlink r:id="rId142">
         <w:r>
           <w:rPr>
             <w:rStyle w:val="Hyperlink"/>
@@ -19787,8 +20270,8 @@
         <w:t xml:space="preserve">.</w:t>
       </w:r>
     </w:p>
-    <w:bookmarkEnd w:id="229"/>
-    <w:bookmarkStart w:id="231" w:name="ref-claude_research_when"/>
+    <w:bookmarkEnd w:id="236"/>
+    <w:bookmarkStart w:id="238" w:name="ref-claude_research_when"/>
     <w:p>
       <w:pPr>
         <w:pStyle w:val="Bibliography"/>
@@ -19812,7 +20295,7 @@
       <w:r>
         <w:t xml:space="preserve"> </w:t>
       </w:r>
-      <w:hyperlink r:id="rId230">
+      <w:hyperlink r:id="rId237">
         <w:r>
           <w:rPr>
             <w:rStyle w:val="Hyperlink"/>
@@ -19824,8 +20307,8 @@
         <w:t xml:space="preserve">.</w:t>
       </w:r>
     </w:p>
-    <w:bookmarkEnd w:id="231"/>
-    <w:bookmarkStart w:id="233" w:name="ref-i_robot"/>
+    <w:bookmarkEnd w:id="238"/>
+    <w:bookmarkStart w:id="240" w:name="ref-i_robot"/>
     <w:p>
       <w:pPr>
         <w:pStyle w:val="Bibliography"/>
@@ -19849,7 +20332,7 @@
       <w:r>
         <w:t xml:space="preserve"> </w:t>
       </w:r>
-      <w:hyperlink r:id="rId232">
+      <w:hyperlink r:id="rId239">
         <w:r>
           <w:rPr>
             <w:rStyle w:val="Hyperlink"/>
@@ -19861,8 +20344,8 @@
         <w:t xml:space="preserve">.</w:t>
       </w:r>
     </w:p>
-    <w:bookmarkEnd w:id="233"/>
-    <w:bookmarkStart w:id="235" w:name="ref-battlestar_galactica_2004"/>
+    <w:bookmarkEnd w:id="240"/>
+    <w:bookmarkStart w:id="242" w:name="ref-battlestar_galactica_2004"/>
     <w:p>
       <w:pPr>
         <w:pStyle w:val="Bibliography"/>
@@ -19880,7 +20363,7 @@
       <w:r>
         <w:t xml:space="preserve"> </w:t>
       </w:r>
-      <w:hyperlink r:id="rId234">
+      <w:hyperlink r:id="rId241">
         <w:r>
           <w:rPr>
             <w:rStyle w:val="Hyperlink"/>
@@ -19892,8 +20375,8 @@
         <w:t xml:space="preserve">.</w:t>
       </w:r>
     </w:p>
-    <w:bookmarkEnd w:id="235"/>
-    <w:bookmarkStart w:id="237" w:name="ref-blade_runner"/>
+    <w:bookmarkEnd w:id="242"/>
+    <w:bookmarkStart w:id="244" w:name="ref-blade_runner"/>
     <w:p>
       <w:pPr>
         <w:pStyle w:val="Bibliography"/>
@@ -19911,7 +20394,7 @@
       <w:r>
         <w:t xml:space="preserve"> </w:t>
       </w:r>
-      <w:hyperlink r:id="rId236">
+      <w:hyperlink r:id="rId243">
         <w:r>
           <w:rPr>
             <w:rStyle w:val="Hyperlink"/>
@@ -19923,8 +20406,8 @@
         <w:t xml:space="preserve">.</w:t>
       </w:r>
     </w:p>
-    <w:bookmarkEnd w:id="237"/>
-    <w:bookmarkStart w:id="239" w:name="ref-enders_game"/>
+    <w:bookmarkEnd w:id="244"/>
+    <w:bookmarkStart w:id="246" w:name="ref-enders_game"/>
     <w:p>
       <w:pPr>
         <w:pStyle w:val="Bibliography"/>
@@ -19948,7 +20431,7 @@
       <w:r>
         <w:t xml:space="preserve"> </w:t>
       </w:r>
-      <w:hyperlink r:id="rId238">
+      <w:hyperlink r:id="rId245">
         <w:r>
           <w:rPr>
             <w:rStyle w:val="Hyperlink"/>
@@ -19960,8 +20443,8 @@
         <w:t xml:space="preserve">.</w:t>
       </w:r>
     </w:p>
-    <w:bookmarkEnd w:id="239"/>
-    <w:bookmarkStart w:id="240" w:name="ref-cline_site"/>
+    <w:bookmarkEnd w:id="246"/>
+    <w:bookmarkStart w:id="247" w:name="ref-cline_site"/>
     <w:p>
       <w:pPr>
         <w:pStyle w:val="Bibliography"/>
@@ -19997,8 +20480,8 @@
         <w:t xml:space="preserve">.</w:t>
       </w:r>
     </w:p>
-    <w:bookmarkEnd w:id="240"/>
-    <w:bookmarkStart w:id="242" w:name="ref-devin_docs"/>
+    <w:bookmarkEnd w:id="247"/>
+    <w:bookmarkStart w:id="249" w:name="ref-devin_docs"/>
     <w:p>
       <w:pPr>
         <w:pStyle w:val="Bibliography"/>
@@ -20022,7 +20505,7 @@
       <w:r>
         <w:t xml:space="preserve"> </w:t>
       </w:r>
-      <w:hyperlink r:id="rId241">
+      <w:hyperlink r:id="rId248">
         <w:r>
           <w:rPr>
             <w:rStyle w:val="Hyperlink"/>
@@ -20034,8 +20517,8 @@
         <w:t xml:space="preserve">.</w:t>
       </w:r>
     </w:p>
-    <w:bookmarkEnd w:id="242"/>
-    <w:bookmarkStart w:id="244" w:name="ref-cursor_cloud_agents"/>
+    <w:bookmarkEnd w:id="249"/>
+    <w:bookmarkStart w:id="251" w:name="ref-cursor_cloud_agents"/>
     <w:p>
       <w:pPr>
         <w:pStyle w:val="Bibliography"/>
@@ -20059,7 +20542,7 @@
       <w:r>
         <w:t xml:space="preserve"> </w:t>
       </w:r>
-      <w:hyperlink r:id="rId243">
+      <w:hyperlink r:id="rId250">
         <w:r>
           <w:rPr>
             <w:rStyle w:val="Hyperlink"/>
@@ -20071,8 +20554,8 @@
         <w:t xml:space="preserve">.</w:t>
       </w:r>
     </w:p>
-    <w:bookmarkEnd w:id="244"/>
-    <w:bookmarkStart w:id="246" w:name="ref-humans_are_dead"/>
+    <w:bookmarkEnd w:id="251"/>
+    <w:bookmarkStart w:id="253" w:name="ref-humans_are_dead"/>
     <w:p>
       <w:pPr>
         <w:pStyle w:val="Bibliography"/>
@@ -20096,7 +20579,7 @@
       <w:r>
         <w:t xml:space="preserve"> </w:t>
       </w:r>
-      <w:hyperlink r:id="rId245">
+      <w:hyperlink r:id="rId252">
         <w:r>
           <w:rPr>
             <w:rStyle w:val="Hyperlink"/>
@@ -20108,8 +20591,8 @@
         <w:t xml:space="preserve">.</w:t>
       </w:r>
     </w:p>
-    <w:bookmarkEnd w:id="246"/>
-    <w:bookmarkStart w:id="248" w:name="ref-citadel_architecture"/>
+    <w:bookmarkEnd w:id="253"/>
+    <w:bookmarkStart w:id="255" w:name="ref-citadel_architecture"/>
     <w:p>
       <w:pPr>
         <w:pStyle w:val="Bibliography"/>
@@ -20133,7 +20616,7 @@
       <w:r>
         <w:t xml:space="preserve"> </w:t>
       </w:r>
-      <w:hyperlink r:id="rId247">
+      <w:hyperlink r:id="rId254">
         <w:r>
           <w:rPr>
             <w:rStyle w:val="Hyperlink"/>
@@ -20145,8 +20628,8 @@
         <w:t xml:space="preserve">.</w:t>
       </w:r>
     </w:p>
-    <w:bookmarkEnd w:id="248"/>
-    <w:bookmarkStart w:id="250" w:name="ref-citadel_experiments"/>
+    <w:bookmarkEnd w:id="255"/>
+    <w:bookmarkStart w:id="257" w:name="ref-citadel_experiments"/>
     <w:p>
       <w:pPr>
         <w:pStyle w:val="Bibliography"/>
@@ -20170,7 +20653,7 @@
       <w:r>
         <w:t xml:space="preserve"> </w:t>
       </w:r>
-      <w:hyperlink r:id="rId249">
+      <w:hyperlink r:id="rId256">
         <w:r>
           <w:rPr>
             <w:rStyle w:val="Hyperlink"/>
@@ -20182,8 +20665,8 @@
         <w:t xml:space="preserve">.</w:t>
       </w:r>
     </w:p>
-    <w:bookmarkEnd w:id="250"/>
-    <w:bookmarkStart w:id="252" w:name="ref-citadel_threat_model"/>
+    <w:bookmarkEnd w:id="257"/>
+    <w:bookmarkStart w:id="259" w:name="ref-citadel_threat_model"/>
     <w:p>
       <w:pPr>
         <w:pStyle w:val="Bibliography"/>
@@ -20207,7 +20690,7 @@
       <w:r>
         <w:t xml:space="preserve"> </w:t>
       </w:r>
-      <w:hyperlink r:id="rId251">
+      <w:hyperlink r:id="rId258">
         <w:r>
           <w:rPr>
             <w:rStyle w:val="Hyperlink"/>
@@ -20219,8 +20702,8 @@
         <w:t xml:space="preserve">.</w:t>
       </w:r>
     </w:p>
-    <w:bookmarkEnd w:id="252"/>
-    <w:bookmarkStart w:id="253" w:name="ref-citadel_repo"/>
+    <w:bookmarkEnd w:id="259"/>
+    <w:bookmarkStart w:id="260" w:name="ref-citadel_repo"/>
     <w:p>
       <w:pPr>
         <w:pStyle w:val="Bibliography"/>
@@ -20244,7 +20727,7 @@
       <w:r>
         <w:t xml:space="preserve"> </w:t>
       </w:r>
-      <w:hyperlink r:id="rId200">
+      <w:hyperlink r:id="rId206">
         <w:r>
           <w:rPr>
             <w:rStyle w:val="Hyperlink"/>
@@ -20256,8 +20739,8 @@
         <w:t xml:space="preserve">.</w:t>
       </w:r>
     </w:p>
-    <w:bookmarkEnd w:id="253"/>
-    <w:bookmarkStart w:id="255" w:name="ref-gemini_deep_research_max"/>
+    <w:bookmarkEnd w:id="260"/>
+    <w:bookmarkStart w:id="262" w:name="ref-gemini_deep_research_max"/>
     <w:p>
       <w:pPr>
         <w:pStyle w:val="Bibliography"/>
@@ -20281,7 +20764,7 @@
       <w:r>
         <w:t xml:space="preserve"> </w:t>
       </w:r>
-      <w:hyperlink r:id="rId254">
+      <w:hyperlink r:id="rId261">
         <w:r>
           <w:rPr>
             <w:rStyle w:val="Hyperlink"/>
@@ -20293,8 +20776,8 @@
         <w:t xml:space="preserve">.</w:t>
       </w:r>
     </w:p>
-    <w:bookmarkEnd w:id="255"/>
-    <w:bookmarkStart w:id="257" w:name="ref-gemini_apps_limits"/>
+    <w:bookmarkEnd w:id="262"/>
+    <w:bookmarkStart w:id="264" w:name="ref-gemini_apps_limits"/>
     <w:p>
       <w:pPr>
         <w:pStyle w:val="Bibliography"/>
@@ -20318,7 +20801,7 @@
       <w:r>
         <w:t xml:space="preserve"> </w:t>
       </w:r>
-      <w:hyperlink r:id="rId256">
+      <w:hyperlink r:id="rId263">
         <w:r>
           <w:rPr>
             <w:rStyle w:val="Hyperlink"/>
@@ -20330,8 +20813,8 @@
         <w:t xml:space="preserve">.</w:t>
       </w:r>
     </w:p>
-    <w:bookmarkEnd w:id="257"/>
-    <w:bookmarkStart w:id="258" w:name="ref-gemini_deep_research_api"/>
+    <w:bookmarkEnd w:id="264"/>
+    <w:bookmarkStart w:id="265" w:name="ref-gemini_deep_research_api"/>
     <w:p>
       <w:pPr>
         <w:pStyle w:val="Bibliography"/>
@@ -20355,7 +20838,7 @@
       <w:r>
         <w:t xml:space="preserve"> </w:t>
       </w:r>
-      <w:hyperlink r:id="rId139">
+      <w:hyperlink r:id="rId145">
         <w:r>
           <w:rPr>
             <w:rStyle w:val="Hyperlink"/>
@@ -20367,8 +20850,8 @@
         <w:t xml:space="preserve">.</w:t>
       </w:r>
     </w:p>
-    <w:bookmarkEnd w:id="258"/>
-    <w:bookmarkStart w:id="260" w:name="ref-jules_docs"/>
+    <w:bookmarkEnd w:id="265"/>
+    <w:bookmarkStart w:id="267" w:name="ref-jules_docs"/>
     <w:p>
       <w:pPr>
         <w:pStyle w:val="Bibliography"/>
@@ -20392,7 +20875,7 @@
       <w:r>
         <w:t xml:space="preserve"> </w:t>
       </w:r>
-      <w:hyperlink r:id="rId259">
+      <w:hyperlink r:id="rId266">
         <w:r>
           <w:rPr>
             <w:rStyle w:val="Hyperlink"/>
@@ -20404,8 +20887,8 @@
         <w:t xml:space="preserve">.</w:t>
       </w:r>
     </w:p>
-    <w:bookmarkEnd w:id="260"/>
-    <w:bookmarkStart w:id="261" w:name="ref-gemini_deep_research_help"/>
+    <w:bookmarkEnd w:id="267"/>
+    <w:bookmarkStart w:id="268" w:name="ref-gemini_deep_research_help"/>
     <w:p>
       <w:pPr>
         <w:pStyle w:val="Bibliography"/>
@@ -20429,7 +20912,7 @@
       <w:r>
         <w:t xml:space="preserve"> </w:t>
       </w:r>
-      <w:hyperlink r:id="rId138">
+      <w:hyperlink r:id="rId144">
         <w:r>
           <w:rPr>
             <w:rStyle w:val="Hyperlink"/>
@@ -20441,8 +20924,8 @@
         <w:t xml:space="preserve">.</w:t>
       </w:r>
     </w:p>
-    <w:bookmarkEnd w:id="261"/>
-    <w:bookmarkStart w:id="263" w:name="ref-dune"/>
+    <w:bookmarkEnd w:id="268"/>
+    <w:bookmarkStart w:id="270" w:name="ref-dune"/>
     <w:p>
       <w:pPr>
         <w:pStyle w:val="Bibliography"/>
@@ -20466,7 +20949,7 @@
       <w:r>
         <w:t xml:space="preserve"> </w:t>
       </w:r>
-      <w:hyperlink r:id="rId262">
+      <w:hyperlink r:id="rId269">
         <w:r>
           <w:rPr>
             <w:rStyle w:val="Hyperlink"/>
@@ -20478,8 +20961,8 @@
         <w:t xml:space="preserve">.</w:t>
       </w:r>
     </w:p>
-    <w:bookmarkEnd w:id="263"/>
-    <w:bookmarkStart w:id="265" w:name="ref-hyperautomation_claude_limits"/>
+    <w:bookmarkEnd w:id="270"/>
+    <w:bookmarkStart w:id="272" w:name="ref-hyperautomation_claude_limits"/>
     <w:p>
       <w:pPr>
         <w:pStyle w:val="Bibliography"/>
@@ -20503,7 +20986,7 @@
       <w:r>
         <w:t xml:space="preserve"> </w:t>
       </w:r>
-      <w:hyperlink r:id="rId264">
+      <w:hyperlink r:id="rId271">
         <w:r>
           <w:rPr>
             <w:rStyle w:val="Hyperlink"/>
@@ -20515,8 +20998,8 @@
         <w:t xml:space="preserve">.</w:t>
       </w:r>
     </w:p>
-    <w:bookmarkEnd w:id="265"/>
-    <w:bookmarkStart w:id="267" w:name="ref-lecun_world_models"/>
+    <w:bookmarkEnd w:id="272"/>
+    <w:bookmarkStart w:id="274" w:name="ref-lecun_world_models"/>
     <w:p>
       <w:pPr>
         <w:pStyle w:val="Bibliography"/>
@@ -20540,7 +21023,7 @@
       <w:r>
         <w:t xml:space="preserve"> </w:t>
       </w:r>
-      <w:hyperlink r:id="rId266">
+      <w:hyperlink r:id="rId273">
         <w:r>
           <w:rPr>
             <w:rStyle w:val="Hyperlink"/>
@@ -20552,8 +21035,8 @@
         <w:t xml:space="preserve">.</w:t>
       </w:r>
     </w:p>
-    <w:bookmarkEnd w:id="267"/>
-    <w:bookmarkStart w:id="268" w:name="ref-ms_copilot_conversation_modes"/>
+    <w:bookmarkEnd w:id="274"/>
+    <w:bookmarkStart w:id="275" w:name="ref-ms_copilot_conversation_modes"/>
     <w:p>
       <w:pPr>
         <w:pStyle w:val="Bibliography"/>
@@ -20577,7 +21060,7 @@
       <w:r>
         <w:t xml:space="preserve"> </w:t>
       </w:r>
-      <w:hyperlink r:id="rId145">
+      <w:hyperlink r:id="rId151">
         <w:r>
           <w:rPr>
             <w:rStyle w:val="Hyperlink"/>
@@ -20589,8 +21072,8 @@
         <w:t xml:space="preserve">.</w:t>
       </w:r>
     </w:p>
-    <w:bookmarkEnd w:id="268"/>
-    <w:bookmarkStart w:id="270" w:name="ref-ms_copilot_deep_research_retired"/>
+    <w:bookmarkEnd w:id="275"/>
+    <w:bookmarkStart w:id="277" w:name="ref-ms_copilot_deep_research_retired"/>
     <w:p>
       <w:pPr>
         <w:pStyle w:val="Bibliography"/>
@@ -20614,7 +21097,7 @@
       <w:r>
         <w:t xml:space="preserve"> </w:t>
       </w:r>
-      <w:hyperlink r:id="rId269">
+      <w:hyperlink r:id="rId276">
         <w:r>
           <w:rPr>
             <w:rStyle w:val="Hyperlink"/>
@@ -20626,8 +21109,8 @@
         <w:t xml:space="preserve">.</w:t>
       </w:r>
     </w:p>
-    <w:bookmarkEnd w:id="270"/>
-    <w:bookmarkStart w:id="271" w:name="ref-ms_researcher_help"/>
+    <w:bookmarkEnd w:id="277"/>
+    <w:bookmarkStart w:id="278" w:name="ref-ms_researcher_help"/>
     <w:p>
       <w:pPr>
         <w:pStyle w:val="Bibliography"/>
@@ -20651,7 +21134,7 @@
       <w:r>
         <w:t xml:space="preserve"> </w:t>
       </w:r>
-      <w:hyperlink r:id="rId144">
+      <w:hyperlink r:id="rId150">
         <w:r>
           <w:rPr>
             <w:rStyle w:val="Hyperlink"/>
@@ -20663,8 +21146,8 @@
         <w:t xml:space="preserve">.</w:t>
       </w:r>
     </w:p>
-    <w:bookmarkEnd w:id="271"/>
-    <w:bookmarkStart w:id="273" w:name="ref-ms_researcher_faq"/>
+    <w:bookmarkEnd w:id="278"/>
+    <w:bookmarkStart w:id="280" w:name="ref-ms_researcher_faq"/>
     <w:p>
       <w:pPr>
         <w:pStyle w:val="Bibliography"/>
@@ -20688,7 +21171,7 @@
       <w:r>
         <w:t xml:space="preserve"> </w:t>
       </w:r>
-      <w:hyperlink r:id="rId272">
+      <w:hyperlink r:id="rId279">
         <w:r>
           <w:rPr>
             <w:rStyle w:val="Hyperlink"/>
@@ -20700,8 +21183,8 @@
         <w:t xml:space="preserve">.</w:t>
       </w:r>
     </w:p>
-    <w:bookmarkEnd w:id="273"/>
-    <w:bookmarkStart w:id="275" w:name="ref-ms_researcher_overview"/>
+    <w:bookmarkEnd w:id="280"/>
+    <w:bookmarkStart w:id="282" w:name="ref-ms_researcher_overview"/>
     <w:p>
       <w:pPr>
         <w:pStyle w:val="Bibliography"/>
@@ -20725,7 +21208,7 @@
       <w:r>
         <w:t xml:space="preserve"> </w:t>
       </w:r>
-      <w:hyperlink r:id="rId274">
+      <w:hyperlink r:id="rId281">
         <w:r>
           <w:rPr>
             <w:rStyle w:val="Hyperlink"/>
@@ -20737,8 +21220,8 @@
         <w:t xml:space="preserve">.</w:t>
       </w:r>
     </w:p>
-    <w:bookmarkEnd w:id="275"/>
-    <w:bookmarkStart w:id="276" w:name="ref-ollama_site"/>
+    <w:bookmarkEnd w:id="282"/>
+    <w:bookmarkStart w:id="283" w:name="ref-ollama_site"/>
     <w:p>
       <w:pPr>
         <w:pStyle w:val="Bibliography"/>
@@ -20774,8 +21257,8 @@
         <w:t xml:space="preserve">.</w:t>
       </w:r>
     </w:p>
-    <w:bookmarkEnd w:id="276"/>
-    <w:bookmarkStart w:id="277" w:name="ref-openai_deep_research_api"/>
+    <w:bookmarkEnd w:id="283"/>
+    <w:bookmarkStart w:id="284" w:name="ref-openai_deep_research_api"/>
     <w:p>
       <w:pPr>
         <w:pStyle w:val="Bibliography"/>
@@ -20799,7 +21282,7 @@
       <w:r>
         <w:t xml:space="preserve"> </w:t>
       </w:r>
-      <w:hyperlink r:id="rId142">
+      <w:hyperlink r:id="rId148">
         <w:r>
           <w:rPr>
             <w:rStyle w:val="Hyperlink"/>
@@ -20811,8 +21294,8 @@
         <w:t xml:space="preserve">.</w:t>
       </w:r>
     </w:p>
-    <w:bookmarkEnd w:id="277"/>
-    <w:bookmarkStart w:id="278" w:name="ref-openai_deep_research_help"/>
+    <w:bookmarkEnd w:id="284"/>
+    <w:bookmarkStart w:id="285" w:name="ref-openai_deep_research_help"/>
     <w:p>
       <w:pPr>
         <w:pStyle w:val="Bibliography"/>
@@ -20836,7 +21319,7 @@
       <w:r>
         <w:t xml:space="preserve"> </w:t>
       </w:r>
-      <w:hyperlink r:id="rId141">
+      <w:hyperlink r:id="rId147">
         <w:r>
           <w:rPr>
             <w:rStyle w:val="Hyperlink"/>
@@ -20848,8 +21331,8 @@
         <w:t xml:space="preserve">.</w:t>
       </w:r>
     </w:p>
-    <w:bookmarkEnd w:id="278"/>
-    <w:bookmarkStart w:id="280" w:name="ref-opencode_docs"/>
+    <w:bookmarkEnd w:id="285"/>
+    <w:bookmarkStart w:id="287" w:name="ref-opencode_docs"/>
     <w:p>
       <w:pPr>
         <w:pStyle w:val="Bibliography"/>
@@ -20873,7 +21356,7 @@
       <w:r>
         <w:t xml:space="preserve"> </w:t>
       </w:r>
-      <w:hyperlink r:id="rId279">
+      <w:hyperlink r:id="rId286">
         <w:r>
           <w:rPr>
             <w:rStyle w:val="Hyperlink"/>
@@ -20885,8 +21368,8 @@
         <w:t xml:space="preserve">.</w:t>
       </w:r>
     </w:p>
-    <w:bookmarkEnd w:id="280"/>
-    <w:bookmarkStart w:id="281" w:name="ref-openhands_docs"/>
+    <w:bookmarkEnd w:id="287"/>
+    <w:bookmarkStart w:id="288" w:name="ref-openhands_docs"/>
     <w:p>
       <w:pPr>
         <w:pStyle w:val="Bibliography"/>
@@ -20922,8 +21405,8 @@
         <w:t xml:space="preserve">.</w:t>
       </w:r>
     </w:p>
-    <w:bookmarkEnd w:id="281"/>
-    <w:bookmarkStart w:id="282" w:name="ref-perplexity_sonar_deep_research"/>
+    <w:bookmarkEnd w:id="288"/>
+    <w:bookmarkStart w:id="289" w:name="ref-perplexity_sonar_deep_research"/>
     <w:p>
       <w:pPr>
         <w:pStyle w:val="Bibliography"/>
@@ -20947,7 +21430,7 @@
       <w:r>
         <w:t xml:space="preserve"> </w:t>
       </w:r>
-      <w:hyperlink r:id="rId149">
+      <w:hyperlink r:id="rId155">
         <w:r>
           <w:rPr>
             <w:rStyle w:val="Hyperlink"/>
@@ -20959,8 +21442,8 @@
         <w:t xml:space="preserve">.</w:t>
       </w:r>
     </w:p>
-    <w:bookmarkEnd w:id="282"/>
-    <w:bookmarkStart w:id="283" w:name="ref-perplexity_research_mode"/>
+    <w:bookmarkEnd w:id="289"/>
+    <w:bookmarkStart w:id="290" w:name="ref-perplexity_research_mode"/>
     <w:p>
       <w:pPr>
         <w:pStyle w:val="Bibliography"/>
@@ -20984,7 +21467,7 @@
       <w:r>
         <w:t xml:space="preserve"> </w:t>
       </w:r>
-      <w:hyperlink r:id="rId147">
+      <w:hyperlink r:id="rId153">
         <w:r>
           <w:rPr>
             <w:rStyle w:val="Hyperlink"/>
@@ -20996,8 +21479,8 @@
         <w:t xml:space="preserve">.</w:t>
       </w:r>
     </w:p>
-    <w:bookmarkEnd w:id="283"/>
-    <w:bookmarkStart w:id="284" w:name="ref-perplexity_advanced_deep_research"/>
+    <w:bookmarkEnd w:id="290"/>
+    <w:bookmarkStart w:id="291" w:name="ref-perplexity_advanced_deep_research"/>
     <w:p>
       <w:pPr>
         <w:pStyle w:val="Bibliography"/>
@@ -21021,7 +21504,7 @@
       <w:r>
         <w:t xml:space="preserve"> </w:t>
       </w:r>
-      <w:hyperlink r:id="rId148">
+      <w:hyperlink r:id="rId154">
         <w:r>
           <w:rPr>
             <w:rStyle w:val="Hyperlink"/>
@@ -21033,8 +21516,8 @@
         <w:t xml:space="preserve">.</w:t>
       </w:r>
     </w:p>
-    <w:bookmarkEnd w:id="284"/>
-    <w:bookmarkStart w:id="286" w:name="ref-ng_one_skill_stay_relevant"/>
+    <w:bookmarkEnd w:id="291"/>
+    <w:bookmarkStart w:id="293" w:name="ref-ng_one_skill_stay_relevant"/>
     <w:p>
       <w:pPr>
         <w:pStyle w:val="Bibliography"/>
@@ -21058,7 +21541,7 @@
       <w:r>
         <w:t xml:space="preserve"> </w:t>
       </w:r>
-      <w:hyperlink r:id="rId285">
+      <w:hyperlink r:id="rId292">
         <w:r>
           <w:rPr>
             <w:rStyle w:val="Hyperlink"/>
@@ -21070,8 +21553,8 @@
         <w:t xml:space="preserve">.</w:t>
       </w:r>
     </w:p>
-    <w:bookmarkEnd w:id="286"/>
-    <w:bookmarkStart w:id="288" w:name="ref-terminator"/>
+    <w:bookmarkEnd w:id="293"/>
+    <w:bookmarkStart w:id="295" w:name="ref-terminator"/>
     <w:p>
       <w:pPr>
         <w:pStyle w:val="Bibliography"/>
@@ -21089,7 +21572,7 @@
       <w:r>
         <w:t xml:space="preserve"> </w:t>
       </w:r>
-      <w:hyperlink r:id="rId287">
+      <w:hyperlink r:id="rId294">
         <w:r>
           <w:rPr>
             <w:rStyle w:val="Hyperlink"/>
@@ -21101,8 +21584,8 @@
         <w:t xml:space="preserve">.</w:t>
       </w:r>
     </w:p>
-    <w:bookmarkEnd w:id="288"/>
-    <w:bookmarkStart w:id="290" w:name="ref-matrix"/>
+    <w:bookmarkEnd w:id="295"/>
+    <w:bookmarkStart w:id="297" w:name="ref-matrix"/>
     <w:p>
       <w:pPr>
         <w:pStyle w:val="Bibliography"/>
@@ -21120,7 +21603,7 @@
       <w:r>
         <w:t xml:space="preserve"> </w:t>
       </w:r>
-      <w:hyperlink r:id="rId289">
+      <w:hyperlink r:id="rId296">
         <w:r>
           <w:rPr>
             <w:rStyle w:val="Hyperlink"/>
@@ -21132,8 +21615,8 @@
         <w:t xml:space="preserve">.</w:t>
       </w:r>
     </w:p>
-    <w:bookmarkEnd w:id="290"/>
-    <w:bookmarkStart w:id="292" w:name="ref-wargames"/>
+    <w:bookmarkEnd w:id="297"/>
+    <w:bookmarkStart w:id="299" w:name="ref-wargames"/>
     <w:p>
       <w:pPr>
         <w:pStyle w:val="Bibliography"/>
@@ -21151,7 +21634,7 @@
       <w:r>
         <w:t xml:space="preserve"> </w:t>
       </w:r>
-      <w:hyperlink r:id="rId291">
+      <w:hyperlink r:id="rId298">
         <w:r>
           <w:rPr>
             <w:rStyle w:val="Hyperlink"/>
@@ -21163,8 +21646,8 @@
         <w:t xml:space="preserve">.</w:t>
       </w:r>
     </w:p>
-    <w:bookmarkEnd w:id="292"/>
-    <w:bookmarkStart w:id="293" w:name="ref-warp_docs"/>
+    <w:bookmarkEnd w:id="299"/>
+    <w:bookmarkStart w:id="300" w:name="ref-warp_docs"/>
     <w:p>
       <w:pPr>
         <w:pStyle w:val="Bibliography"/>
@@ -21200,9 +21683,9 @@
         <w:t xml:space="preserve">.</w:t>
       </w:r>
     </w:p>
-    <w:bookmarkEnd w:id="293"/>
-    <w:bookmarkEnd w:id="294"/>
-    <w:bookmarkEnd w:id="295"/>
+    <w:bookmarkEnd w:id="300"/>
+    <w:bookmarkEnd w:id="301"/>
+    <w:bookmarkEnd w:id="302"/>
     <w:sectPr>
       <w:footnotePr>
         <w:numRestart w:val="eachSect"/>
@@ -21232,7 +21715,7 @@
       </w:r>
     </w:p>
   </w:footnote>
-  <w:footnote w:id="131">
+  <w:footnote w:id="137">
     <w:p>
       <w:pPr>
         <w:pStyle w:val="FootnoteText"/>
@@ -21608,6 +22091,12 @@
     <w:abstractNumId w:val="991"/>
   </w:num>
   <w:num w:numId="1020">
+    <w:abstractNumId w:val="991"/>
+  </w:num>
+  <w:num w:numId="1021">
+    <w:abstractNumId w:val="991"/>
+  </w:num>
+  <w:num w:numId="1022">
     <w:abstractNumId w:val="99411"/>
     <w:lvlOverride w:ilvl="0">
       <w:startOverride w:val="1"/>
@@ -21637,7 +22126,7 @@
       <w:startOverride w:val="1"/>
     </w:lvlOverride>
   </w:num>
-  <w:num w:numId="1021">
+  <w:num w:numId="1023">
     <w:abstractNumId w:val="99411"/>
     <w:lvlOverride w:ilvl="0">
       <w:startOverride w:val="1"/>
@@ -21666,12 +22155,6 @@
     <w:lvlOverride w:ilvl="8">
       <w:startOverride w:val="1"/>
     </w:lvlOverride>
-  </w:num>
-  <w:num w:numId="1022">
-    <w:abstractNumId w:val="991"/>
-  </w:num>
-  <w:num w:numId="1023">
-    <w:abstractNumId w:val="991"/>
   </w:num>
   <w:num w:numId="1024">
     <w:abstractNumId w:val="991"/>
@@ -21710,6 +22193,12 @@
     <w:abstractNumId w:val="991"/>
   </w:num>
   <w:num w:numId="1036">
+    <w:abstractNumId w:val="991"/>
+  </w:num>
+  <w:num w:numId="1037">
+    <w:abstractNumId w:val="991"/>
+  </w:num>
+  <w:num w:numId="1038">
     <w:abstractNumId w:val="99411"/>
     <w:lvlOverride w:ilvl="0">
       <w:startOverride w:val="1"/>
@@ -21739,13 +22228,13 @@
       <w:startOverride w:val="1"/>
     </w:lvlOverride>
   </w:num>
-  <w:num w:numId="1037">
+  <w:num w:numId="1039">
     <w:abstractNumId w:val="991"/>
   </w:num>
-  <w:num w:numId="1038">
+  <w:num w:numId="1040">
     <w:abstractNumId w:val="991"/>
   </w:num>
-  <w:num w:numId="1039">
+  <w:num w:numId="1041">
     <w:abstractNumId w:val="99411"/>
     <w:lvlOverride w:ilvl="0">
       <w:startOverride w:val="1"/>
@@ -21775,16 +22264,16 @@
       <w:startOverride w:val="1"/>
     </w:lvlOverride>
   </w:num>
-  <w:num w:numId="1040">
-    <w:abstractNumId w:val="991"/>
-  </w:num>
-  <w:num w:numId="1041">
-    <w:abstractNumId w:val="991"/>
-  </w:num>
   <w:num w:numId="1042">
     <w:abstractNumId w:val="991"/>
   </w:num>
   <w:num w:numId="1043">
+    <w:abstractNumId w:val="991"/>
+  </w:num>
+  <w:num w:numId="1044">
+    <w:abstractNumId w:val="991"/>
+  </w:num>
+  <w:num w:numId="1045">
     <w:abstractNumId w:val="99411"/>
     <w:lvlOverride w:ilvl="0">
       <w:startOverride w:val="1"/>
@@ -21814,7 +22303,7 @@
       <w:startOverride w:val="1"/>
     </w:lvlOverride>
   </w:num>
-  <w:num w:numId="1044">
+  <w:num w:numId="1046">
     <w:abstractNumId w:val="99411"/>
     <w:lvlOverride w:ilvl="0">
       <w:startOverride w:val="1"/>
@@ -21844,12 +22333,6 @@
       <w:startOverride w:val="1"/>
     </w:lvlOverride>
   </w:num>
-  <w:num w:numId="1045">
-    <w:abstractNumId w:val="991"/>
-  </w:num>
-  <w:num w:numId="1046">
-    <w:abstractNumId w:val="991"/>
-  </w:num>
   <w:num w:numId="1047">
     <w:abstractNumId w:val="991"/>
   </w:num>
@@ -21863,6 +22346,12 @@
     <w:abstractNumId w:val="991"/>
   </w:num>
   <w:num w:numId="1051">
+    <w:abstractNumId w:val="991"/>
+  </w:num>
+  <w:num w:numId="1052">
+    <w:abstractNumId w:val="991"/>
+  </w:num>
+  <w:num w:numId="1053">
     <w:abstractNumId w:val="99411"/>
     <w:lvlOverride w:ilvl="0">
       <w:startOverride w:val="1"/>
@@ -21891,12 +22380,6 @@
     <w:lvlOverride w:ilvl="8">
       <w:startOverride w:val="1"/>
     </w:lvlOverride>
-  </w:num>
-  <w:num w:numId="1052">
-    <w:abstractNumId w:val="991"/>
-  </w:num>
-  <w:num w:numId="1053">
-    <w:abstractNumId w:val="991"/>
   </w:num>
   <w:num w:numId="1054">
     <w:abstractNumId w:val="991"/>
@@ -21938,6 +22421,12 @@
     <w:abstractNumId w:val="991"/>
   </w:num>
   <w:num w:numId="1067">
+    <w:abstractNumId w:val="991"/>
+  </w:num>
+  <w:num w:numId="1068">
+    <w:abstractNumId w:val="991"/>
+  </w:num>
+  <w:num w:numId="1069">
     <w:abstractNumId w:val="991"/>
   </w:num>
 </w:numbering>

</xml_diff>

<commit_message>
Deploying to gh-pages from @ Morrison-Lab/wai@4f202771a721b409890ab0488733ed3be14729b5 🚀
</commit_message>
<xml_diff>
--- a/chapters/coding-agents.docx
+++ b/chapters/coding-agents.docx
@@ -15,7 +15,7 @@
         <w:pStyle w:val="Date"/>
       </w:pPr>
       <w:r>
-        <w:t xml:space="preserve">Last modified: 2026-10-03 15:28:00 (PDT)</w:t>
+        <w:t xml:space="preserve">Last modified: 2026-10-05 03:10:24 (PDT)</w:t>
       </w:r>
     </w:p>
     <w:p>
@@ -8969,7 +8969,7 @@
         <w:t xml:space="preserve"> </w:t>
       </w:r>
       <w:r>
-        <w:t xml:space="preserve">(Anthropic 2026a)</w:t>
+        <w:t xml:space="preserve">(Anthropic 2026b)</w:t>
       </w:r>
       <w:r>
         <w:t xml:space="preserve"> </w:t>
@@ -9011,7 +9011,7 @@
         <w:t xml:space="preserve"> </w:t>
       </w:r>
       <w:r>
-        <w:t xml:space="preserve">(Anthropic 2026c)</w:t>
+        <w:t xml:space="preserve">(Anthropic 2026d)</w:t>
       </w:r>
       <w:r>
         <w:t xml:space="preserve"> </w:t>
@@ -9064,7 +9064,7 @@
         <w:t xml:space="preserve"> </w:t>
       </w:r>
       <w:r>
-        <w:t xml:space="preserve">(Anthropic 2026a)</w:t>
+        <w:t xml:space="preserve">(Anthropic 2026b)</w:t>
       </w:r>
       <w:r>
         <w:t xml:space="preserve">.</w:t>
@@ -9128,7 +9128,7 @@
         <w:t xml:space="preserve"> </w:t>
       </w:r>
       <w:r>
-        <w:t xml:space="preserve">(Anthropic 2026b)</w:t>
+        <w:t xml:space="preserve">(Anthropic 2026c)</w:t>
       </w:r>
       <w:r>
         <w:t xml:space="preserve">:</w:t>
@@ -18863,7 +18863,7 @@
         <w:t xml:space="preserve"> </w:t>
       </w:r>
       <w:r>
-        <w:t xml:space="preserve">(Morrison Lab 2026)</w:t>
+        <w:t xml:space="preserve">(Morrison Lab 2026b)</w:t>
       </w:r>
       <w:r>
         <w:t xml:space="preserve">:</w:t>
@@ -19052,13 +19052,7 @@
         <w:t xml:space="preserve"> </w:t>
       </w:r>
       <w:r>
-        <w:t xml:space="preserve">These sites are safe,</w:t>
-      </w:r>
-      <w:r>
-        <w:t xml:space="preserve"> </w:t>
-      </w:r>
-      <w:r>
-        <w:t xml:space="preserve">reputable sources of documentation and packages</w:t>
+        <w:t xml:space="preserve">These sites are reputable sources of documentation and packages</w:t>
       </w:r>
       <w:r>
         <w:t xml:space="preserve"> </w:t>
@@ -19838,7 +19832,7 @@
         <w:rPr>
           <w:rStyle w:val="VerbatimChar"/>
         </w:rPr>
-        <w:t xml:space="preserve">github.com/tidyverse/*</w:t>
+        <w:t xml:space="preserve">https://github.com/tidyverse/</w:t>
       </w:r>
       <w:r>
         <w:t xml:space="preserve"> </w:t>
@@ -19859,7 +19853,7 @@
         <w:rPr>
           <w:rStyle w:val="VerbatimChar"/>
         </w:rPr>
-        <w:t xml:space="preserve">github.com/r-lib/*</w:t>
+        <w:t xml:space="preserve">https://github.com/r-lib/</w:t>
       </w:r>
       <w:r>
         <w:t xml:space="preserve"> </w:t>
@@ -19880,7 +19874,7 @@
         <w:rPr>
           <w:rStyle w:val="VerbatimChar"/>
         </w:rPr>
-        <w:t xml:space="preserve">github.com/rstudio/*</w:t>
+        <w:t xml:space="preserve">https://github.com/rstudio/</w:t>
       </w:r>
       <w:r>
         <w:t xml:space="preserve"> </w:t>
@@ -19901,7 +19895,7 @@
         <w:rPr>
           <w:rStyle w:val="VerbatimChar"/>
         </w:rPr>
-        <w:t xml:space="preserve">github.com/ropensci/*</w:t>
+        <w:t xml:space="preserve">https://github.com/ropensci/</w:t>
       </w:r>
       <w:r>
         <w:t xml:space="preserve"> </w:t>
@@ -20196,7 +20190,7 @@
               <w:spacing w:before="16"/>
             </w:pPr>
             <w:r>
-              <w:t xml:space="preserve">All URLs listed here are:</w:t>
+              <w:t xml:space="preserve">The hosts listed here are reputable documentation and package sources:</w:t>
             </w:r>
           </w:p>
           <w:p>
@@ -20208,7 +20202,13 @@
               </w:numPr>
             </w:pPr>
             <w:r>
-              <w:t xml:space="preserve">Maintained by reputable organizations (Tidyverse, RStudio/Posit, R Core Team, rOpenSci)</w:t>
+              <w:t xml:space="preserve">Most are run by established R projects and organizations</w:t>
+            </w:r>
+            <w:r>
+              <w:t xml:space="preserve"> </w:t>
+            </w:r>
+            <w:r>
+              <w:t xml:space="preserve">(Tidyverse, RStudio/Posit, R Core Team, rOpenSci)</w:t>
             </w:r>
           </w:p>
           <w:p>
@@ -20220,7 +20220,7 @@
               </w:numPr>
             </w:pPr>
             <w:r>
-              <w:t xml:space="preserve">Widely used in the R community</w:t>
+              <w:t xml:space="preserve">They are widely used in the R community</w:t>
             </w:r>
           </w:p>
           <w:p>
@@ -20232,19 +20232,7 @@
               </w:numPr>
             </w:pPr>
             <w:r>
-              <w:t xml:space="preserve">Focused on documentation and package distribution</w:t>
-            </w:r>
-          </w:p>
-          <w:p>
-            <w:pPr>
-              <w:pStyle w:val="Compact"/>
-              <w:numPr>
-                <w:ilvl w:val="0"/>
-                <w:numId w:val="1071"/>
-              </w:numPr>
-            </w:pPr>
-            <w:r>
-              <w:t xml:space="preserve">Safe for coding agents to access</w:t>
+              <w:t xml:space="preserve">They focus on documentation and package distribution</w:t>
             </w:r>
           </w:p>
           <w:p>
@@ -20255,19 +20243,249 @@
               <w:spacing w:after="16"/>
             </w:pPr>
             <w:r>
-              <w:t xml:space="preserve">These sites do not host user-generated content</w:t>
+              <w:t xml:space="preserve">Reputable does not mean that every page on a host is vetted.</w:t>
             </w:r>
             <w:r>
               <w:t xml:space="preserve"> </w:t>
             </w:r>
             <w:r>
-              <w:t xml:space="preserve">or allow arbitrary code execution,</w:t>
+              <w:t xml:space="preserve">Every allowed host is a place the agent can send data to,</w:t>
             </w:r>
             <w:r>
               <w:t xml:space="preserve"> </w:t>
             </w:r>
             <w:r>
-              <w:t xml:space="preserve">making them appropriate for inclusion in your allowlist.</w:t>
+              <w:t xml:space="preserve">or read instructions from</w:t>
+            </w:r>
+            <w:r>
+              <w:t xml:space="preserve"> </w:t>
+            </w:r>
+            <w:r>
+              <w:t xml:space="preserve">(Morrison Lab 2026a)</w:t>
+            </w:r>
+            <w:r>
+              <w:t xml:space="preserve">.</w:t>
+            </w:r>
+            <w:r>
+              <w:t xml:space="preserve"> </w:t>
+            </w:r>
+            <w:r>
+              <w:t xml:space="preserve">Claude’s allowlist takes one domain per line</w:t>
+            </w:r>
+            <w:r>
+              <w:t xml:space="preserve"> </w:t>
+            </w:r>
+            <w:r>
+              <w:t xml:space="preserve">(Anthropic 2026a)</w:t>
+            </w:r>
+            <w:r>
+              <w:t xml:space="preserve">.</w:t>
+            </w:r>
+            <w:r>
+              <w:t xml:space="preserve"> </w:t>
+            </w:r>
+            <w:r>
+              <w:t xml:space="preserve">A path entry such as</w:t>
+            </w:r>
+            <w:r>
+              <w:t xml:space="preserve"> </w:t>
+            </w:r>
+            <w:r>
+              <w:rPr>
+                <w:rStyle w:val="VerbatimChar"/>
+              </w:rPr>
+              <w:t xml:space="preserve">https://github.com/tidyverse/</w:t>
+            </w:r>
+            <w:r>
+              <w:t xml:space="preserve"> </w:t>
+            </w:r>
+            <w:r>
+              <w:t xml:space="preserve">cannot be expressed there;</w:t>
+            </w:r>
+            <w:r>
+              <w:t xml:space="preserve"> </w:t>
+            </w:r>
+            <w:r>
+              <w:t xml:space="preserve">allowing GitHub means allowing all of</w:t>
+            </w:r>
+            <w:r>
+              <w:t xml:space="preserve"> </w:t>
+            </w:r>
+            <w:r>
+              <w:rPr>
+                <w:rStyle w:val="VerbatimChar"/>
+              </w:rPr>
+              <w:t xml:space="preserve">github.com</w:t>
+            </w:r>
+            <w:r>
+              <w:t xml:space="preserve">.</w:t>
+            </w:r>
+            <w:r>
+              <w:t xml:space="preserve"> </w:t>
+            </w:r>
+            <w:r>
+              <w:t xml:space="preserve">Copilot accepts such a URL</w:t>
+            </w:r>
+            <w:r>
+              <w:t xml:space="preserve"> </w:t>
+            </w:r>
+            <w:r>
+              <w:t xml:space="preserve">and limits it to that path and the paths below it</w:t>
+            </w:r>
+            <w:r>
+              <w:t xml:space="preserve"> </w:t>
+            </w:r>
+            <w:r>
+              <w:t xml:space="preserve">(GitHub 2026a)</w:t>
+            </w:r>
+            <w:r>
+              <w:t xml:space="preserve">,</w:t>
+            </w:r>
+            <w:r>
+              <w:t xml:space="preserve"> </w:t>
+            </w:r>
+            <w:r>
+              <w:t xml:space="preserve">so an entry for one GitHub organization</w:t>
+            </w:r>
+            <w:r>
+              <w:t xml:space="preserve"> </w:t>
+            </w:r>
+            <w:r>
+              <w:t xml:space="preserve">still covers that organization’s issues and pull requests,</w:t>
+            </w:r>
+            <w:r>
+              <w:t xml:space="preserve"> </w:t>
+            </w:r>
+            <w:r>
+              <w:t xml:space="preserve">including comments from other users.</w:t>
+            </w:r>
+            <w:r>
+              <w:t xml:space="preserve"> </w:t>
+            </w:r>
+            <w:r>
+              <w:t xml:space="preserve">Any GitHub user or organization can publish a site at</w:t>
+            </w:r>
+            <w:r>
+              <w:t xml:space="preserve"> </w:t>
+            </w:r>
+            <w:r>
+              <w:rPr>
+                <w:rStyle w:val="VerbatimChar"/>
+              </w:rPr>
+              <w:t xml:space="preserve">&lt;owner&gt;.github.io</w:t>
+            </w:r>
+            <w:r>
+              <w:t xml:space="preserve"> </w:t>
+            </w:r>
+            <w:r>
+              <w:t xml:space="preserve">(GitHub 2026b)</w:t>
+            </w:r>
+            <w:r>
+              <w:t xml:space="preserve">,</w:t>
+            </w:r>
+            <w:r>
+              <w:t xml:space="preserve"> </w:t>
+            </w:r>
+            <w:r>
+              <w:t xml:space="preserve">so a</w:t>
+            </w:r>
+            <w:r>
+              <w:t xml:space="preserve"> </w:t>
+            </w:r>
+            <w:r>
+              <w:rPr>
+                <w:rStyle w:val="VerbatimChar"/>
+              </w:rPr>
+              <w:t xml:space="preserve">*.github.io</w:t>
+            </w:r>
+            <w:r>
+              <w:t xml:space="preserve"> </w:t>
+            </w:r>
+            <w:r>
+              <w:t xml:space="preserve">entry opens sites that anyone can publish,</w:t>
+            </w:r>
+            <w:r>
+              <w:t xml:space="preserve"> </w:t>
+            </w:r>
+            <w:r>
+              <w:t xml:space="preserve">while</w:t>
+            </w:r>
+            <w:r>
+              <w:t xml:space="preserve"> </w:t>
+            </w:r>
+            <w:r>
+              <w:rPr>
+                <w:rStyle w:val="VerbatimChar"/>
+              </w:rPr>
+              <w:t xml:space="preserve">rstudio.github.io</w:t>
+            </w:r>
+            <w:r>
+              <w:t xml:space="preserve"> </w:t>
+            </w:r>
+            <w:r>
+              <w:t xml:space="preserve">serves only the</w:t>
+            </w:r>
+            <w:r>
+              <w:t xml:space="preserve"> </w:t>
+            </w:r>
+            <w:r>
+              <w:rPr>
+                <w:rStyle w:val="VerbatimChar"/>
+              </w:rPr>
+              <w:t xml:space="preserve">rstudio</w:t>
+            </w:r>
+            <w:r>
+              <w:t xml:space="preserve"> </w:t>
+            </w:r>
+            <w:r>
+              <w:t xml:space="preserve">organization’s sites.</w:t>
+            </w:r>
+            <w:r>
+              <w:t xml:space="preserve"> </w:t>
+            </w:r>
+            <w:r>
+              <w:t xml:space="preserve">Anyone can edit Wikipedia</w:t>
+            </w:r>
+            <w:r>
+              <w:t xml:space="preserve"> </w:t>
+            </w:r>
+            <w:r>
+              <w:t xml:space="preserve">(Wikipedia contributors 2026)</w:t>
+            </w:r>
+            <w:r>
+              <w:t xml:space="preserve">.</w:t>
+            </w:r>
+            <w:r>
+              <w:t xml:space="preserve"> </w:t>
+            </w:r>
+            <w:r>
+              <w:t xml:space="preserve">These hosts are often needed for package installs and documentation;</w:t>
+            </w:r>
+            <w:r>
+              <w:t xml:space="preserve"> </w:t>
+            </w:r>
+            <w:r>
+              <w:t xml:space="preserve">allow them knowingly</w:t>
+            </w:r>
+            <w:r>
+              <w:t xml:space="preserve"> </w:t>
+            </w:r>
+            <w:r>
+              <w:t xml:space="preserve">(see</w:t>
+            </w:r>
+            <w:r>
+              <w:t xml:space="preserve"> </w:t>
+            </w:r>
+            <w:hyperlink r:id="rId226">
+              <w:r>
+                <w:rPr>
+                  <w:rStyle w:val="Hyperlink"/>
+                </w:rPr>
+                <w:t xml:space="preserve">Configuring network access for Claude cloud sessions</w:t>
+              </w:r>
+            </w:hyperlink>
+            <w:r>
+              <w:t xml:space="preserve">).</w:t>
             </w:r>
           </w:p>
           <w:p/>
@@ -20276,7 +20494,7 @@
     </w:tbl>
     <w:bookmarkEnd w:id="232"/>
     <w:bookmarkEnd w:id="233"/>
-    <w:bookmarkStart w:id="307" w:name="references"/>
+    <w:bookmarkStart w:id="316" w:name="references"/>
     <w:p>
       <w:pPr>
         <w:pStyle w:val="Heading1"/>
@@ -20285,7 +20503,7 @@
         <w:t xml:space="preserve">References</w:t>
       </w:r>
     </w:p>
-    <w:bookmarkStart w:id="306" w:name="refs"/>
+    <w:bookmarkStart w:id="315" w:name="refs"/>
     <w:bookmarkStart w:id="235" w:name="ref-space_odyssey"/>
     <w:p>
       <w:pPr>
@@ -20391,13 +20609,50 @@
       </w:r>
     </w:p>
     <w:bookmarkEnd w:id="238"/>
-    <w:bookmarkStart w:id="239" w:name="ref-claude_research_help"/>
+    <w:bookmarkStart w:id="240" w:name="ref-claude_code_cloud_environments"/>
     <w:p>
       <w:pPr>
         <w:pStyle w:val="Bibliography"/>
       </w:pPr>
       <w:r>
         <w:t xml:space="preserve">Anthropic. 2026a.</w:t>
+      </w:r>
+      <w:r>
+        <w:t xml:space="preserve"> </w:t>
+      </w:r>
+      <w:r>
+        <w:rPr>
+          <w:i/>
+          <w:iCs/>
+        </w:rPr>
+        <w:t xml:space="preserve">Configure Cloud Environments</w:t>
+      </w:r>
+      <w:r>
+        <w:t xml:space="preserve">. Documentation.</w:t>
+      </w:r>
+      <w:r>
+        <w:t xml:space="preserve"> </w:t>
+      </w:r>
+      <w:hyperlink r:id="rId239">
+        <w:r>
+          <w:rPr>
+            <w:rStyle w:val="Hyperlink"/>
+          </w:rPr>
+          <w:t xml:space="preserve">https://code.claude.com/docs/en/cloud-environments</w:t>
+        </w:r>
+      </w:hyperlink>
+      <w:r>
+        <w:t xml:space="preserve">.</w:t>
+      </w:r>
+    </w:p>
+    <w:bookmarkEnd w:id="240"/>
+    <w:bookmarkStart w:id="241" w:name="ref-claude_research_help"/>
+    <w:p>
+      <w:pPr>
+        <w:pStyle w:val="Bibliography"/>
+      </w:pPr>
+      <w:r>
+        <w:t xml:space="preserve">Anthropic. 2026b.</w:t>
       </w:r>
       <w:r>
         <w:t xml:space="preserve"> </w:t>
@@ -20427,14 +20682,14 @@
         <w:t xml:space="preserve">.</w:t>
       </w:r>
     </w:p>
-    <w:bookmarkEnd w:id="239"/>
-    <w:bookmarkStart w:id="240" w:name="ref-claude_web_search_tool"/>
+    <w:bookmarkEnd w:id="241"/>
+    <w:bookmarkStart w:id="242" w:name="ref-claude_web_search_tool"/>
     <w:p>
       <w:pPr>
         <w:pStyle w:val="Bibliography"/>
       </w:pPr>
       <w:r>
-        <w:t xml:space="preserve">Anthropic. 2026b.</w:t>
+        <w:t xml:space="preserve">Anthropic. 2026c.</w:t>
       </w:r>
       <w:r>
         <w:t xml:space="preserve"> </w:t>
@@ -20464,14 +20719,14 @@
         <w:t xml:space="preserve">.</w:t>
       </w:r>
     </w:p>
-    <w:bookmarkEnd w:id="240"/>
-    <w:bookmarkStart w:id="242" w:name="ref-claude_research_when"/>
+    <w:bookmarkEnd w:id="242"/>
+    <w:bookmarkStart w:id="244" w:name="ref-claude_research_when"/>
     <w:p>
       <w:pPr>
         <w:pStyle w:val="Bibliography"/>
       </w:pPr>
       <w:r>
-        <w:t xml:space="preserve">Anthropic. 2026c.</w:t>
+        <w:t xml:space="preserve">Anthropic. 2026d.</w:t>
       </w:r>
       <w:r>
         <w:t xml:space="preserve"> </w:t>
@@ -20489,7 +20744,7 @@
       <w:r>
         <w:t xml:space="preserve"> </w:t>
       </w:r>
-      <w:hyperlink r:id="rId241">
+      <w:hyperlink r:id="rId243">
         <w:r>
           <w:rPr>
             <w:rStyle w:val="Hyperlink"/>
@@ -20501,8 +20756,8 @@
         <w:t xml:space="preserve">.</w:t>
       </w:r>
     </w:p>
-    <w:bookmarkEnd w:id="242"/>
-    <w:bookmarkStart w:id="244" w:name="ref-i_robot"/>
+    <w:bookmarkEnd w:id="244"/>
+    <w:bookmarkStart w:id="246" w:name="ref-i_robot"/>
     <w:p>
       <w:pPr>
         <w:pStyle w:val="Bibliography"/>
@@ -20526,7 +20781,7 @@
       <w:r>
         <w:t xml:space="preserve"> </w:t>
       </w:r>
-      <w:hyperlink r:id="rId243">
+      <w:hyperlink r:id="rId245">
         <w:r>
           <w:rPr>
             <w:rStyle w:val="Hyperlink"/>
@@ -20538,8 +20793,8 @@
         <w:t xml:space="preserve">.</w:t>
       </w:r>
     </w:p>
-    <w:bookmarkEnd w:id="244"/>
-    <w:bookmarkStart w:id="246" w:name="ref-battlestar_galactica_2004"/>
+    <w:bookmarkEnd w:id="246"/>
+    <w:bookmarkStart w:id="248" w:name="ref-battlestar_galactica_2004"/>
     <w:p>
       <w:pPr>
         <w:pStyle w:val="Bibliography"/>
@@ -20557,7 +20812,7 @@
       <w:r>
         <w:t xml:space="preserve"> </w:t>
       </w:r>
-      <w:hyperlink r:id="rId245">
+      <w:hyperlink r:id="rId247">
         <w:r>
           <w:rPr>
             <w:rStyle w:val="Hyperlink"/>
@@ -20569,8 +20824,8 @@
         <w:t xml:space="preserve">.</w:t>
       </w:r>
     </w:p>
-    <w:bookmarkEnd w:id="246"/>
-    <w:bookmarkStart w:id="248" w:name="ref-blade_runner"/>
+    <w:bookmarkEnd w:id="248"/>
+    <w:bookmarkStart w:id="250" w:name="ref-blade_runner"/>
     <w:p>
       <w:pPr>
         <w:pStyle w:val="Bibliography"/>
@@ -20588,7 +20843,7 @@
       <w:r>
         <w:t xml:space="preserve"> </w:t>
       </w:r>
-      <w:hyperlink r:id="rId247">
+      <w:hyperlink r:id="rId249">
         <w:r>
           <w:rPr>
             <w:rStyle w:val="Hyperlink"/>
@@ -20600,8 +20855,8 @@
         <w:t xml:space="preserve">.</w:t>
       </w:r>
     </w:p>
-    <w:bookmarkEnd w:id="248"/>
-    <w:bookmarkStart w:id="250" w:name="ref-enders_game"/>
+    <w:bookmarkEnd w:id="250"/>
+    <w:bookmarkStart w:id="252" w:name="ref-enders_game"/>
     <w:p>
       <w:pPr>
         <w:pStyle w:val="Bibliography"/>
@@ -20625,7 +20880,7 @@
       <w:r>
         <w:t xml:space="preserve"> </w:t>
       </w:r>
-      <w:hyperlink r:id="rId249">
+      <w:hyperlink r:id="rId251">
         <w:r>
           <w:rPr>
             <w:rStyle w:val="Hyperlink"/>
@@ -20637,8 +20892,8 @@
         <w:t xml:space="preserve">.</w:t>
       </w:r>
     </w:p>
-    <w:bookmarkEnd w:id="250"/>
-    <w:bookmarkStart w:id="251" w:name="ref-cline_site"/>
+    <w:bookmarkEnd w:id="252"/>
+    <w:bookmarkStart w:id="253" w:name="ref-cline_site"/>
     <w:p>
       <w:pPr>
         <w:pStyle w:val="Bibliography"/>
@@ -20674,8 +20929,8 @@
         <w:t xml:space="preserve">.</w:t>
       </w:r>
     </w:p>
-    <w:bookmarkEnd w:id="251"/>
-    <w:bookmarkStart w:id="253" w:name="ref-devin_docs"/>
+    <w:bookmarkEnd w:id="253"/>
+    <w:bookmarkStart w:id="255" w:name="ref-devin_docs"/>
     <w:p>
       <w:pPr>
         <w:pStyle w:val="Bibliography"/>
@@ -20699,7 +20954,7 @@
       <w:r>
         <w:t xml:space="preserve"> </w:t>
       </w:r>
-      <w:hyperlink r:id="rId252">
+      <w:hyperlink r:id="rId254">
         <w:r>
           <w:rPr>
             <w:rStyle w:val="Hyperlink"/>
@@ -20711,8 +20966,8 @@
         <w:t xml:space="preserve">.</w:t>
       </w:r>
     </w:p>
-    <w:bookmarkEnd w:id="253"/>
-    <w:bookmarkStart w:id="255" w:name="ref-cursor_cloud_agents"/>
+    <w:bookmarkEnd w:id="255"/>
+    <w:bookmarkStart w:id="257" w:name="ref-cursor_cloud_agents"/>
     <w:p>
       <w:pPr>
         <w:pStyle w:val="Bibliography"/>
@@ -20736,7 +20991,7 @@
       <w:r>
         <w:t xml:space="preserve"> </w:t>
       </w:r>
-      <w:hyperlink r:id="rId254">
+      <w:hyperlink r:id="rId256">
         <w:r>
           <w:rPr>
             <w:rStyle w:val="Hyperlink"/>
@@ -20748,8 +21003,8 @@
         <w:t xml:space="preserve">.</w:t>
       </w:r>
     </w:p>
-    <w:bookmarkEnd w:id="255"/>
-    <w:bookmarkStart w:id="257" w:name="ref-humans_are_dead"/>
+    <w:bookmarkEnd w:id="257"/>
+    <w:bookmarkStart w:id="259" w:name="ref-humans_are_dead"/>
     <w:p>
       <w:pPr>
         <w:pStyle w:val="Bibliography"/>
@@ -20773,7 +21028,7 @@
       <w:r>
         <w:t xml:space="preserve"> </w:t>
       </w:r>
-      <w:hyperlink r:id="rId256">
+      <w:hyperlink r:id="rId258">
         <w:r>
           <w:rPr>
             <w:rStyle w:val="Hyperlink"/>
@@ -20785,8 +21040,8 @@
         <w:t xml:space="preserve">.</w:t>
       </w:r>
     </w:p>
-    <w:bookmarkEnd w:id="257"/>
-    <w:bookmarkStart w:id="259" w:name="ref-citadel_architecture"/>
+    <w:bookmarkEnd w:id="259"/>
+    <w:bookmarkStart w:id="261" w:name="ref-citadel_architecture"/>
     <w:p>
       <w:pPr>
         <w:pStyle w:val="Bibliography"/>
@@ -20810,7 +21065,7 @@
       <w:r>
         <w:t xml:space="preserve"> </w:t>
       </w:r>
-      <w:hyperlink r:id="rId258">
+      <w:hyperlink r:id="rId260">
         <w:r>
           <w:rPr>
             <w:rStyle w:val="Hyperlink"/>
@@ -20822,8 +21077,8 @@
         <w:t xml:space="preserve">.</w:t>
       </w:r>
     </w:p>
-    <w:bookmarkEnd w:id="259"/>
-    <w:bookmarkStart w:id="261" w:name="ref-citadel_experiments"/>
+    <w:bookmarkEnd w:id="261"/>
+    <w:bookmarkStart w:id="263" w:name="ref-citadel_experiments"/>
     <w:p>
       <w:pPr>
         <w:pStyle w:val="Bibliography"/>
@@ -20847,7 +21102,7 @@
       <w:r>
         <w:t xml:space="preserve"> </w:t>
       </w:r>
-      <w:hyperlink r:id="rId260">
+      <w:hyperlink r:id="rId262">
         <w:r>
           <w:rPr>
             <w:rStyle w:val="Hyperlink"/>
@@ -20859,8 +21114,8 @@
         <w:t xml:space="preserve">.</w:t>
       </w:r>
     </w:p>
-    <w:bookmarkEnd w:id="261"/>
-    <w:bookmarkStart w:id="263" w:name="ref-citadel_threat_model"/>
+    <w:bookmarkEnd w:id="263"/>
+    <w:bookmarkStart w:id="265" w:name="ref-citadel_threat_model"/>
     <w:p>
       <w:pPr>
         <w:pStyle w:val="Bibliography"/>
@@ -20884,7 +21139,7 @@
       <w:r>
         <w:t xml:space="preserve"> </w:t>
       </w:r>
-      <w:hyperlink r:id="rId262">
+      <w:hyperlink r:id="rId264">
         <w:r>
           <w:rPr>
             <w:rStyle w:val="Hyperlink"/>
@@ -20896,8 +21151,8 @@
         <w:t xml:space="preserve">.</w:t>
       </w:r>
     </w:p>
-    <w:bookmarkEnd w:id="263"/>
-    <w:bookmarkStart w:id="264" w:name="ref-citadel_repo"/>
+    <w:bookmarkEnd w:id="265"/>
+    <w:bookmarkStart w:id="266" w:name="ref-citadel_repo"/>
     <w:p>
       <w:pPr>
         <w:pStyle w:val="Bibliography"/>
@@ -20933,14 +21188,14 @@
         <w:t xml:space="preserve">.</w:t>
       </w:r>
     </w:p>
-    <w:bookmarkEnd w:id="264"/>
-    <w:bookmarkStart w:id="266" w:name="ref-gemini_deep_research_max"/>
+    <w:bookmarkEnd w:id="266"/>
+    <w:bookmarkStart w:id="267" w:name="ref-copilot_agent_firewall"/>
     <w:p>
       <w:pPr>
         <w:pStyle w:val="Bibliography"/>
       </w:pPr>
       <w:r>
-        <w:t xml:space="preserve">Google. 2026a.</w:t>
+        <w:t xml:space="preserve">GitHub. 2026a.</w:t>
       </w:r>
       <w:r>
         <w:t xml:space="preserve"> </w:t>
@@ -20950,6 +21205,136 @@
           <w:i/>
           <w:iCs/>
         </w:rPr>
+        <w:t xml:space="preserve">Customizing or Disabling the Firewall for</w:t>
+      </w:r>
+      <w:r>
+        <w:rPr>
+          <w:i/>
+          <w:iCs/>
+        </w:rPr>
+        <w:t xml:space="preserve"> </w:t>
+      </w:r>
+      <w:r>
+        <w:rPr>
+          <w:i/>
+          <w:iCs/>
+        </w:rPr>
+        <w:t xml:space="preserve">GitHub Copilot</w:t>
+      </w:r>
+      <w:r>
+        <w:rPr>
+          <w:i/>
+          <w:iCs/>
+        </w:rPr>
+        <w:t xml:space="preserve"> </w:t>
+      </w:r>
+      <w:r>
+        <w:rPr>
+          <w:i/>
+          <w:iCs/>
+        </w:rPr>
+        <w:t xml:space="preserve">Coding Agent</w:t>
+      </w:r>
+      <w:r>
+        <w:t xml:space="preserve">. Documentation.</w:t>
+      </w:r>
+      <w:r>
+        <w:t xml:space="preserve"> </w:t>
+      </w:r>
+      <w:hyperlink r:id="rId221">
+        <w:r>
+          <w:rPr>
+            <w:rStyle w:val="Hyperlink"/>
+          </w:rPr>
+          <w:t xml:space="preserve">https://docs.github.com/en/copilot/how-tos/use-copilot-agents/coding-agent/customize-the-agent-firewall</w:t>
+        </w:r>
+      </w:hyperlink>
+      <w:r>
+        <w:t xml:space="preserve">.</w:t>
+      </w:r>
+    </w:p>
+    <w:bookmarkEnd w:id="267"/>
+    <w:bookmarkStart w:id="269" w:name="ref-github_pages_about"/>
+    <w:p>
+      <w:pPr>
+        <w:pStyle w:val="Bibliography"/>
+      </w:pPr>
+      <w:r>
+        <w:t xml:space="preserve">GitHub. 2026b.</w:t>
+      </w:r>
+      <w:r>
+        <w:t xml:space="preserve"> </w:t>
+      </w:r>
+      <w:r>
+        <w:rPr>
+          <w:i/>
+          <w:iCs/>
+        </w:rPr>
+        <w:t xml:space="preserve">What Is</w:t>
+      </w:r>
+      <w:r>
+        <w:rPr>
+          <w:i/>
+          <w:iCs/>
+        </w:rPr>
+        <w:t xml:space="preserve"> </w:t>
+      </w:r>
+      <w:r>
+        <w:rPr>
+          <w:i/>
+          <w:iCs/>
+        </w:rPr>
+        <w:t xml:space="preserve">GitHub</w:t>
+      </w:r>
+      <w:r>
+        <w:rPr>
+          <w:i/>
+          <w:iCs/>
+        </w:rPr>
+        <w:t xml:space="preserve"> </w:t>
+      </w:r>
+      <w:r>
+        <w:rPr>
+          <w:i/>
+          <w:iCs/>
+        </w:rPr>
+        <w:t xml:space="preserve">Pages?</w:t>
+      </w:r>
+      <w:r>
+        <w:t xml:space="preserve"> Documentation.</w:t>
+      </w:r>
+      <w:r>
+        <w:t xml:space="preserve"> </w:t>
+      </w:r>
+      <w:hyperlink r:id="rId268">
+        <w:r>
+          <w:rPr>
+            <w:rStyle w:val="Hyperlink"/>
+          </w:rPr>
+          <w:t xml:space="preserve">https://docs.github.com/en/pages/getting-started-with-github-pages/what-is-github-pages</w:t>
+        </w:r>
+      </w:hyperlink>
+      <w:r>
+        <w:t xml:space="preserve">.</w:t>
+      </w:r>
+    </w:p>
+    <w:bookmarkEnd w:id="269"/>
+    <w:bookmarkStart w:id="271" w:name="ref-gemini_deep_research_max"/>
+    <w:p>
+      <w:pPr>
+        <w:pStyle w:val="Bibliography"/>
+      </w:pPr>
+      <w:r>
+        <w:t xml:space="preserve">Google. 2026a.</w:t>
+      </w:r>
+      <w:r>
+        <w:t xml:space="preserve"> </w:t>
+      </w:r>
+      <w:r>
+        <w:rPr>
+          <w:i/>
+          <w:iCs/>
+        </w:rPr>
         <w:t xml:space="preserve">Deep Research Max: A Step Change for Autonomous Research Agents</w:t>
       </w:r>
       <w:r>
@@ -20958,7 +21343,7 @@
       <w:r>
         <w:t xml:space="preserve"> </w:t>
       </w:r>
-      <w:hyperlink r:id="rId265">
+      <w:hyperlink r:id="rId270">
         <w:r>
           <w:rPr>
             <w:rStyle w:val="Hyperlink"/>
@@ -20970,8 +21355,8 @@
         <w:t xml:space="preserve">.</w:t>
       </w:r>
     </w:p>
-    <w:bookmarkEnd w:id="266"/>
-    <w:bookmarkStart w:id="268" w:name="ref-gemini_apps_limits"/>
+    <w:bookmarkEnd w:id="271"/>
+    <w:bookmarkStart w:id="273" w:name="ref-gemini_apps_limits"/>
     <w:p>
       <w:pPr>
         <w:pStyle w:val="Bibliography"/>
@@ -20995,7 +21380,7 @@
       <w:r>
         <w:t xml:space="preserve"> </w:t>
       </w:r>
-      <w:hyperlink r:id="rId267">
+      <w:hyperlink r:id="rId272">
         <w:r>
           <w:rPr>
             <w:rStyle w:val="Hyperlink"/>
@@ -21007,8 +21392,8 @@
         <w:t xml:space="preserve">.</w:t>
       </w:r>
     </w:p>
-    <w:bookmarkEnd w:id="268"/>
-    <w:bookmarkStart w:id="269" w:name="ref-gemini_deep_research_api"/>
+    <w:bookmarkEnd w:id="273"/>
+    <w:bookmarkStart w:id="274" w:name="ref-gemini_deep_research_api"/>
     <w:p>
       <w:pPr>
         <w:pStyle w:val="Bibliography"/>
@@ -21044,8 +21429,8 @@
         <w:t xml:space="preserve">.</w:t>
       </w:r>
     </w:p>
-    <w:bookmarkEnd w:id="269"/>
-    <w:bookmarkStart w:id="271" w:name="ref-jules_docs"/>
+    <w:bookmarkEnd w:id="274"/>
+    <w:bookmarkStart w:id="276" w:name="ref-jules_docs"/>
     <w:p>
       <w:pPr>
         <w:pStyle w:val="Bibliography"/>
@@ -21069,7 +21454,7 @@
       <w:r>
         <w:t xml:space="preserve"> </w:t>
       </w:r>
-      <w:hyperlink r:id="rId270">
+      <w:hyperlink r:id="rId275">
         <w:r>
           <w:rPr>
             <w:rStyle w:val="Hyperlink"/>
@@ -21081,8 +21466,8 @@
         <w:t xml:space="preserve">.</w:t>
       </w:r>
     </w:p>
-    <w:bookmarkEnd w:id="271"/>
-    <w:bookmarkStart w:id="272" w:name="ref-gemini_deep_research_help"/>
+    <w:bookmarkEnd w:id="276"/>
+    <w:bookmarkStart w:id="277" w:name="ref-gemini_deep_research_help"/>
     <w:p>
       <w:pPr>
         <w:pStyle w:val="Bibliography"/>
@@ -21118,8 +21503,8 @@
         <w:t xml:space="preserve">.</w:t>
       </w:r>
     </w:p>
-    <w:bookmarkEnd w:id="272"/>
-    <w:bookmarkStart w:id="274" w:name="ref-dune"/>
+    <w:bookmarkEnd w:id="277"/>
+    <w:bookmarkStart w:id="279" w:name="ref-dune"/>
     <w:p>
       <w:pPr>
         <w:pStyle w:val="Bibliography"/>
@@ -21143,7 +21528,7 @@
       <w:r>
         <w:t xml:space="preserve"> </w:t>
       </w:r>
-      <w:hyperlink r:id="rId273">
+      <w:hyperlink r:id="rId278">
         <w:r>
           <w:rPr>
             <w:rStyle w:val="Hyperlink"/>
@@ -21155,8 +21540,8 @@
         <w:t xml:space="preserve">.</w:t>
       </w:r>
     </w:p>
-    <w:bookmarkEnd w:id="274"/>
-    <w:bookmarkStart w:id="276" w:name="ref-hyperautomation_claude_limits"/>
+    <w:bookmarkEnd w:id="279"/>
+    <w:bookmarkStart w:id="281" w:name="ref-hyperautomation_claude_limits"/>
     <w:p>
       <w:pPr>
         <w:pStyle w:val="Bibliography"/>
@@ -21180,7 +21565,7 @@
       <w:r>
         <w:t xml:space="preserve"> </w:t>
       </w:r>
-      <w:hyperlink r:id="rId275">
+      <w:hyperlink r:id="rId280">
         <w:r>
           <w:rPr>
             <w:rStyle w:val="Hyperlink"/>
@@ -21192,8 +21577,8 @@
         <w:t xml:space="preserve">.</w:t>
       </w:r>
     </w:p>
-    <w:bookmarkEnd w:id="276"/>
-    <w:bookmarkStart w:id="278" w:name="ref-lecun_world_models"/>
+    <w:bookmarkEnd w:id="281"/>
+    <w:bookmarkStart w:id="283" w:name="ref-lecun_world_models"/>
     <w:p>
       <w:pPr>
         <w:pStyle w:val="Bibliography"/>
@@ -21217,7 +21602,7 @@
       <w:r>
         <w:t xml:space="preserve"> </w:t>
       </w:r>
-      <w:hyperlink r:id="rId277">
+      <w:hyperlink r:id="rId282">
         <w:r>
           <w:rPr>
             <w:rStyle w:val="Hyperlink"/>
@@ -21229,8 +21614,8 @@
         <w:t xml:space="preserve">.</w:t>
       </w:r>
     </w:p>
-    <w:bookmarkEnd w:id="278"/>
-    <w:bookmarkStart w:id="279" w:name="ref-ms_copilot_conversation_modes"/>
+    <w:bookmarkEnd w:id="283"/>
+    <w:bookmarkStart w:id="284" w:name="ref-ms_copilot_conversation_modes"/>
     <w:p>
       <w:pPr>
         <w:pStyle w:val="Bibliography"/>
@@ -21266,8 +21651,8 @@
         <w:t xml:space="preserve">.</w:t>
       </w:r>
     </w:p>
-    <w:bookmarkEnd w:id="279"/>
-    <w:bookmarkStart w:id="281" w:name="ref-ms_copilot_deep_research_retired"/>
+    <w:bookmarkEnd w:id="284"/>
+    <w:bookmarkStart w:id="286" w:name="ref-ms_copilot_deep_research_retired"/>
     <w:p>
       <w:pPr>
         <w:pStyle w:val="Bibliography"/>
@@ -21291,7 +21676,7 @@
       <w:r>
         <w:t xml:space="preserve"> </w:t>
       </w:r>
-      <w:hyperlink r:id="rId280">
+      <w:hyperlink r:id="rId285">
         <w:r>
           <w:rPr>
             <w:rStyle w:val="Hyperlink"/>
@@ -21303,8 +21688,8 @@
         <w:t xml:space="preserve">.</w:t>
       </w:r>
     </w:p>
-    <w:bookmarkEnd w:id="281"/>
-    <w:bookmarkStart w:id="282" w:name="ref-ms_researcher_help"/>
+    <w:bookmarkEnd w:id="286"/>
+    <w:bookmarkStart w:id="287" w:name="ref-ms_researcher_help"/>
     <w:p>
       <w:pPr>
         <w:pStyle w:val="Bibliography"/>
@@ -21340,8 +21725,8 @@
         <w:t xml:space="preserve">.</w:t>
       </w:r>
     </w:p>
-    <w:bookmarkEnd w:id="282"/>
-    <w:bookmarkStart w:id="284" w:name="ref-ms_researcher_faq"/>
+    <w:bookmarkEnd w:id="287"/>
+    <w:bookmarkStart w:id="289" w:name="ref-ms_researcher_faq"/>
     <w:p>
       <w:pPr>
         <w:pStyle w:val="Bibliography"/>
@@ -21365,7 +21750,7 @@
       <w:r>
         <w:t xml:space="preserve"> </w:t>
       </w:r>
-      <w:hyperlink r:id="rId283">
+      <w:hyperlink r:id="rId288">
         <w:r>
           <w:rPr>
             <w:rStyle w:val="Hyperlink"/>
@@ -21377,8 +21762,8 @@
         <w:t xml:space="preserve">.</w:t>
       </w:r>
     </w:p>
-    <w:bookmarkEnd w:id="284"/>
-    <w:bookmarkStart w:id="286" w:name="ref-ms_researcher_overview"/>
+    <w:bookmarkEnd w:id="289"/>
+    <w:bookmarkStart w:id="291" w:name="ref-ms_researcher_overview"/>
     <w:p>
       <w:pPr>
         <w:pStyle w:val="Bibliography"/>
@@ -21402,7 +21787,7 @@
       <w:r>
         <w:t xml:space="preserve"> </w:t>
       </w:r>
-      <w:hyperlink r:id="rId285">
+      <w:hyperlink r:id="rId290">
         <w:r>
           <w:rPr>
             <w:rStyle w:val="Hyperlink"/>
@@ -21414,14 +21799,51 @@
         <w:t xml:space="preserve">.</w:t>
       </w:r>
     </w:p>
-    <w:bookmarkEnd w:id="286"/>
-    <w:bookmarkStart w:id="287" w:name="ref-stats_allowlist"/>
+    <w:bookmarkEnd w:id="291"/>
+    <w:bookmarkStart w:id="293" w:name="ref-stats_allowlist_pr6"/>
     <w:p>
       <w:pPr>
         <w:pStyle w:val="Bibliography"/>
       </w:pPr>
       <w:r>
-        <w:t xml:space="preserve">Morrison Lab. 2026.</w:t>
+        <w:t xml:space="preserve">Morrison Lab. 2026a.</w:t>
+      </w:r>
+      <w:r>
+        <w:t xml:space="preserve"> </w:t>
+      </w:r>
+      <w:r>
+        <w:rPr>
+          <w:i/>
+          <w:iCs/>
+        </w:rPr>
+        <w:t xml:space="preserve">Merge Additional Hosts into Claude Allowlist; Prune Redundant and Risky Entries</w:t>
+      </w:r>
+      <w:r>
+        <w:t xml:space="preserve">. GitHub pull request.</w:t>
+      </w:r>
+      <w:r>
+        <w:t xml:space="preserve"> </w:t>
+      </w:r>
+      <w:hyperlink r:id="rId292">
+        <w:r>
+          <w:rPr>
+            <w:rStyle w:val="Hyperlink"/>
+          </w:rPr>
+          <w:t xml:space="preserve">https://github.com/Morrison-Lab/stats-allowlist/pull/6</w:t>
+        </w:r>
+      </w:hyperlink>
+      <w:r>
+        <w:t xml:space="preserve">.</w:t>
+      </w:r>
+    </w:p>
+    <w:bookmarkEnd w:id="293"/>
+    <w:bookmarkStart w:id="294" w:name="ref-stats_allowlist"/>
+    <w:p>
+      <w:pPr>
+        <w:pStyle w:val="Bibliography"/>
+      </w:pPr>
+      <w:r>
+        <w:t xml:space="preserve">Morrison Lab. 2026b.</w:t>
       </w:r>
       <w:r>
         <w:t xml:space="preserve"> </w:t>
@@ -21451,8 +21873,8 @@
         <w:t xml:space="preserve">.</w:t>
       </w:r>
     </w:p>
-    <w:bookmarkEnd w:id="287"/>
-    <w:bookmarkStart w:id="288" w:name="ref-ollama_site"/>
+    <w:bookmarkEnd w:id="294"/>
+    <w:bookmarkStart w:id="295" w:name="ref-ollama_site"/>
     <w:p>
       <w:pPr>
         <w:pStyle w:val="Bibliography"/>
@@ -21488,8 +21910,8 @@
         <w:t xml:space="preserve">.</w:t>
       </w:r>
     </w:p>
-    <w:bookmarkEnd w:id="288"/>
-    <w:bookmarkStart w:id="289" w:name="ref-openai_deep_research_api"/>
+    <w:bookmarkEnd w:id="295"/>
+    <w:bookmarkStart w:id="296" w:name="ref-openai_deep_research_api"/>
     <w:p>
       <w:pPr>
         <w:pStyle w:val="Bibliography"/>
@@ -21525,8 +21947,8 @@
         <w:t xml:space="preserve">.</w:t>
       </w:r>
     </w:p>
-    <w:bookmarkEnd w:id="289"/>
-    <w:bookmarkStart w:id="290" w:name="ref-openai_deep_research_help"/>
+    <w:bookmarkEnd w:id="296"/>
+    <w:bookmarkStart w:id="297" w:name="ref-openai_deep_research_help"/>
     <w:p>
       <w:pPr>
         <w:pStyle w:val="Bibliography"/>
@@ -21562,8 +21984,8 @@
         <w:t xml:space="preserve">.</w:t>
       </w:r>
     </w:p>
-    <w:bookmarkEnd w:id="290"/>
-    <w:bookmarkStart w:id="292" w:name="ref-opencode_docs"/>
+    <w:bookmarkEnd w:id="297"/>
+    <w:bookmarkStart w:id="299" w:name="ref-opencode_docs"/>
     <w:p>
       <w:pPr>
         <w:pStyle w:val="Bibliography"/>
@@ -21587,7 +22009,7 @@
       <w:r>
         <w:t xml:space="preserve"> </w:t>
       </w:r>
-      <w:hyperlink r:id="rId291">
+      <w:hyperlink r:id="rId298">
         <w:r>
           <w:rPr>
             <w:rStyle w:val="Hyperlink"/>
@@ -21599,8 +22021,8 @@
         <w:t xml:space="preserve">.</w:t>
       </w:r>
     </w:p>
-    <w:bookmarkEnd w:id="292"/>
-    <w:bookmarkStart w:id="293" w:name="ref-openhands_docs"/>
+    <w:bookmarkEnd w:id="299"/>
+    <w:bookmarkStart w:id="300" w:name="ref-openhands_docs"/>
     <w:p>
       <w:pPr>
         <w:pStyle w:val="Bibliography"/>
@@ -21636,8 +22058,8 @@
         <w:t xml:space="preserve">.</w:t>
       </w:r>
     </w:p>
-    <w:bookmarkEnd w:id="293"/>
-    <w:bookmarkStart w:id="294" w:name="ref-perplexity_sonar_deep_research"/>
+    <w:bookmarkEnd w:id="300"/>
+    <w:bookmarkStart w:id="301" w:name="ref-perplexity_sonar_deep_research"/>
     <w:p>
       <w:pPr>
         <w:pStyle w:val="Bibliography"/>
@@ -21673,8 +22095,8 @@
         <w:t xml:space="preserve">.</w:t>
       </w:r>
     </w:p>
-    <w:bookmarkEnd w:id="294"/>
-    <w:bookmarkStart w:id="295" w:name="ref-perplexity_research_mode"/>
+    <w:bookmarkEnd w:id="301"/>
+    <w:bookmarkStart w:id="302" w:name="ref-perplexity_research_mode"/>
     <w:p>
       <w:pPr>
         <w:pStyle w:val="Bibliography"/>
@@ -21710,8 +22132,8 @@
         <w:t xml:space="preserve">.</w:t>
       </w:r>
     </w:p>
-    <w:bookmarkEnd w:id="295"/>
-    <w:bookmarkStart w:id="296" w:name="ref-perplexity_advanced_deep_research"/>
+    <w:bookmarkEnd w:id="302"/>
+    <w:bookmarkStart w:id="303" w:name="ref-perplexity_advanced_deep_research"/>
     <w:p>
       <w:pPr>
         <w:pStyle w:val="Bibliography"/>
@@ -21747,8 +22169,8 @@
         <w:t xml:space="preserve">.</w:t>
       </w:r>
     </w:p>
-    <w:bookmarkEnd w:id="296"/>
-    <w:bookmarkStart w:id="298" w:name="ref-ng_one_skill_stay_relevant"/>
+    <w:bookmarkEnd w:id="303"/>
+    <w:bookmarkStart w:id="305" w:name="ref-ng_one_skill_stay_relevant"/>
     <w:p>
       <w:pPr>
         <w:pStyle w:val="Bibliography"/>
@@ -21772,7 +22194,7 @@
       <w:r>
         <w:t xml:space="preserve"> </w:t>
       </w:r>
-      <w:hyperlink r:id="rId297">
+      <w:hyperlink r:id="rId304">
         <w:r>
           <w:rPr>
             <w:rStyle w:val="Hyperlink"/>
@@ -21784,8 +22206,8 @@
         <w:t xml:space="preserve">.</w:t>
       </w:r>
     </w:p>
-    <w:bookmarkEnd w:id="298"/>
-    <w:bookmarkStart w:id="300" w:name="ref-terminator"/>
+    <w:bookmarkEnd w:id="305"/>
+    <w:bookmarkStart w:id="307" w:name="ref-terminator"/>
     <w:p>
       <w:pPr>
         <w:pStyle w:val="Bibliography"/>
@@ -21803,7 +22225,7 @@
       <w:r>
         <w:t xml:space="preserve"> </w:t>
       </w:r>
-      <w:hyperlink r:id="rId299">
+      <w:hyperlink r:id="rId306">
         <w:r>
           <w:rPr>
             <w:rStyle w:val="Hyperlink"/>
@@ -21815,8 +22237,8 @@
         <w:t xml:space="preserve">.</w:t>
       </w:r>
     </w:p>
-    <w:bookmarkEnd w:id="300"/>
-    <w:bookmarkStart w:id="302" w:name="ref-matrix"/>
+    <w:bookmarkEnd w:id="307"/>
+    <w:bookmarkStart w:id="309" w:name="ref-matrix"/>
     <w:p>
       <w:pPr>
         <w:pStyle w:val="Bibliography"/>
@@ -21834,7 +22256,7 @@
       <w:r>
         <w:t xml:space="preserve"> </w:t>
       </w:r>
-      <w:hyperlink r:id="rId301">
+      <w:hyperlink r:id="rId308">
         <w:r>
           <w:rPr>
             <w:rStyle w:val="Hyperlink"/>
@@ -21846,8 +22268,8 @@
         <w:t xml:space="preserve">.</w:t>
       </w:r>
     </w:p>
-    <w:bookmarkEnd w:id="302"/>
-    <w:bookmarkStart w:id="304" w:name="ref-wargames"/>
+    <w:bookmarkEnd w:id="309"/>
+    <w:bookmarkStart w:id="311" w:name="ref-wargames"/>
     <w:p>
       <w:pPr>
         <w:pStyle w:val="Bibliography"/>
@@ -21865,7 +22287,7 @@
       <w:r>
         <w:t xml:space="preserve"> </w:t>
       </w:r>
-      <w:hyperlink r:id="rId303">
+      <w:hyperlink r:id="rId310">
         <w:r>
           <w:rPr>
             <w:rStyle w:val="Hyperlink"/>
@@ -21877,8 +22299,8 @@
         <w:t xml:space="preserve">.</w:t>
       </w:r>
     </w:p>
-    <w:bookmarkEnd w:id="304"/>
-    <w:bookmarkStart w:id="305" w:name="ref-warp_docs"/>
+    <w:bookmarkEnd w:id="311"/>
+    <w:bookmarkStart w:id="312" w:name="ref-warp_docs"/>
     <w:p>
       <w:pPr>
         <w:pStyle w:val="Bibliography"/>
@@ -21914,9 +22336,46 @@
         <w:t xml:space="preserve">.</w:t>
       </w:r>
     </w:p>
-    <w:bookmarkEnd w:id="305"/>
-    <w:bookmarkEnd w:id="306"/>
-    <w:bookmarkEnd w:id="307"/>
+    <w:bookmarkEnd w:id="312"/>
+    <w:bookmarkStart w:id="314" w:name="ref-wikipedia_about"/>
+    <w:p>
+      <w:pPr>
+        <w:pStyle w:val="Bibliography"/>
+      </w:pPr>
+      <w:r>
+        <w:t xml:space="preserve">Wikipedia contributors. 2026.</w:t>
+      </w:r>
+      <w:r>
+        <w:t xml:space="preserve"> </w:t>
+      </w:r>
+      <w:r>
+        <w:rPr>
+          <w:i/>
+          <w:iCs/>
+        </w:rPr>
+        <w:t xml:space="preserve">Wikipedia:about</w:t>
+      </w:r>
+      <w:r>
+        <w:t xml:space="preserve">. Wikipedia.</w:t>
+      </w:r>
+      <w:r>
+        <w:t xml:space="preserve"> </w:t>
+      </w:r>
+      <w:hyperlink r:id="rId313">
+        <w:r>
+          <w:rPr>
+            <w:rStyle w:val="Hyperlink"/>
+          </w:rPr>
+          <w:t xml:space="preserve">https://en.wikipedia.org/wiki/Wikipedia:About</w:t>
+        </w:r>
+      </w:hyperlink>
+      <w:r>
+        <w:t xml:space="preserve">.</w:t>
+      </w:r>
+    </w:p>
+    <w:bookmarkEnd w:id="314"/>
+    <w:bookmarkEnd w:id="315"/>
+    <w:bookmarkEnd w:id="316"/>
     <w:sectPr>
       <w:footnotePr>
         <w:numRestart w:val="eachSect"/>

</xml_diff>